<commit_message>
Atualiza a composição dos participantes (24 profissionais da escola e 1 técnico da Secretaria) no projeto, na Introdução, na Metodologia e na apresentação
Co-Authored-By: Claude Opus 5.5 <noreply@anthropic.com>
Claude-Session: https://claude.ai/code/session_01HxStpW4pQoDfJdTDYr6zEC
</commit_message>
<xml_diff>
--- a/metodologia_nova/4_METODOLOGIA_alinhada_ao_projeto.docx
+++ b/metodologia_nova/4_METODOLOGIA_alinhada_ao_projeto.docx
@@ -124,7 +124,7 @@
           <w:rFonts w:ascii="Times New Roman" w:hAnsi="Times New Roman"/>
           <w:sz w:val="24"/>
         </w:rPr>
-        <w:t>O campo é a rede municipal de Tibau do Sul, no Rio Grande do Norte, e, dentro dela, a escola de Pipa. Participam os profissionais da educação que atuam nos anos iniciais, do 1º ao 5º ano: docentes, coordenação pedagógica, direção e demais profissionais ligados ao trabalho pedagógico dessas turmas. Um técnico da Secretaria Municipal de Educação participa como fonte complementar sobre o contexto externo. Os dados serão construídos em cinco movimentos, a análise documental, o registro iconográfico, o questionário, as entrevistas semiestruturadas e a análise com devolutiva, e lidos com a Abordagem do Ciclo de Políticas (ACP), formulada por Bowe, Ball e Gold (1992) e sistematizada no Brasil por Mainardes (2006), e com a teoria da atuação de Ball, Maguire e Braun (2016). Dois pontos recebem atenção especial ao longo do capítulo: a posição da pesquisadora, que residiu em Pipa e trabalhou na rede municipal, e os critérios de leitura das formas de atuação. Os resultados ficam para os capítulos de análise.</w:t>
+        <w:t xml:space="preserve">O campo é a rede municipal de Tibau do Sul, no Rio Grande do Norte, e, dentro dela, a escola de Pipa. Participam os profissionais da educação que atuam nos anos iniciais, do 1º ao 5º ano: docentes, coordenação pedagógica, direção e demais profissionais ligados ao trabalho pedagógico dessas turmas. Um técnico da Secretaria Municipal de Educação, o coordenador de políticas públicas e programas educacionais do município, participa como fonte complementar sobre o contexto externo. Os dados serão construídos em cinco movimentos, a análise documental, o registro iconográfico, o questionário, as entrevistas semiestruturadas e a análise com devolutiva, e lidos com a Abordagem do Ciclo de Políticas (ACP), formulada por Bowe, Ball e Gold (1992) e sistematizada no Brasil por Mainardes (2006), e com a teoria da atuação de Ball, Maguire e Braun (2016). Dois pontos recebem atenção especial ao longo do capítulo: a posição da pesquisadora, que residiu em Pipa e trabalhou na rede municipal, e os critérios de leitura das formas de atuação. Os resultados ficam para os capítulos de análise.</w:t>
       </w:r>
     </w:p>
     <w:p>
@@ -2288,7 +2288,7 @@
           <w:rFonts w:ascii="Times New Roman" w:hAnsi="Times New Roman"/>
           <w:sz w:val="24"/>
         </w:rPr>
-        <w:t>Algumas situações pedem cuidado. Se os profissionais afirmarem não haver alternativa, o quadro será nomeado como transferência de custo do Estado para o trabalhador, situação mais próxima da sobrevivência que da resistência. Essa distinção será examinada nas perguntas do Eixo 5 sobre o modo como o profissional entende as próprias decisões. Se as formas de atuação variarem conforme a posição institucional, na regência, na coordenação, na direção ou nas demais funções, essa variação será descrita como achado. A direção tem um participante, e a Secretaria, um técnico, o que permite descrever essas posições, sem generalizar sobre elas.</w:t>
+        <w:t xml:space="preserve">Algumas situações pedem cuidado. Se os profissionais afirmarem não haver alternativa, o quadro será nomeado como transferência de custo do Estado para o trabalhador, situação mais próxima da sobrevivência que da resistência. Essa distinção será examinada nas perguntas do Eixo 5 sobre o modo como o profissional entende as próprias decisões. Se as formas de atuação variarem conforme a posição institucional, na regência, no apoio à recomposição de aula, no apoio pedagógico, na coordenação ou na direção, essa variação será descrita como achado. A direção tem dois participantes, a coordenação, uma, e a Secretaria, um técnico, o que permite descrever essas posições sem generalizar sobre elas.</w:t>
       </w:r>
     </w:p>
     <w:p>
@@ -2840,7 +2840,7 @@
           <w:rFonts w:ascii="Times New Roman" w:hAnsi="Times New Roman"/>
           <w:sz w:val="24"/>
         </w:rPr>
-        <w:t>Um técnico da Secretaria Municipal de Educação ligado às ações de educação digital será ouvido como fonte complementar sobre o contexto externo, isto é, sobre como as orientações nacionais são recebidas e encaminhadas pela gestão municipal antes de chegar à escola; os documentos da Secretaria completam essa leitura, e a unidade do caso continua sendo a escola. A direção</w:t>
+        <w:t xml:space="preserve">Um técnico da Secretaria Municipal de Educação, o coordenador de políticas públicas e programas educacionais do município, será ouvido como fonte complementar sobre o contexto externo, isto é, sobre como as orientações nacionais são recebidas e encaminhadas pela gestão municipal antes de chegar à escola; os documentos da Secretaria completam essa leitura, e a unidade do caso continua sendo a escola. A direção</w:t>
       </w:r>
       <w:r>
         <w:rPr>
@@ -2938,7 +2938,7 @@
           <w:rFonts w:ascii="Times New Roman" w:hAnsi="Times New Roman"/>
           <w:sz w:val="24"/>
         </w:rPr>
-        <w:t xml:space="preserve">Participarão da pesquisa os profissionais da educação da Escola Municipal Domitila Castelo da Silva que atuam nos anos iniciais do Ensino Fundamental, do 1º ao 5º ano, e aceitarem o convite: docentes das turmas, os quatro profissionais da coordenação pedagógica, a direção escolar e os demais profissionais que participam do trabalho pedagógico dessas turmas, como os do apoio pedagógico e do atendimento educacional especializado, quando houver [indicar o número de participantes por função]. Participa também um técnico da Secretaria Municipal de Educação, como fonte complementar, sem constituir um segundo caso. Quando uma função for exercida por uma só pessoa, ela será designada pelo nome da função, sem referência a quem a ocupa, para preservar o anonimato assegurado no Termo de Consentimento Livre e Esclarecido.</w:t>
+        <w:t xml:space="preserve">Participarão da pesquisa os profissionais da educação da Escola Municipal Domitila Castelo da Silva que atuam nos anos iniciais do Ensino Fundamental, do 1º ao 5º ano, e aceitarem o convite: as professoras e os professores regentes das quinze turmas, os dois docentes que atuam no apoio à recomposição de aula, os quatro profissionais do apoio pedagógico, a coordenadora pedagógica, a vice-diretora e o diretor, num total de 24 profissionais. Participa também um técnico da Secretaria Municipal de Educação, o coordenador de políticas públicas e programas educacionais do município, como fonte complementar, sem constituir um segundo caso. Quando uma função for exercida por uma só pessoa, ela será designada pelo nome da função, sem referência a quem a ocupa, para preservar o anonimato assegurado no Termo de Consentimento Livre e Esclarecido.</w:t>
       </w:r>
     </w:p>
     <w:p>
@@ -3050,49 +3050,49 @@
           <w:rFonts w:ascii="Times New Roman" w:hAnsi="Times New Roman"/>
           <w:sz w:val="24"/>
         </w:rPr>
-        <w:t xml:space="preserve">Completam o grupo </w:t>
-      </w:r>
-      <w:r>
-        <w:rPr>
-          <w:rFonts w:ascii="Times New Roman" w:hAnsi="Times New Roman"/>
-          <w:sz w:val="24"/>
-        </w:rPr>
-        <w:t>os</w:t>
-      </w:r>
-      <w:r>
-        <w:rPr>
-          <w:rFonts w:ascii="Times New Roman" w:hAnsi="Times New Roman"/>
-          <w:sz w:val="24"/>
-        </w:rPr>
-        <w:t xml:space="preserve"> profissionais da coordenação pedagógica, </w:t>
-      </w:r>
-      <w:r>
-        <w:rPr>
-          <w:rFonts w:ascii="Times New Roman" w:hAnsi="Times New Roman"/>
-          <w:sz w:val="24"/>
-        </w:rPr>
-        <w:t>a</w:t>
-      </w:r>
-      <w:r>
-        <w:rPr>
-          <w:rFonts w:ascii="Times New Roman" w:hAnsi="Times New Roman"/>
-          <w:sz w:val="24"/>
-        </w:rPr>
-        <w:t xml:space="preserve"> direção da unidade e </w:t>
-      </w:r>
-      <w:r>
-        <w:rPr>
-          <w:rFonts w:ascii="Times New Roman" w:hAnsi="Times New Roman"/>
-          <w:sz w:val="24"/>
-        </w:rPr>
-        <w:t>os demais profissionais ligados ao trabalho pedagógico</w:t>
-      </w:r>
-      <w:r>
-        <w:rPr>
-          <w:rFonts w:ascii="Times New Roman" w:hAnsi="Times New Roman"/>
-          <w:sz w:val="24"/>
-        </w:rPr>
-        <w:t>, cada qual com as responsabilidades, as condições e as possibilidades de ação próprias da função.</w:t>
+        <w:t xml:space="preserve">Completam o grupo os dois docentes do apoio à recomposição de aula, os quatro profissionais do apoio pedagógico, a coordenadora pedagógica, a vice-diretora e o diretor,</w:t>
+      </w:r>
+      <w:r>
+        <w:rPr>
+          <w:rFonts w:ascii="Times New Roman" w:hAnsi="Times New Roman"/>
+          <w:sz w:val="24"/>
+        </w:rPr>
+        <w:t xml:space="preserve"/>
+      </w:r>
+      <w:r>
+        <w:rPr>
+          <w:rFonts w:ascii="Times New Roman" w:hAnsi="Times New Roman"/>
+          <w:sz w:val="24"/>
+        </w:rPr>
+        <w:t xml:space="preserve"/>
+      </w:r>
+      <w:r>
+        <w:rPr>
+          <w:rFonts w:ascii="Times New Roman" w:hAnsi="Times New Roman"/>
+          <w:sz w:val="24"/>
+        </w:rPr>
+        <w:t xml:space="preserve"/>
+      </w:r>
+      <w:r>
+        <w:rPr>
+          <w:rFonts w:ascii="Times New Roman" w:hAnsi="Times New Roman"/>
+          <w:sz w:val="24"/>
+        </w:rPr>
+        <w:t xml:space="preserve"/>
+      </w:r>
+      <w:r>
+        <w:rPr>
+          <w:rFonts w:ascii="Times New Roman" w:hAnsi="Times New Roman"/>
+          <w:sz w:val="24"/>
+        </w:rPr>
+        <w:t xml:space="preserve"/>
+      </w:r>
+      <w:r>
+        <w:rPr>
+          <w:rFonts w:ascii="Times New Roman" w:hAnsi="Times New Roman"/>
+          <w:sz w:val="24"/>
+        </w:rPr>
+        <w:t xml:space="preserve"> cada qual com as responsabilidades, as condições e as possibilidades de ação próprias da função.</w:t>
       </w:r>
     </w:p>
     <w:p>
@@ -4553,21 +4553,21 @@
           <w:rFonts w:ascii="Times New Roman" w:hAnsi="Times New Roman"/>
           <w:sz w:val="24"/>
         </w:rPr>
-        <w:t xml:space="preserve">Vêm então quatro semanas, núcleo da produção dos dados orais e documentais. Na primeira quinzena, entrevistaremos os profissionais da coordenação pedagógica, </w:t>
-      </w:r>
-      <w:r>
-        <w:rPr>
-          <w:rFonts w:ascii="Times New Roman" w:hAnsi="Times New Roman"/>
-          <w:sz w:val="24"/>
-        </w:rPr>
-        <w:t>a direção escolar e o técnico</w:t>
-      </w:r>
-      <w:r>
-        <w:rPr>
-          <w:rFonts w:ascii="Times New Roman" w:hAnsi="Times New Roman"/>
-          <w:sz w:val="24"/>
-        </w:rPr>
-        <w:t xml:space="preserve"> da Secretaria Municipal de Educação, para mapear o quadro institucional que orienta o acompanhamento da política </w:t>
+        <w:t xml:space="preserve">Vêm então quatro semanas, núcleo da produção dos dados orais e documentais. Na primeira quinzena, entrevistaremos a coordenadora pedagógica, a vice-diretora, o diretor e o técnico da Secretaria Municipal de Educação,</w:t>
+      </w:r>
+      <w:r>
+        <w:rPr>
+          <w:rFonts w:ascii="Times New Roman" w:hAnsi="Times New Roman"/>
+          <w:sz w:val="24"/>
+        </w:rPr>
+        <w:t xml:space="preserve"/>
+      </w:r>
+      <w:r>
+        <w:rPr>
+          <w:rFonts w:ascii="Times New Roman" w:hAnsi="Times New Roman"/>
+          <w:sz w:val="24"/>
+        </w:rPr>
+        <w:t xml:space="preserve"> para mapear o quadro institucional que orienta o acompanhamento da política </w:t>
       </w:r>
       <w:r>
         <w:rPr>
@@ -5245,7 +5245,7 @@
           <w:rFonts w:ascii="Times New Roman" w:hAnsi="Times New Roman"/>
           <w:sz w:val="24"/>
         </w:rPr>
-        <w:t xml:space="preserve">Público: Profissionais da educação da Escola Municipal Domitila Castelo da Silva, em Pipa, Tibau do Sul (RN), que atuam nos anos iniciais do Ensino Fundamental (1º ao 5º ano): docentes, coordenação pedagógica, direção e demais profissionais ligados ao trabalho pedagógico dessas turmas, como os do apoio pedagógico e do atendimento educacional especializado.</w:t>
+        <w:t xml:space="preserve">Público: Profissionais da educação da Escola Municipal Domitila Castelo da Silva, em Pipa, Tibau do Sul (RN), que atuam nos anos iniciais do Ensino Fundamental (1º ao 5º ano): docentes regentes e de apoio à recomposição de aula, profissionais do apoio pedagógico, coordenação pedagógica e direção.</w:t>
       </w:r>
     </w:p>
     <w:p>
@@ -5324,6 +5324,19 @@
           <w:sz w:val="24"/>
         </w:rPr>
         <w:t>( ) Docência do 1º ao 5º ano do Ensino Fundamental</w:t>
+      </w:r>
+    </w:p>
+    <w:p>
+      <w:pPr>
+        <w:spacing w:line="240" w:lineRule="auto" w:after="40"/>
+        <w:jc w:val="left"/>
+      </w:pPr>
+      <w:r>
+        <w:rPr>
+          <w:rFonts w:ascii="Times New Roman" w:hAnsi="Times New Roman"/>
+          <w:sz w:val="24"/>
+        </w:rPr>
+        <w:t>( ) Apoio à recomposição de aula</w:t>
       </w:r>
     </w:p>
     <w:p>

</xml_diff>

<commit_message>
Sumário ajustado: capítulo 3 e apêndices unificados de A a G nos capítulos 4 e 6
Co-Authored-By: Claude Opus 5.5 <noreply@anthropic.com>
Claude-Session: https://claude.ai/code/session_01HxStpW4pQoDfJdTDYr6zEC
</commit_message>
<xml_diff>
--- a/metodologia_nova/4_METODOLOGIA_alinhada_ao_projeto.docx
+++ b/metodologia_nova/4_METODOLOGIA_alinhada_ao_projeto.docx
@@ -2386,14 +2386,14 @@
           <w:rFonts w:ascii="Times New Roman" w:hAnsi="Times New Roman"/>
           <w:sz w:val="24"/>
         </w:rPr>
-        <w:t xml:space="preserve">Os instrumentos </w:t>
-      </w:r>
-      <w:r>
-        <w:rPr>
-          <w:rFonts w:ascii="Times New Roman" w:hAnsi="Times New Roman"/>
-          <w:sz w:val="24"/>
-        </w:rPr>
-        <w:t>(Apêndices B e C) foram construídos para que cada movimento</w:t>
+        <w:t xml:space="preserve">Os instrumentos (Apêndices D e E)</w:t>
+      </w:r>
+      <w:r>
+        <w:rPr>
+          <w:rFonts w:ascii="Times New Roman" w:hAnsi="Times New Roman"/>
+          <w:sz w:val="24"/>
+        </w:rPr>
+        <w:t xml:space="preserve"> foram construídos para que cada movimento</w:t>
       </w:r>
       <w:r>
         <w:rPr>
@@ -3428,7 +3428,7 @@
           <w:rFonts w:ascii="Times New Roman" w:hAnsi="Times New Roman"/>
           <w:sz w:val="24"/>
         </w:rPr>
-        <w:t xml:space="preserve">O corpus iconográfico, catalogado no Apêndice A (Caderno Iconográfico da Pesquisa), reúne as trinta e </w:t>
+        <w:t xml:space="preserve">O corpus iconográfico, catalogado no Apêndice F (Caderno Iconográfico da Pesquisa), reúne as trinta e </w:t>
       </w:r>
       <w:r>
         <w:rPr>
@@ -3456,7 +3456,7 @@
           <w:rFonts w:ascii="Times New Roman" w:hAnsi="Times New Roman"/>
           <w:sz w:val="24"/>
         </w:rPr>
-        <w:t>, e duas peças cartográficas complementares, identificadas como A.1 e A.2, de função auxiliar.</w:t>
+        <w:t xml:space="preserve">, e duas peças cartográficas complementares, identificadas como F.1 e F.2, de função auxiliar.</w:t>
       </w:r>
     </w:p>
     <w:p>
@@ -3484,7 +3484,7 @@
           <w:rFonts w:ascii="Times New Roman" w:hAnsi="Times New Roman"/>
           <w:sz w:val="24"/>
         </w:rPr>
-        <w:t xml:space="preserve">No índice do Apêndice A, cada item tem código, título, seção da tese em que é discutido e eixo temático de catalogação. A procedência e a data aparecem na linha de fonte da figura, e o texto que a introduz diz, antes da análise, o que ela pretende documentar. O acervo se divide em seis eixos, que acompanham a estrutura do Capítulo 6: o território histórico anterior ao turismo de massa; o território contemporâneo e suas dinâmicas de conexão; os ambientes físicos da Escola Municipal Domitila Castelo da Silva; as condições materiais da educação digital na unidade escolar; os diagramas analíticos de elaboração própria; e a cartografia de localização.</w:t>
+        <w:t xml:space="preserve">No índice do Apêndice F, cada item tem código, título, seção da tese em que é discutido e eixo temático de catalogação. A procedência e a data aparecem na linha de fonte da figura, e o texto que a introduz diz, antes da análise, o que ela pretende documentar. O acervo se divide em seis eixos, que acompanham a estrutura do Capítulo 6: o território histórico anterior ao turismo de massa; o território contemporâneo e suas dinâmicas de conexão; os ambientes físicos da Escola Municipal Domitila Castelo da Silva; as condições materiais da educação digital na unidade escolar; os diagramas analíticos de elaboração própria; e a cartografia de localização.</w:t>
       </w:r>
     </w:p>
     <w:p>
@@ -3624,14 +3624,14 @@
           <w:rFonts w:ascii="Times New Roman" w:hAnsi="Times New Roman"/>
           <w:sz w:val="24"/>
         </w:rPr>
-        <w:t xml:space="preserve">O questionário </w:t>
-      </w:r>
-      <w:r>
-        <w:rPr>
-          <w:rFonts w:ascii="Times New Roman" w:hAnsi="Times New Roman"/>
-          <w:sz w:val="24"/>
-        </w:rPr>
-        <w:t>(Apêndice B) tem cinco</w:t>
+        <w:t xml:space="preserve">O questionário (Apêndice D)</w:t>
+      </w:r>
+      <w:r>
+        <w:rPr>
+          <w:rFonts w:ascii="Times New Roman" w:hAnsi="Times New Roman"/>
+          <w:sz w:val="24"/>
+        </w:rPr>
+        <w:t xml:space="preserve"> tem cinco</w:t>
       </w:r>
       <w:r>
         <w:rPr>
@@ -3771,7 +3771,7 @@
           <w:rFonts w:ascii="Times New Roman" w:hAnsi="Times New Roman"/>
           <w:sz w:val="24"/>
         </w:rPr>
-        <w:t>As entrevistas semiestruturadas são o principal momento de escuta. Serão individuais, com duração aproximada de 60 a 90 minutos, realizadas em espaço reservado, gravadas com o consentimento dos participantes e transcritas integralmente. O roteiro (Apêndice C) tem os seis eixos descritos na seção 4.3: trajetória e culturas profissionais; interpretação da política; tradução, com a dimensão material e o território; performatividade, com registros, metas e cobranças; formas de atuação diante da política; e habitar o digital e direitos da criança. Com os profissionais da escola, as perguntas tratam de suas experiências, da compreensão que têm da PNED, das condições de trabalho e das relações profissionais, das possibilidades de tradução da política, das demandas institucionais e das experiências das crianças com as tecnologias.</w:t>
+        <w:t xml:space="preserve">As entrevistas semiestruturadas são o principal momento de escuta. Serão individuais, com duração aproximada de 60 a 90 minutos, realizadas em espaço reservado, gravadas com o consentimento dos participantes e transcritas integralmente. O roteiro (Apêndice E) tem os seis eixos descritos na seção 4.3: trajetória e culturas profissionais; interpretação da política; tradução, com a dimensão material e o território; performatividade, com registros, metas e cobranças; formas de atuação diante da política; e habitar o digital e direitos da criança. Com os profissionais da escola, as perguntas tratam de suas experiências, da compreensão que têm da PNED, das condições de trabalho e das relações profissionais, das possibilidades de tradução da política, das demandas institucionais e das experiências das crianças com as tecnologias.</w:t>
       </w:r>
     </w:p>
     <w:p>
@@ -4392,7 +4392,7 @@
           <w:rFonts w:ascii="Times New Roman" w:hAnsi="Times New Roman"/>
           <w:sz w:val="24"/>
         </w:rPr>
-        <w:t>O quarto é a reflexividade da pesquisadora, registrada ao longo do trabalho no diário de campo. Esse material alimentará a Declaração de Reflexividade do Apêndice D, na qual serão explicitados posicionamentos, expectativas teóricas e a relação entre a trajetória da pesquisadora e a interpretação dos dados.</w:t>
+        <w:t xml:space="preserve">O quarto é a reflexividade da pesquisadora, registrada ao longo do trabalho no diário de campo. Esse material alimentará a Declaração de Reflexividade do Apêndice G, na qual serão explicitados posicionamentos, expectativas teóricas e a relação entre a trajetória da pesquisadora e a interpretação dos dados.</w:t>
       </w:r>
     </w:p>
     <w:p>
@@ -4665,7 +4665,7 @@
           <w:rFonts w:ascii="Times New Roman" w:hAnsi="Times New Roman"/>
           <w:sz w:val="24"/>
         </w:rPr>
-        <w:t>A posicionalidade da pesquisadora, discutida na seção 4.1, é o limite mais difícil de administrar. Pesquisar a própria rede não é confortável. Os anos de residência em Pipa, quase duas décadas de convivência com o território e dezoito anos na rede municipal, inclusive na escola pesquisada, criam uma relação de pertencimento com o campo que nenhum procedimento técnico neutraliza por completo. Os riscos são dois: naturalizar rotinas que parecem óbvias a quem convive com a rede e receber respostas convenientes de profissionais que conhecem a trajetória da pesquisadora. Triangulação, checagem das sínteses, diário de campo, discussão com pares, diálogo com a orientadora e a Declaração de Reflexividade do Apêndice D ajudam a controlar esses riscos. Ainda assim, podem restar pontos cegos sobre a lógica administrativa ou sobre conflitos internos.</w:t>
+        <w:t xml:space="preserve">A posicionalidade da pesquisadora, discutida na seção 4.1, é o limite mais difícil de administrar. Pesquisar a própria rede não é confortável. Os anos de residência em Pipa, quase duas décadas de convivência com o território e dezoito anos na rede municipal, inclusive na escola pesquisada, criam uma relação de pertencimento com o campo que nenhum procedimento técnico neutraliza por completo. Os riscos são dois: naturalizar rotinas que parecem óbvias a quem convive com a rede e receber respostas convenientes de profissionais que conhecem a trajetória da pesquisadora. Triangulação, checagem das sínteses, diário de campo, discussão com pares, diálogo com a orientadora e a Declaração de Reflexividade do Apêndice G ajudam a controlar esses riscos. Ainda assim, podem restar pontos cegos sobre a lógica administrativa ou sobre conflitos internos.</w:t>
       </w:r>
     </w:p>
     <w:p>
@@ -5641,7 +5641,7 @@
           <w:b/>
           <w:sz w:val="24"/>
         </w:rPr>
-        <w:t>APÊNDICE B – QUESTIONÁRIO DE PERFIL E PERCEPÇÕES SOBRE A PNED</w:t>
+        <w:t xml:space="preserve">APÊNDICE D – QUESTIONÁRIO DE PERFIL E PERCEPÇÕES SOBRE A PNED</w:t>
       </w:r>
     </w:p>
     <w:p>
@@ -8454,7 +8454,7 @@
           <w:b/>
           <w:sz w:val="24"/>
         </w:rPr>
-        <w:t>APÊNDICE C – ROTEIRO DE ENTREVISTA SEMIESTRUTURADA EM PROFUNDIDADE</w:t>
+        <w:t xml:space="preserve">APÊNDICE E – ROTEIRO DE ENTREVISTA SEMIESTRUTURADA EM PROFUNDIDADE</w:t>
       </w:r>
     </w:p>
     <w:p>

</xml_diff>

<commit_message>
Revisa a Metodologia no desenho em funil, da Secretaria à escola
Caso único com unidades incorporadas (SME e escola); Quadro 9 com os
novos objetivos; recontextualização em dois lugares; técnico da SME
como primeiro entrevistado e unidade do caso; conjunto documental da
rede com matriz própria; leitura do território municipal no segundo
movimento; ética, cronograma e limitações ajustados; roteiro do
técnico ampliado; título novo nos apêndices; novas referências.

Co-Authored-By: Claude Opus 5.5 <noreply@anthropic.com>
Claude-Session: https://claude.ai/code/session_01HxStpW4pQoDfJdTDYr6zEC
</commit_message>
<xml_diff>
--- a/metodologia_nova/4_METODOLOGIA_alinhada_ao_projeto.docx
+++ b/metodologia_nova/4_METODOLOGIA_alinhada_ao_projeto.docx
@@ -26,7 +26,7 @@
           <w:rFonts w:ascii="Times New Roman" w:hAnsi="Times New Roman"/>
           <w:sz w:val="24"/>
         </w:rPr>
-        <w:t xml:space="preserve">Na Introdução, formulamos a questão norteadora da tese: como os profissionais da educação encenam e recontextualizam a Política Nacional de Educação Digital no contexto da prática da Escola Municipal Domitila Castelo da Silva, em Pipa (RN), e como as culturas profissionais, as condições materiais e institucionais da escola e as especificidades socioespaciais do território atravessam esse processo, produzindo diferentes formas de atuação, entre as quais podem emergir acomodações, negociações, ressignificações e resistências? Este capítulo apresenta o caminho escolhido para respondê-la. Ele cumpre, na arquitetura da tese, uma função dupla. Organiza a produção e a análise dos dados relativos aos quatro objetivos específicos e fixa, antes do campo, as dimensões e os critérios pelos quais as formas de atuação dos profissionais serão identificadas, sem que nenhuma delas seja pressuposta. Sem esses critérios, a análise correria o risco de encontrar nos dados apenas aquilo que a pesquisadora espera.</w:t>
+        <w:t>Na Introdução, formulamos a questão norteadora da tese: como a Política Nacional de Educação Digital é recontextualizada pela Secretaria Municipal de Educação de Tibau do Sul (RN), num território municipal que reúne áreas urbanas e rurais, povoados com realidades distintas e uma comunidade quilombola, e como essa recontextualização chega à Escola Municipal Domitila Castelo da Silva, em Pipa, onde os profissionais da educação a encenam, atravessados pelas culturas profissionais, pelas condições materiais e institucionais da escola e pelas especificidades do lugar, produzindo diferentes formas de atuação, entre as quais podem emergir acomodações, negociações, ressignificações e resistências? Este capítulo apresenta o caminho escolhido para respondê-la. Ele cumpre, na arquitetura da tese, uma função dupla. Organiza a produção e a análise dos dados relativos aos quatro objetivos específicos, da Secretaria Municipal de Educação à escola, e fixa, antes do campo, as dimensões e os critérios pelos quais as formas de atuação serão identificadas, sem que nenhuma delas seja pressuposta. Sem esses critérios, a análise correria o risco de encontrar nos dados apenas aquilo que a pesquisadora espera.</w:t>
       </w:r>
     </w:p>
     <w:p>
@@ -124,7 +124,7 @@
           <w:rFonts w:ascii="Times New Roman" w:hAnsi="Times New Roman"/>
           <w:sz w:val="24"/>
         </w:rPr>
-        <w:t xml:space="preserve">O campo é a rede municipal de Tibau do Sul, no Rio Grande do Norte, e, dentro dela, a escola de Pipa. Participam os profissionais da educação que atuam nos anos iniciais, do 1º ao 5º ano: docentes, coordenação pedagógica, direção e demais profissionais ligados ao trabalho pedagógico dessas turmas. Um técnico da Secretaria Municipal de Educação, o coordenador de políticas públicas e programas educacionais do município, participa como fonte complementar sobre o contexto externo. Os dados serão construídos em cinco movimentos, a análise documental, o registro iconográfico, o questionário, as entrevistas semiestruturadas e a análise com devolutiva, e lidos com a Abordagem do Ciclo de Políticas (ACP), formulada por Bowe, Ball e Gold (1992) e sistematizada no Brasil por Mainardes (2006), e com a teoria da atuação de Ball, Maguire e Braun (2016). Dois pontos recebem atenção especial ao longo do capítulo: a posição da pesquisadora, que residiu em Pipa e trabalhou na rede municipal, e os critérios de leitura das formas de atuação. Os resultados ficam para os capítulos de análise.</w:t>
+        <w:t>O campo é a rede municipal de Tibau do Sul, no Rio Grande do Norte, percorrida em forma de funil: a análise começa na Secretaria Municipal de Educação e no território municipal e se estreita até a escola de Pipa. Na Secretaria, participa um técnico, o coordenador de políticas públicas e programas educacionais do município, cuja entrevista abre a investigação. Na escola, participam os profissionais da educação que atuam nos anos iniciais, do 1º ao 5º ano: docentes, coordenação pedagógica, direção e demais profissionais ligados ao trabalho pedagógico dessas turmas. Os dados serão construídos em cinco movimentos, a análise documental, da rede à escola, a leitura do território municipal com o registro iconográfico, o questionário, as entrevistas semiestruturadas e a análise com devolutiva, e lidos com a Abordagem do Ciclo de Políticas (ACP), formulada por Bowe, Ball e Gold (1992) e sistematizada no Brasil por Mainardes (2006), e com a teoria da atuação de Ball, Maguire e Braun (2016). Dois pontos recebem atenção especial ao longo do capítulo: a posição da pesquisadora, que residiu em Pipa e trabalhou na rede municipal, e os critérios de leitura das formas de atuação. Os resultados ficam para os capítulos de análise.</w:t>
       </w:r>
     </w:p>
     <w:p>
@@ -138,7 +138,7 @@
           <w:rFonts w:ascii="Times New Roman" w:hAnsi="Times New Roman"/>
           <w:sz w:val="24"/>
         </w:rPr>
-        <w:t>O Quadro 9 mostra a correspondência entre cada objetivo específico, os contextos da ACP, as dimensões do contexto, as fontes e os capítulos. Os quatro objetivos serão respondidos no Capítulo 7, com o questionário, as entrevistas e os documentos pedagógicos, orientados pelas questões analíticas de Mainardes (2006, p. 67-68) e pelas perguntas que o Capítulo 6 extraiu do contraste entre o território e a escola. Os capítulos anteriores preparam essa resposta. O Capítulo 5, construído por análise documental dos contextos de influência e de produção do texto, mostra o que a política pede, com que meios e com que promessas às crianças, e identifica no texto os elementos que podem gerar lógicas de performatividade, base para os objetivos (a), (c) e (d). O Capítulo 6, apoiado no registro iconográfico e no acervo histórico, documenta as dimensões situacional e material do contexto, base para o objetivo (b); os documentos de aquisição ainda serão analisados. É também o ponto indicado pela revisão sistemática do Capítulo 2, uma vez que nenhum dos nove estudos reunidos examina empiricamente a PNED nem acompanha o trabalho dos profissionais quando a formação prevista não chega.</w:t>
+        <w:t>O Quadro 9 mostra a correspondência entre cada objetivo específico, os contextos da ACP, as dimensões do contexto, as fontes e os capítulos. O objetivo (a), sobre a tradução municipal da política, será respondido com os documentos da Secretaria, os dados do território municipal e a entrevista com o técnico, apresentados no Capítulo 6 e retomados no Capítulo 7. Os objetivos (b), (c) e (d) serão respondidos no Capítulo 7, com o questionário, as entrevistas e os documentos pedagógicos, orientados pelas questões analíticas de Mainardes (2006, p. 67-68) e pelas perguntas que o Capítulo 6 extraiu do contraste entre o município, o território de Pipa e a escola. O Capítulo 5, construído por análise documental dos contextos de influência e de produção do texto, mostra o que a política pede, com que meios e com que promessas às crianças, e identifica no texto os elementos que podem gerar lógicas de performatividade, base para os objetivos (b) e (d). O Capítulo 6 documenta as dimensões situacional, material e externa do contexto, base para os objetivos (a) e (c); os documentos de aquisição ainda serão analisados. É também o ponto indicado pela revisão sistemática do Capítulo 2, uma vez que nenhum dos nove estudos reunidos examina empiricamente a PNED, acompanha uma rede de pequeno porte da secretaria à escola ou segue o trabalho dos profissionais quando a formação prevista não chega.</w:t>
       </w:r>
     </w:p>
     <w:p>
@@ -238,13 +238,8 @@
             <w:tcW w:type="dxa" w:w="2351"/>
           </w:tcPr>
           <w:p>
-            <w:r/>
             <w:r>
-              <w:rPr>
-                <w:rFonts w:ascii="Times New Roman" w:hAnsi="Times New Roman"/>
-                <w:sz w:val="20"/>
-              </w:rPr>
-              <w:t>(a) Compreender como os diferentes profissionais interpretam os textos da PNED e os discursos sobre educação digital</w:t>
+              <w:t>(a) Analisar a recontextualização da PNED pela Secretaria Municipal de Educação em planos, currículos, formações e orientações para a rede, considerando as especificidades das localidades do município</w:t>
             </w:r>
           </w:p>
         </w:tc>
@@ -253,13 +248,8 @@
             <w:tcW w:type="dxa" w:w="2351"/>
           </w:tcPr>
           <w:p>
-            <w:r/>
             <w:r>
-              <w:rPr>
-                <w:rFonts w:ascii="Times New Roman" w:hAnsi="Times New Roman"/>
-                <w:sz w:val="20"/>
-              </w:rPr>
-              <w:t>Contexto da prática (culturas profissionais), com base nos contextos de influência e de produção do texto. Análise documental; questionário (Blocos 1, 2 e 5); entrevistas (Eixos 1 e 2)</w:t>
+              <w:t>Contexto da prática na escala municipal; dimensão externa do contexto da escola. Documentos da Secretaria (plano da rede, currículo, formações, orientações, PME); dados do IBGE e do Censo Escolar por escola; entrevista com o técnico da Secretaria</w:t>
             </w:r>
           </w:p>
         </w:tc>
@@ -268,13 +258,8 @@
             <w:tcW w:type="dxa" w:w="2351"/>
           </w:tcPr>
           <w:p>
-            <w:r/>
             <w:r>
-              <w:rPr>
-                <w:rFonts w:ascii="Times New Roman" w:hAnsi="Times New Roman"/>
-                <w:sz w:val="20"/>
-              </w:rPr>
-              <w:t>5 e 7</w:t>
+              <w:t>6 e 7</w:t>
             </w:r>
           </w:p>
         </w:tc>
@@ -283,13 +268,8 @@
             <w:tcW w:type="dxa" w:w="2351"/>
           </w:tcPr>
           <w:p>
-            <w:r/>
             <w:r>
-              <w:rPr>
-                <w:rFonts w:ascii="Times New Roman" w:hAnsi="Times New Roman"/>
-                <w:sz w:val="20"/>
-              </w:rPr>
-              <w:t>Os sentidos atribuídos à política em cada posição institucional, lidos em relação ao que o texto efetivamente pede</w:t>
+              <w:t>A tradução municipal da PNED e o modo como ela considera, ou não, a diversidade das localidades</w:t>
             </w:r>
           </w:p>
         </w:tc>
@@ -300,13 +280,8 @@
             <w:tcW w:type="dxa" w:w="2351"/>
           </w:tcPr>
           <w:p>
-            <w:r/>
             <w:r>
-              <w:rPr>
-                <w:rFonts w:ascii="Times New Roman" w:hAnsi="Times New Roman"/>
-                <w:sz w:val="20"/>
-              </w:rPr>
-              <w:t>(b) Analisar como as condições da escola e o território atravessam a tradução da PNED em práticas cotidianas</w:t>
+              <w:t>(b) Compreender a interpretação da PNED e das orientações municipais pelos profissionais da escola</w:t>
             </w:r>
           </w:p>
         </w:tc>
@@ -315,13 +290,8 @@
             <w:tcW w:type="dxa" w:w="2351"/>
           </w:tcPr>
           <w:p>
-            <w:r/>
             <w:r>
-              <w:rPr>
-                <w:rFonts w:ascii="Times New Roman" w:hAnsi="Times New Roman"/>
-                <w:sz w:val="20"/>
-              </w:rPr>
-              <w:t>Contexto da prática (dimensões situacional e material). Registro iconográfico e acervo do Museu Digital de Pipa; documentos de aquisição (a realizar); questionário (Bloco 3); entrevistas (Eixo 3)</w:t>
+              <w:t>Contexto da prática (culturas profissionais), com base nos contextos de influência e de produção do texto. Análise documental; questionário (Blocos 1, 2 e 5); entrevistas (Eixos 1 e 2)</w:t>
             </w:r>
           </w:p>
         </w:tc>
@@ -330,12 +300,49 @@
             <w:tcW w:type="dxa" w:w="2351"/>
           </w:tcPr>
           <w:p>
-            <w:r/>
             <w:r>
-              <w:rPr>
-                <w:rFonts w:ascii="Times New Roman" w:hAnsi="Times New Roman"/>
-                <w:sz w:val="20"/>
-              </w:rPr>
+              <w:t>5 e 7</w:t>
+            </w:r>
+          </w:p>
+        </w:tc>
+        <w:tc>
+          <w:tcPr>
+            <w:tcW w:type="dxa" w:w="2351"/>
+          </w:tcPr>
+          <w:p>
+            <w:r>
+              <w:t>Os sentidos atribuídos à política e às orientações municipais em cada posição institucional, lidos em relação ao que o texto efetivamente pede</w:t>
+            </w:r>
+          </w:p>
+        </w:tc>
+      </w:tr>
+      <w:tr>
+        <w:tc>
+          <w:tcPr>
+            <w:tcW w:type="dxa" w:w="2351"/>
+          </w:tcPr>
+          <w:p>
+            <w:r>
+              <w:t>(c) Examinar a relação entre as condições materiais e institucionais da escola, articuladas às especificidades de Pipa no território municipal, e a tradução da política</w:t>
+            </w:r>
+          </w:p>
+        </w:tc>
+        <w:tc>
+          <w:tcPr>
+            <w:tcW w:type="dxa" w:w="2351"/>
+          </w:tcPr>
+          <w:p>
+            <w:r>
+              <w:t>Contexto da prática (dimensões situacional e material). Leitura do território municipal; registro iconográfico e acervo do Museu Digital de Pipa; documentos de aquisição (a realizar); questionário (Bloco 3); entrevistas (Eixo 3)</w:t>
+            </w:r>
+          </w:p>
+        </w:tc>
+        <w:tc>
+          <w:tcPr>
+            <w:tcW w:type="dxa" w:w="2351"/>
+          </w:tcPr>
+          <w:p>
+            <w:r>
               <w:t>6 e 7</w:t>
             </w:r>
           </w:p>
@@ -345,12 +352,7 @@
             <w:tcW w:type="dxa" w:w="2351"/>
           </w:tcPr>
           <w:p>
-            <w:r/>
             <w:r>
-              <w:rPr>
-                <w:rFonts w:ascii="Times New Roman" w:hAnsi="Times New Roman"/>
-                <w:sz w:val="20"/>
-              </w:rPr>
               <w:t>As condições de tradução: vazio material, habitar o digital e rugosidade tecnológica</w:t>
             </w:r>
           </w:p>
@@ -362,13 +364,8 @@
             <w:tcW w:type="dxa" w:w="2351"/>
           </w:tcPr>
           <w:p>
-            <w:r/>
             <w:r>
-              <w:rPr>
-                <w:rFonts w:ascii="Times New Roman" w:hAnsi="Times New Roman"/>
-                <w:sz w:val="20"/>
-              </w:rPr>
-              <w:t>(c) Identificar as formas de atuação produzidas diante da política, sem pressupor a predominância de nenhuma</w:t>
+              <w:t>(d) Identificar as formas de atuação produzidas diante da política e das orientações municipais e suas implicações para as crianças</w:t>
             </w:r>
           </w:p>
         </w:tc>
@@ -377,13 +374,8 @@
             <w:tcW w:type="dxa" w:w="2351"/>
           </w:tcPr>
           <w:p>
-            <w:r/>
             <w:r>
-              <w:rPr>
-                <w:rFonts w:ascii="Times New Roman" w:hAnsi="Times New Roman"/>
-                <w:sz w:val="20"/>
-              </w:rPr>
-              <w:t>Contexto da prática (todas as dimensões, inclusive a externa, com o técnico da Secretaria). Entrevistas (Eixos 3, 4 e 5); documentos pedagógicos</w:t>
+              <w:t>Contexto da prática (todas as dimensões). Entrevistas (Eixos 3, 4, 5 e 6); documentos pedagógicos; provisão, proteção e participação (ONU, 2021), com a leitura da lei no Capítulo 5</w:t>
             </w:r>
           </w:p>
         </w:tc>
@@ -392,74 +384,7 @@
             <w:tcW w:type="dxa" w:w="2351"/>
           </w:tcPr>
           <w:p>
-            <w:r/>
             <w:r>
-              <w:rPr>
-                <w:rFonts w:ascii="Times New Roman" w:hAnsi="Times New Roman"/>
-                <w:sz w:val="20"/>
-              </w:rPr>
-              <w:t>7</w:t>
-            </w:r>
-          </w:p>
-        </w:tc>
-        <w:tc>
-          <w:tcPr>
-            <w:tcW w:type="dxa" w:w="2351"/>
-          </w:tcPr>
-          <w:p>
-            <w:r/>
-            <w:r>
-              <w:rPr>
-                <w:rFonts w:ascii="Times New Roman" w:hAnsi="Times New Roman"/>
-                <w:sz w:val="20"/>
-              </w:rPr>
-              <w:t>O mapa das formas de atuação, da adesão à resistência, e das condições em que aparecem</w:t>
-            </w:r>
-          </w:p>
-        </w:tc>
-      </w:tr>
-      <w:tr>
-        <w:tc>
-          <w:tcPr>
-            <w:tcW w:type="dxa" w:w="2351"/>
-          </w:tcPr>
-          <w:p>
-            <w:r/>
-            <w:r>
-              <w:rPr>
-                <w:rFonts w:ascii="Times New Roman" w:hAnsi="Times New Roman"/>
-                <w:sz w:val="20"/>
-              </w:rPr>
-              <w:t>(d) Discutir as implicações dessas formas para a educação digital das crianças</w:t>
-            </w:r>
-          </w:p>
-        </w:tc>
-        <w:tc>
-          <w:tcPr>
-            <w:tcW w:type="dxa" w:w="2351"/>
-          </w:tcPr>
-          <w:p>
-            <w:r/>
-            <w:r>
-              <w:rPr>
-                <w:rFonts w:ascii="Times New Roman" w:hAnsi="Times New Roman"/>
-                <w:sz w:val="20"/>
-              </w:rPr>
-              <w:t>Provisão, proteção e participação (ONU, 2021; Estatuto Digital). Leitura da lei no Capítulo 5; questionário (Bloco 5); entrevistas (Eixo 6)</w:t>
-            </w:r>
-          </w:p>
-        </w:tc>
-        <w:tc>
-          <w:tcPr>
-            <w:tcW w:type="dxa" w:w="2351"/>
-          </w:tcPr>
-          <w:p>
-            <w:r/>
-            <w:r>
-              <w:rPr>
-                <w:rFonts w:ascii="Times New Roman" w:hAnsi="Times New Roman"/>
-                <w:sz w:val="20"/>
-              </w:rPr>
               <w:t>5 e 7</w:t>
             </w:r>
           </w:p>
@@ -469,13 +394,8 @@
             <w:tcW w:type="dxa" w:w="2351"/>
           </w:tcPr>
           <w:p>
-            <w:r/>
             <w:r>
-              <w:rPr>
-                <w:rFonts w:ascii="Times New Roman" w:hAnsi="Times New Roman"/>
-                <w:sz w:val="20"/>
-              </w:rPr>
-              <w:t>O que a encenação da PNED produz para os direitos das crianças</w:t>
+              <w:t>O mapa das formas de atuação, da adesão à resistência, das condições em que aparecem e do que produzem para os direitos das crianças</w:t>
             </w:r>
           </w:p>
         </w:tc>
@@ -603,7 +523,7 @@
           <w:rFonts w:ascii="Times New Roman" w:hAnsi="Times New Roman"/>
           <w:sz w:val="24"/>
         </w:rPr>
-        <w:t xml:space="preserve">A pesquisadora residiu no distrito de Pipa, convive com o território há quase duas décadas e trabalhou dezoito anos na rede municipal de Tibau do Sul. Durante o ensino remoto emergencial, esteve na Escola Municipal Domitila Castelo da Silva. Justamente por isso, a regra adotada aqui é rigorosa: essa trajetória não é fonte de dados. Nenhuma afirmação da tese se apoiará em lembranças ou em impressões acumuladas ao longo dos anos. O diário de campo registrará o percurso e as condições de cada entrevista, sem se tornar uma quinta fonte. Separar o saber da convivência do conhecimento produzido pela pesquisa é uma decisão de método, válida para todos os capítulos.</w:t>
+        <w:t>A pesquisadora residiu em Pipa, convive com o território há quase duas décadas e trabalhou dezoito anos na rede municipal de Tibau do Sul. Durante o ensino remoto emergencial, esteve na Escola Municipal Domitila Castelo da Silva. Justamente por isso, a regra adotada aqui é rigorosa: essa trajetória não é fonte de dados. Nenhuma afirmação da tese se apoiará em lembranças ou em impressões acumuladas ao longo dos anos. O diário de campo registrará o percurso e as condições de cada entrevista, sem se tornar uma quinta fonte. Separar o saber da convivência do conhecimento produzido pela pesquisa é uma decisão de método, válida para todos os capítulos.</w:t>
       </w:r>
     </w:p>
     <w:p>
@@ -617,7 +537,7 @@
           <w:rFonts w:ascii="Times New Roman" w:hAnsi="Times New Roman"/>
           <w:sz w:val="24"/>
         </w:rPr>
-        <w:t>Essa proximidade traz riscos. Diante de alguém conhecido da rede, os profissionais podem responder na defensiva ou evitar críticas à gestão. Para reduzir esse risco, adotamos três procedimentos: a) a triangulação sistemática entre as fontes documentais e orais; b) a checagem de relatos (member checking), com a devolução individual das sínteses, na qual cada participante pode apontar erros de fato e omissões; e c) o diário de campo, no qual serão anotados hesitações, silêncios e o clima das conversas. Nenhum dos três resolve o problema por inteiro, e voltaremos a ele ao tratar das limitações.</w:t>
+        <w:t>Essa proximidade traz riscos. Diante de alguém conhecido da rede, os profissionais podem responder na defensiva ou evitar críticas à gestão, e o técnico da Secretaria, que conhece a trajetória da pesquisadora na administração municipal, pode apresentar a política da rede de modo mais favorável do que os documentos sustentam. Para reduzir esse risco, adotamos três procedimentos: a) a triangulação sistemática entre as fontes documentais e orais; b) a checagem de relatos (member checking), com a devolução individual das sínteses, na qual cada participante pode apontar erros de fato e omissões; e c) o diário de campo, no qual serão anotados hesitações, silêncios e o clima das conversas. Nenhum dos três resolve o problema por inteiro, e voltaremos a ele ao tratar das limitações.</w:t>
       </w:r>
     </w:p>
     <w:p>
@@ -820,7 +740,7 @@
           <w:rFonts w:ascii="Times New Roman" w:hAnsi="Times New Roman"/>
           <w:sz w:val="24"/>
         </w:rPr>
-        <w:t>É a situação de Pipa. Infraestrutura, formação dos profissionais, cultura escolar e desigualdades do território condicionam a política e fazem parte dela ao mesmo tempo, sem possibilidade de isolar um elemento dos demais. O desenho reúne, por isso, quatro fontes de evidência, organizadas em cinco movimentos e confrontadas por triangulação, e proposições teóricas formuladas antes da coleta, vindas da ACP e da teoria da atuação. Soma-se a isso o fato de a pesquisadora não controlar os acontecimentos da escola, o que reforça a escolha de investigar o fenômeno em seu próprio contexto.</w:t>
+        <w:t>É a situação de Tibau do Sul e de Pipa. Infraestrutura, formação dos profissionais, cultura escolar e desigualdades do território condicionam a política e fazem parte dela ao mesmo tempo, sem possibilidade de isolar um elemento dos demais. O desenho reúne, por isso, quatro fontes de evidência, organizadas em cinco movimentos e confrontadas por triangulação, e proposições teóricas formuladas antes da coleta, vindas da ACP e da teoria da atuação. Soma-se a isso o fato de a pesquisadora não controlar os acontecimentos da escola, o que reforça a escolha de investigar o fenômeno em seu próprio contexto.</w:t>
       </w:r>
     </w:p>
     <w:p>
@@ -834,7 +754,7 @@
           <w:rFonts w:ascii="Times New Roman" w:hAnsi="Times New Roman"/>
           <w:sz w:val="24"/>
         </w:rPr>
-        <w:t>Trabalhamos com um caso único, sem a pretensão de representar outras escolas, com o propósito de compreender a fundo uma realidade singular. André (2005, p. 14) alerta para o uso superficial dessa denominação na pesquisa em educação:</w:t>
+        <w:t>Trabalhamos com um caso único com unidades incorporadas, desenho que Yin (2001) descreve para os casos em que se examinam subunidades dentro de um mesmo caso [indicar a página na edição usada]. O caso é a encenação da PNED na rede municipal de Tibau do Sul, e as unidades de análise são a Secretaria Municipal de Educação, onde a política é traduzida para o município, e a Escola Municipal Domitila Castelo da Silva, onde ela chega ao contexto da prática. Não pretendemos representar outras redes ou escolas; o propósito é compreender a fundo uma realidade singular. André (2005, p. 14) alerta para o uso superficial dessa denominação na pesquisa em educação:</w:t>
       </w:r>
     </w:p>
     <w:p>
@@ -862,21 +782,7 @@
           <w:rFonts w:ascii="Times New Roman" w:hAnsi="Times New Roman"/>
           <w:sz w:val="24"/>
         </w:rPr>
-        <w:t xml:space="preserve">Por essa razão, é preciso justificar a escolha desta escola. Ela reúne três características: convive com a movimentação de um polo turístico internacional, trabalha há muito tempo com limitações de infraestrutura e </w:t>
-      </w:r>
-      <w:r>
-        <w:rPr>
-          <w:rFonts w:ascii="Times New Roman" w:hAnsi="Times New Roman"/>
-          <w:sz w:val="24"/>
-        </w:rPr>
-        <w:t xml:space="preserve">atende os anos iniciais do Ensino Fundamental, do 1º ao 5º ano, incluído o ciclo de alfabetização.</w:t>
-      </w:r>
-      <w:r>
-        <w:rPr>
-          <w:rFonts w:ascii="Times New Roman" w:hAnsi="Times New Roman"/>
-          <w:sz w:val="24"/>
-        </w:rPr>
-        <w:t xml:space="preserve"> O caso tem limites claros. Consiste na chegada do eixo Educação Digital Escolar à Escola Municipal Domitila Castelo da Silva, no distrito de Pipa, em Tibau do Sul/RN, com as condições do território e da instituição presentes nesse processo, e permite observar o encontro de uma diretriz de alcance nacional com um município de pequeno porte.</w:t>
+        <w:t>Por essa razão, é preciso justificar a escolha do município e da escola. Tibau do Sul reúne, numa rede de pequeno porte, localidades muito diferentes entre si: a sede, a praia turística de Pipa, a comunidade quilombola de Sibaúma e povoados de feição rural. Uma política nacional precisa ser traduzida, ali, para escolas que não partilham as mesmas condições. A escola, por sua vez, reúne três características: convive com a movimentação de um polo turístico internacional, trabalha há muito tempo com limitações de infraestrutura e atende os anos iniciais do Ensino Fundamental, do 1º ao 5º ano, incluído o ciclo de alfabetização. O caso tem limites claros. Consiste na chegada do eixo Educação Digital Escolar à rede municipal de Tibau do Sul/RN, da Secretaria Municipal de Educação à Escola Municipal Domitila Castelo da Silva, em Pipa, com as condições do território e das instituições presentes nesse processo, e permite observar o encontro de uma diretriz de alcance nacional com um município de pequeno porte e diverso.</w:t>
       </w:r>
     </w:p>
     <w:p>
@@ -1289,7 +1195,7 @@
           <w:rFonts w:ascii="Times New Roman" w:hAnsi="Times New Roman"/>
           <w:sz w:val="24"/>
         </w:rPr>
-        <w:t xml:space="preserve">A teoria da atuação entra para explicar as condições desse trabalho. Ball, Maguire e Braun (2016) propõem levar o contexto a sério e o dividem em quatro dimensões: a situacional, que diz respeito à história, à localização e à composição da escola; a das culturas profissionais, que reúne valores, compromissos e experiências dos professores; a material, relativa a edifícios, orçamentos, equipamentos, pessoal e infraestrutura; e a externa, que envolve pressões, expectativas e apoios vindos de fora, como avaliações, exigências das redes e responsabilidades legais. Para ler a dimensão das culturas profissionais, recorremos também a Hargreaves (2005, p. 189-191), que distingue o conteúdo dessas culturas, isto é, as atitudes, os valores, as crenças, os hábitos e as formas de fazer as coisas compartilhados por um grupo de professores, e a sua forma, isto é, os modos de relação e de associação entre eles, que o autor descreve como individualismo, colaboração, colegialidade artificial e balcanização. Essas dimensões organizam a leitura do território, no Capítulo 6, e a análise das narrativas, no Capítulo 7.</w:t>
+        <w:t>A teoria da atuação entra para explicar as condições desse trabalho. Ball, Maguire e Braun (2016) propõem levar o contexto a sério e o dividem em quatro dimensões: a situacional, que diz respeito à história, à localização e à composição da escola; a das culturas profissionais, que reúne valores, compromissos e experiências dos professores; a material, relativa a edifícios, orçamentos, equipamentos, pessoal e infraestrutura; e a externa, que envolve pressões, expectativas e apoios vindos de fora, como avaliações, exigências das redes e responsabilidades legais. Para ler a dimensão das culturas profissionais, recorremos também a Hargreaves (2005, p. 189-191), que distingue o conteúdo dessas culturas, isto é, as atitudes, os valores, as crenças, os hábitos e as formas de fazer as coisas compartilhados por um grupo de professores, e a sua forma, isto é, os modos de relação e de associação entre eles, que o autor descreve como individualismo, colaboração, colegialidade artificial e balcanização. Nesta tese, a dimensão externa tem fonte própria na Secretaria Municipal de Educação, com seus documentos e a entrevista com o técnico. Essas dimensões organizam a leitura do município e da escola, no Capítulo 6, e a análise das narrativas, no Capítulo 7.</w:t>
       </w:r>
     </w:p>
     <w:p>
@@ -1638,7 +1544,7 @@
           <w:rFonts w:ascii="Times New Roman" w:hAnsi="Times New Roman"/>
           <w:sz w:val="24"/>
         </w:rPr>
-        <w:t>A ACP traz ainda outra premissa, sintetizada por Ball, Maguire e Braun (2016, p. 36): “A política cria o contexto, mas o contexto também precede a política”. Tibau do Sul e Pipa entram na análise como parte do contexto da política. As características sociais, históricas e institucionais do lugar interferem no modo de recepção, interpretação e recontextualização da política pelos profissionais. Os roteiros seguem as questões analíticas de Mainardes (2006, p. 67-68). Com elas, perguntamos pela recepção da PNED nos anos iniciais, pelos modos de ler o texto legal, pelas decisões e encaminhamentos cotidianos da escola e da rede municipal, pela autonomia profissional diante das demandas diárias e pela relação entre a política federal e as desigualdades do território.</w:t>
+        <w:t>A ACP traz ainda outra premissa, sintetizada por Ball, Maguire e Braun (2016, p. 36): “A política cria o contexto, mas o contexto também precede a política”. Tibau do Sul e Pipa entram na análise como parte do contexto da política. As características sociais, históricas e institucionais do lugar interferem no modo de recepção, interpretação e recontextualização da política pelos profissionais. Os roteiros seguem as questões analíticas de Mainardes (2006, p. 67-68). Com elas, perguntamos pela recepção da PNED nos anos iniciais, pelos modos de ler o texto legal, pelas decisões e encaminhamentos cotidianos da escola e da rede municipal, pela autonomia profissional diante das demandas diárias e pela relação entre a política federal e as desigualdades do território. Na escala municipal, perguntamos também se e como a Secretaria considera as especificidades das localidades ao traduzir a política para a rede.</w:t>
       </w:r>
     </w:p>
     <w:p>
@@ -1707,35 +1613,7 @@
           <w:rFonts w:ascii="Times New Roman" w:hAnsi="Times New Roman"/>
           <w:sz w:val="24"/>
         </w:rPr>
-        <w:t xml:space="preserve">Da articulação entre a ACP e a </w:t>
-      </w:r>
-      <w:r>
-        <w:rPr>
-          <w:rFonts w:ascii="Times New Roman" w:hAnsi="Times New Roman"/>
-          <w:sz w:val="24"/>
-        </w:rPr>
-        <w:t>teoria da atuação</w:t>
-      </w:r>
-      <w:r>
-        <w:rPr>
-          <w:rFonts w:ascii="Times New Roman" w:hAnsi="Times New Roman"/>
-          <w:sz w:val="24"/>
-        </w:rPr>
-        <w:t xml:space="preserve"> construímos a categoria integradora da tese, a recontextualização. Ela reúne a compreensão da política como processo interpretativo, vinda da ACP, e a </w:t>
-      </w:r>
-      <w:r>
-        <w:rPr>
-          <w:rFonts w:ascii="Times New Roman" w:hAnsi="Times New Roman"/>
-          <w:sz w:val="24"/>
-        </w:rPr>
-        <w:t>atenção da teoria da atuação às dimensões do contexto e às respostas dos profissionais, que podem ir da adesão à resistência</w:t>
-      </w:r>
-      <w:r>
-        <w:rPr>
-          <w:rFonts w:ascii="Times New Roman" w:hAnsi="Times New Roman"/>
-          <w:sz w:val="24"/>
-        </w:rPr>
-        <w:t>.</w:t>
+        <w:t>No desenho em funil, a recontextualização acontece em dois lugares. Na Secretaria Municipal de Educação, a política nacional é lida e convertida em planos, formações e orientações para escolas situadas em localidades diferentes; na escola, essas orientações e o próprio texto da lei são lidos de novo, por profissionais com trajetórias e condições próprias. Tratamos a Secretaria como parte do contexto da prática em sua escala municipal, onde a política é interpretada antes de chegar às escolas, e, ao mesmo tempo, como fonte da dimensão externa do contexto da escola, nos termos de Ball, Maguire e Braun (2016). A pergunta sobre a diversidade do território acompanha os dois lugares: na rede, se os documentos e as orientações diferenciam as localidades, as escolas do campo e a escola da comunidade quilombola, para a qual há diretrizes próprias (BRASIL, 2012); na escola, como as condições de Pipa entram na tradução da política.</w:t>
       </w:r>
     </w:p>
     <w:p>
@@ -1749,14 +1627,28 @@
           <w:rFonts w:ascii="Times New Roman" w:hAnsi="Times New Roman"/>
           <w:sz w:val="24"/>
         </w:rPr>
-        <w:t xml:space="preserve">Com a recontextualização, podemos observar como os profissionais relacionam as orientações da PNED às condições da instituição, aos materiais disponíveis e ao território, e como fazem escolhas, adaptações e negociações diante das exigências da política. Em termos mais diretos, recontextualização é o processo pelo qual uma política ganha sentidos particulares ao encontrar pessoas, instituições, recursos, limites e possibilidades de um lugar determinado. </w:t>
-      </w:r>
-      <w:r>
-        <w:rPr>
-          <w:rFonts w:ascii="Times New Roman" w:hAnsi="Times New Roman"/>
-          <w:sz w:val="24"/>
-        </w:rPr>
-        <w:t>Para Ball, Maguire e Braun (2016), esse processo é coletivo e limitado, feito com os recursos e as pessoas que cada escola tem</w:t>
+        <w:t xml:space="preserve">Da articulação entre a ACP e a </w:t>
+      </w:r>
+      <w:r>
+        <w:rPr>
+          <w:rFonts w:ascii="Times New Roman" w:hAnsi="Times New Roman"/>
+          <w:sz w:val="24"/>
+        </w:rPr>
+        <w:t>teoria da atuação</w:t>
+      </w:r>
+      <w:r>
+        <w:rPr>
+          <w:rFonts w:ascii="Times New Roman" w:hAnsi="Times New Roman"/>
+          <w:sz w:val="24"/>
+        </w:rPr>
+        <w:t xml:space="preserve"> construímos a categoria integradora da tese, a recontextualização. Ela reúne a compreensão da política como processo interpretativo, vinda da ACP, e a </w:t>
+      </w:r>
+      <w:r>
+        <w:rPr>
+          <w:rFonts w:ascii="Times New Roman" w:hAnsi="Times New Roman"/>
+          <w:sz w:val="24"/>
+        </w:rPr>
+        <w:t>atenção da teoria da atuação às dimensões do contexto e às respostas dos profissionais, que podem ir da adesão à resistência</w:t>
       </w:r>
       <w:r>
         <w:rPr>
@@ -1777,28 +1669,21 @@
           <w:rFonts w:ascii="Times New Roman" w:hAnsi="Times New Roman"/>
           <w:sz w:val="24"/>
         </w:rPr>
-        <w:t xml:space="preserve">Na análise, olharemos para as razões e as mediações que dão sentido às decisões, sem classificá-las como adequadas ou inadequadas. </w:t>
-      </w:r>
-      <w:r>
-        <w:rPr>
-          <w:rFonts w:ascii="Times New Roman" w:hAnsi="Times New Roman"/>
-          <w:sz w:val="24"/>
-        </w:rPr>
-        <w:t xml:space="preserve">Quando faltam infraestrutura e tempo, alguém decide prioridades, adaptações e renúncias, e essas escolhas diárias podem revelar diferentes formas de </w:t>
-      </w:r>
-      <w:r>
-        <w:rPr>
-          <w:rFonts w:ascii="Times New Roman" w:hAnsi="Times New Roman"/>
-          <w:sz w:val="24"/>
-        </w:rPr>
-        <w:t>encenação</w:t>
-      </w:r>
-      <w:r>
-        <w:rPr>
-          <w:rFonts w:ascii="Times New Roman" w:hAnsi="Times New Roman"/>
-          <w:sz w:val="24"/>
-        </w:rPr>
-        <w:t xml:space="preserve"> da política na escola. Tratá-las como simples instinto de sobrevivência diante da precariedade apagaria o juízo profissional presente nelas.</w:t>
+        <w:t xml:space="preserve">Com a recontextualização, podemos observar como os profissionais relacionam as orientações da PNED às condições da instituição, aos materiais disponíveis e ao território, e como fazem escolhas, adaptações e negociações diante das exigências da política. Em termos mais diretos, recontextualização é o processo pelo qual uma política ganha sentidos particulares ao encontrar pessoas, instituições, recursos, limites e possibilidades de um lugar determinado. </w:t>
+      </w:r>
+      <w:r>
+        <w:rPr>
+          <w:rFonts w:ascii="Times New Roman" w:hAnsi="Times New Roman"/>
+          <w:sz w:val="24"/>
+        </w:rPr>
+        <w:t>Para Ball, Maguire e Braun (2016), esse processo é coletivo e limitado, feito com os recursos e as pessoas que cada escola tem</w:t>
+      </w:r>
+      <w:r>
+        <w:rPr>
+          <w:rFonts w:ascii="Times New Roman" w:hAnsi="Times New Roman"/>
+          <w:sz w:val="24"/>
+        </w:rPr>
+        <w:t>.</w:t>
       </w:r>
     </w:p>
     <w:p>
@@ -1812,7 +1697,28 @@
           <w:rFonts w:ascii="Times New Roman" w:hAnsi="Times New Roman"/>
           <w:sz w:val="24"/>
         </w:rPr>
-        <w:t>A recontextualização orienta também a leitura conjunta das fontes, das prescrições institucionais às condições documentadas e às narrativas. Quando uma fonte contradisser outra, perguntaremos o motivo. Há nisso uma escolha ética: as dificuldades encontradas serão lidas pelas mediações institucionais e territoriais que condicionam a política no município, sem serem debitadas na conta de cada profissional.</w:t>
+        <w:t xml:space="preserve">Na análise, olharemos para as razões e as mediações que dão sentido às decisões, sem classificá-las como adequadas ou inadequadas. </w:t>
+      </w:r>
+      <w:r>
+        <w:rPr>
+          <w:rFonts w:ascii="Times New Roman" w:hAnsi="Times New Roman"/>
+          <w:sz w:val="24"/>
+        </w:rPr>
+        <w:t xml:space="preserve">Quando faltam infraestrutura e tempo, alguém decide prioridades, adaptações e renúncias, e essas escolhas diárias podem revelar diferentes formas de </w:t>
+      </w:r>
+      <w:r>
+        <w:rPr>
+          <w:rFonts w:ascii="Times New Roman" w:hAnsi="Times New Roman"/>
+          <w:sz w:val="24"/>
+        </w:rPr>
+        <w:t>encenação</w:t>
+      </w:r>
+      <w:r>
+        <w:rPr>
+          <w:rFonts w:ascii="Times New Roman" w:hAnsi="Times New Roman"/>
+          <w:sz w:val="24"/>
+        </w:rPr>
+        <w:t xml:space="preserve"> da política na escola. Tratá-las como simples instinto de sobrevivência diante da precariedade apagaria o juízo profissional presente nelas.</w:t>
       </w:r>
     </w:p>
     <w:p>
@@ -1826,7 +1732,7 @@
           <w:rFonts w:ascii="Times New Roman" w:hAnsi="Times New Roman"/>
           <w:sz w:val="24"/>
         </w:rPr>
-        <w:t>4.3.1 Culturas profissionais, performatividade e formas de atuação: a tese de partida e seus critérios</w:t>
+        <w:t>A recontextualização orienta também a leitura conjunta das fontes, das prescrições institucionais às condições documentadas e às narrativas. Quando uma fonte contradisser outra, perguntaremos o motivo. Há nisso uma escolha ética: as dificuldades encontradas serão lidas pelas mediações institucionais e territoriais que condicionam a política no município, sem serem debitadas na conta de cada profissional.</w:t>
       </w:r>
     </w:p>
     <w:p>
@@ -1840,7 +1746,7 @@
           <w:rFonts w:ascii="Times New Roman" w:hAnsi="Times New Roman"/>
           <w:sz w:val="24"/>
         </w:rPr>
-        <w:t xml:space="preserve">Antes de apresentar a tese de partida, um exemplo ajuda. Imaginemos uma escola que precisa mostrar à rede que trabalha educação digital com as turmas dos anos iniciais. Numa sala com computadores e conexão, a professora, com a coordenação, escolhe como fazê-lo. Numa sala sem dispositivo algum, ela pode deixar o tema de lado, transformá-lo em atividade desplugada ligada à vida da turma, recorrer ao próprio celular ou registrar no planejamento uma atividade que não aconteceu como descrita. O que pesa em cada uma dessas escolhas?</w:t>
+        <w:t>4.3.1 Culturas profissionais, performatividade e formas de atuação: a tese de partida e seus critérios</w:t>
       </w:r>
     </w:p>
     <w:p>
@@ -1854,7 +1760,7 @@
           <w:rFonts w:ascii="Times New Roman" w:hAnsi="Times New Roman"/>
           <w:sz w:val="24"/>
         </w:rPr>
-        <w:t>A tese de partida é que a PNED chega à escola como um conjunto de orientações que precisa ser lido e interpretado por quem trabalha nela, e que a forma assumida pela política no cotidiano escolar resulta da relação entre o que ela prescreve e as condições sob as quais os profissionais precisam atuar, atravessadas pelas condições materiais e institucionais, pelas culturas profissionais e pelo território. Essa compreensão não antecipa conclusões e se apoia no desenho da lei, examinado no Capítulo 5: o eixo de inclusão digital, no qual se inclui a conectividade das escolas, deve ser desenvolvido dentro dos limites orçamentários e da competência de cada órgão envolvido (BRASIL, 2023, art. 2º), e entre as fontes de recursos não há fundo próprio nem transferência obrigatória aos municípios (BRASIL, 2023, art. 11). Quando a política declara um direito, distribui entre os entes a provisão das condições e não garante sua chegada à escola, os profissionais precisam decidir o que fazer com a distância. Se parte dessa distância for coberta com meios próprios, o achado será lido como custo transferido pelo desenho da política e assumido por alguém em lugar do Estado, retirado do próprio bolso, do próprio celular ou do próprio tempo de descanso.</w:t>
+        <w:t xml:space="preserve">Antes de apresentar a tese de partida, um exemplo ajuda. Imaginemos uma escola que precisa mostrar à rede que trabalha educação digital com as turmas dos anos iniciais. Numa sala com computadores e conexão, a professora, com a coordenação, escolhe como fazê-lo. Numa sala sem dispositivo algum, ela pode deixar o tema de lado, transformá-lo em atividade desplugada ligada à vida da turma, recorrer ao próprio celular ou registrar no planejamento uma atividade que não aconteceu como descrita. O que pesa em cada uma dessas escolhas?</w:t>
       </w:r>
     </w:p>
     <w:p>
@@ -1868,77 +1774,7 @@
           <w:rFonts w:ascii="Times New Roman" w:hAnsi="Times New Roman"/>
           <w:sz w:val="24"/>
         </w:rPr>
-        <w:t>A tese de partida reúne duas lentes que, isoladas, deixam parte do fenômeno sem explicação</w:t>
-      </w:r>
-      <w:r>
-        <w:rPr>
-          <w:rFonts w:ascii="Times New Roman" w:hAnsi="Times New Roman"/>
-          <w:sz w:val="24"/>
-        </w:rPr>
-        <w:t xml:space="preserve">. A ACP mostra a reinterpretação da política na escola e reconhece, desde sua formulação, o peso da matéria, pois as políticas </w:t>
-      </w:r>
-      <w:r>
-        <w:rPr>
-          <w:rFonts w:ascii="Times New Roman" w:hAnsi="Times New Roman"/>
-          <w:sz w:val="24"/>
-        </w:rPr>
-        <w:t>também carregam</w:t>
-      </w:r>
-      <w:r>
-        <w:rPr>
-          <w:rFonts w:ascii="Times New Roman" w:hAnsi="Times New Roman"/>
-          <w:sz w:val="24"/>
-        </w:rPr>
-        <w:t xml:space="preserve"> restrições e possibilidades materiais</w:t>
-      </w:r>
-      <w:r>
-        <w:rPr>
-          <w:rFonts w:ascii="Times New Roman" w:hAnsi="Times New Roman"/>
-          <w:sz w:val="24"/>
-        </w:rPr>
-        <w:t xml:space="preserve"> (BOWE; BALL; GOLD, 1992</w:t>
-      </w:r>
-      <w:r>
-        <w:rPr>
-          <w:rFonts w:ascii="Times New Roman" w:hAnsi="Times New Roman"/>
-          <w:sz w:val="24"/>
-        </w:rPr>
-        <w:t>). A teoria da atuação acrescenta as culturas profissionais e as pressões externas, mas foi construída a partir de escolas inglesas nas quais os meios existiam, ainda que de forma desigual</w:t>
-      </w:r>
-      <w:r>
-        <w:rPr>
-          <w:rFonts w:ascii="Times New Roman" w:hAnsi="Times New Roman"/>
-          <w:sz w:val="24"/>
-        </w:rPr>
-        <w:t>. Numa escola pequena de um distrito como Pipa, quem decide reencontra na rua as famílias atingidas pela decisão</w:t>
-      </w:r>
-      <w:r>
-        <w:rPr>
-          <w:rFonts w:ascii="Times New Roman" w:hAnsi="Times New Roman"/>
-          <w:sz w:val="24"/>
-        </w:rPr>
-        <w:t>, e</w:t>
-      </w:r>
-      <w:r>
-        <w:rPr>
-          <w:rFonts w:ascii="Times New Roman" w:hAnsi="Times New Roman"/>
-          <w:sz w:val="24"/>
-        </w:rPr>
-        <w:t xml:space="preserve"> a condição anunciada, seja o equipamento, a conexão ou a formação, </w:t>
-      </w:r>
-      <w:r>
-        <w:rPr>
-          <w:rFonts w:ascii="Times New Roman" w:hAnsi="Times New Roman"/>
-          <w:sz w:val="24"/>
-        </w:rPr>
-        <w:t>pode simplesmente não chegar</w:t>
-      </w:r>
-      <w:r>
-        <w:rPr>
-          <w:rFonts w:ascii="Times New Roman" w:hAnsi="Times New Roman"/>
-          <w:sz w:val="24"/>
-        </w:rPr>
-        <w:t>. A leitura do território, desenvolvida no Capítulo 6, situa essa ausência em um lugar determinado, onde ela se soma a desigualdades anteriores à política.</w:t>
+        <w:t>A tese de partida é que a PNED chega à escola como um conjunto de orientações que precisa ser lido e interpretado por quem trabalha nela, e que a forma assumida pela política no cotidiano escolar resulta da relação entre o que ela prescreve e as condições sob as quais os profissionais precisam atuar, atravessadas pelas condições materiais e institucionais, pelas culturas profissionais e pelo território. Essa compreensão não antecipa conclusões e se apoia no desenho da lei, examinado no Capítulo 5: o eixo de inclusão digital, no qual se inclui a conectividade das escolas, deve ser desenvolvido dentro dos limites orçamentários e da competência de cada órgão envolvido (BRASIL, 2023, art. 2º), e entre as fontes de recursos não há fundo próprio nem transferência obrigatória aos municípios (BRASIL, 2023, art. 11). Quando a política declara um direito, distribui entre os entes a provisão das condições e não garante sua chegada à escola, os profissionais precisam decidir o que fazer com a distância. Se parte dessa distância for coberta com meios próprios, o achado será lido como custo transferido pelo desenho da política e assumido por alguém em lugar do Estado, retirado do próprio bolso, do próprio celular ou do próprio tempo de descanso.</w:t>
       </w:r>
     </w:p>
     <w:p>
@@ -1952,77 +1788,77 @@
           <w:rFonts w:ascii="Times New Roman" w:hAnsi="Times New Roman"/>
           <w:sz w:val="24"/>
         </w:rPr>
-        <w:t>As</w:t>
-      </w:r>
-      <w:r>
-        <w:rPr>
-          <w:rFonts w:ascii="Times New Roman" w:hAnsi="Times New Roman"/>
-          <w:sz w:val="24"/>
-        </w:rPr>
-        <w:t xml:space="preserve"> formulações apresentadas na Introdução não têm o mesmo estatuto. Habitar</w:t>
-      </w:r>
-      <w:r>
-        <w:rPr>
-          <w:rFonts w:ascii="Times New Roman" w:hAnsi="Times New Roman"/>
-          <w:sz w:val="24"/>
-        </w:rPr>
-        <w:t xml:space="preserve"> o</w:t>
-      </w:r>
-      <w:r>
-        <w:rPr>
-          <w:rFonts w:ascii="Times New Roman" w:hAnsi="Times New Roman"/>
-          <w:sz w:val="24"/>
-        </w:rPr>
-        <w:t xml:space="preserve"> digital e rugosidade tecnológica nomeiam condições do contexto, documentadas no Capítulo 6 com o registro iconográfico e o acervo histórico do distrito e a serem completadas pela análise documental, ainda não realizada</w:t>
-      </w:r>
-      <w:r>
-        <w:rPr>
-          <w:rFonts w:ascii="Times New Roman" w:hAnsi="Times New Roman"/>
-          <w:sz w:val="24"/>
-        </w:rPr>
-        <w:t>; o vazio material nomeia uma condição inscrita no texto da lei, examinada no Capítulo 5. As formas de atuação dos profissionais dizem respeito à ação</w:t>
-      </w:r>
-      <w:r>
-        <w:rPr>
-          <w:rFonts w:ascii="Times New Roman" w:hAnsi="Times New Roman"/>
-          <w:sz w:val="24"/>
-        </w:rPr>
-        <w:t xml:space="preserve">, e somente as narrativas podem </w:t>
-      </w:r>
-      <w:r>
-        <w:rPr>
-          <w:rFonts w:ascii="Times New Roman" w:hAnsi="Times New Roman"/>
-          <w:sz w:val="24"/>
-        </w:rPr>
-        <w:t>mostrá-las</w:t>
-      </w:r>
-      <w:r>
-        <w:rPr>
-          <w:rFonts w:ascii="Times New Roman" w:hAnsi="Times New Roman"/>
-          <w:sz w:val="24"/>
-        </w:rPr>
-        <w:t xml:space="preserve">, com os critérios fixados nesta subseção. As</w:t>
-      </w:r>
-      <w:r>
-        <w:rPr>
-          <w:rFonts w:ascii="Times New Roman" w:hAnsi="Times New Roman"/>
-          <w:sz w:val="24"/>
-        </w:rPr>
-        <w:t xml:space="preserve"> condições chegam ao Capítulo 7 como condições documentadas; </w:t>
-      </w:r>
-      <w:r>
-        <w:rPr>
-          <w:rFonts w:ascii="Times New Roman" w:hAnsi="Times New Roman"/>
-          <w:sz w:val="24"/>
-        </w:rPr>
-        <w:t>as formas de atuação, como pergunta</w:t>
-      </w:r>
-      <w:r>
-        <w:rPr>
-          <w:rFonts w:ascii="Times New Roman" w:hAnsi="Times New Roman"/>
-          <w:sz w:val="24"/>
-        </w:rPr>
-        <w:t>.</w:t>
+        <w:t>A tese de partida reúne duas lentes que, isoladas, deixam parte do fenômeno sem explicação</w:t>
+      </w:r>
+      <w:r>
+        <w:rPr>
+          <w:rFonts w:ascii="Times New Roman" w:hAnsi="Times New Roman"/>
+          <w:sz w:val="24"/>
+        </w:rPr>
+        <w:t xml:space="preserve">. A ACP mostra a reinterpretação da política na escola e reconhece, desde sua formulação, o peso da matéria, pois as políticas </w:t>
+      </w:r>
+      <w:r>
+        <w:rPr>
+          <w:rFonts w:ascii="Times New Roman" w:hAnsi="Times New Roman"/>
+          <w:sz w:val="24"/>
+        </w:rPr>
+        <w:t>também carregam</w:t>
+      </w:r>
+      <w:r>
+        <w:rPr>
+          <w:rFonts w:ascii="Times New Roman" w:hAnsi="Times New Roman"/>
+          <w:sz w:val="24"/>
+        </w:rPr>
+        <w:t xml:space="preserve"> restrições e possibilidades materiais</w:t>
+      </w:r>
+      <w:r>
+        <w:rPr>
+          <w:rFonts w:ascii="Times New Roman" w:hAnsi="Times New Roman"/>
+          <w:sz w:val="24"/>
+        </w:rPr>
+        <w:t xml:space="preserve"> (BOWE; BALL; GOLD, 1992</w:t>
+      </w:r>
+      <w:r>
+        <w:rPr>
+          <w:rFonts w:ascii="Times New Roman" w:hAnsi="Times New Roman"/>
+          <w:sz w:val="24"/>
+        </w:rPr>
+        <w:t>). A teoria da atuação acrescenta as culturas profissionais e as pressões externas, mas foi construída a partir de escolas inglesas nas quais os meios existiam, ainda que de forma desigual</w:t>
+      </w:r>
+      <w:r>
+        <w:rPr>
+          <w:rFonts w:ascii="Times New Roman" w:hAnsi="Times New Roman"/>
+          <w:sz w:val="24"/>
+        </w:rPr>
+        <w:t>. Numa escola pequena de uma localidade como Pipa, quem decide reencontra na rua as famílias atingidas pela decisão</w:t>
+      </w:r>
+      <w:r>
+        <w:rPr>
+          <w:rFonts w:ascii="Times New Roman" w:hAnsi="Times New Roman"/>
+          <w:sz w:val="24"/>
+        </w:rPr>
+        <w:t>, e</w:t>
+      </w:r>
+      <w:r>
+        <w:rPr>
+          <w:rFonts w:ascii="Times New Roman" w:hAnsi="Times New Roman"/>
+          <w:sz w:val="24"/>
+        </w:rPr>
+        <w:t xml:space="preserve"> a condição anunciada, seja o equipamento, a conexão ou a formação, </w:t>
+      </w:r>
+      <w:r>
+        <w:rPr>
+          <w:rFonts w:ascii="Times New Roman" w:hAnsi="Times New Roman"/>
+          <w:sz w:val="24"/>
+        </w:rPr>
+        <w:t>pode simplesmente não chegar</w:t>
+      </w:r>
+      <w:r>
+        <w:rPr>
+          <w:rFonts w:ascii="Times New Roman" w:hAnsi="Times New Roman"/>
+          <w:sz w:val="24"/>
+        </w:rPr>
+        <w:t>. A leitura do território, desenvolvida no Capítulo 6, situa essa ausência em um lugar determinado, onde ela se soma a desigualdades anteriores à política.</w:t>
       </w:r>
     </w:p>
     <w:p>
@@ -2036,7 +1872,77 @@
           <w:rFonts w:ascii="Times New Roman" w:hAnsi="Times New Roman"/>
           <w:sz w:val="24"/>
         </w:rPr>
-        <w:t xml:space="preserve">As categorias de análise funcionam como lentes de leitura, abertas ao que o material trouxer. Seus critérios foram registrados antes da primeira entrevista e não serão alterados depois dela; qualquer mudança exigirá novo registro, datado e justificado. A análise fará o mapeamento da recontextualização, isto é, identificará nas narrativas e nos documentos as formas de atuação produzidas diante das orientações da PNED, sem pressupor a predominância de nenhuma. Algumas já têm nome na literatura. Na adesão, a orientação é assumida como própria; na acomodação, é cumprida com os meios disponíveis, sem que a escola a faça sua; na adaptação e na negociação, é ajustada às condições da turma ou discutida entre os profissionais. Na omissão seletiva, partes da orientação ficam fora do planejamento e da prática, e o relato indica por quê, seja por serem inexequíveis, seja por não fazerem sentido para a turma. Na tradução para fins locais, a orientação é refeita para servir à turma e à comunidade, como um trabalho de direitos digitais ligado à exposição da imagem das crianças num distrito turístico, e pode ganhar caráter de ressignificação. A resistência aparece quando a orientação é recusada ou contestada, de forma aberta ou não. Com Foucault, ela é lida como parte das relações de poder que a política mobiliza, já que essas relações “não são unívocas; definem inúmeros pontos de luta, focos de instabilidade comportando cada um seus riscos de conflito, de lutas e de inversão pelo menos transitória da relação de forças” (FOUCAULT, 1999, p. 29). A fabricação performativa (BALL, 2002) reúne registros, evidências ou relatórios produzidos para responder às cobranças, que não correspondem ao que aconteceu com as crianças ou que encobrem a falta dos meios. O uso de meios próprios para suprir uma condição ausente será registrado à parte, como tática material que pode acompanhar qualquer dessas formas. Outras que surgirem do material serão incorporadas à análise.</w:t>
+        <w:t>As</w:t>
+      </w:r>
+      <w:r>
+        <w:rPr>
+          <w:rFonts w:ascii="Times New Roman" w:hAnsi="Times New Roman"/>
+          <w:sz w:val="24"/>
+        </w:rPr>
+        <w:t xml:space="preserve"> formulações apresentadas na Introdução não têm o mesmo estatuto. Habitar</w:t>
+      </w:r>
+      <w:r>
+        <w:rPr>
+          <w:rFonts w:ascii="Times New Roman" w:hAnsi="Times New Roman"/>
+          <w:sz w:val="24"/>
+        </w:rPr>
+        <w:t xml:space="preserve"> o</w:t>
+      </w:r>
+      <w:r>
+        <w:rPr>
+          <w:rFonts w:ascii="Times New Roman" w:hAnsi="Times New Roman"/>
+          <w:sz w:val="24"/>
+        </w:rPr>
+        <w:t xml:space="preserve"> digital e rugosidade tecnológica nomeiam condições do contexto, documentadas no Capítulo 6 com o registro iconográfico e o acervo histórico de Pipa e a serem completadas pela análise documental, ainda não realizada</w:t>
+      </w:r>
+      <w:r>
+        <w:rPr>
+          <w:rFonts w:ascii="Times New Roman" w:hAnsi="Times New Roman"/>
+          <w:sz w:val="24"/>
+        </w:rPr>
+        <w:t>; o vazio material nomeia uma condição inscrita no texto da lei, examinada no Capítulo 5. As formas de atuação dos profissionais dizem respeito à ação</w:t>
+      </w:r>
+      <w:r>
+        <w:rPr>
+          <w:rFonts w:ascii="Times New Roman" w:hAnsi="Times New Roman"/>
+          <w:sz w:val="24"/>
+        </w:rPr>
+        <w:t xml:space="preserve">, e somente as narrativas podem </w:t>
+      </w:r>
+      <w:r>
+        <w:rPr>
+          <w:rFonts w:ascii="Times New Roman" w:hAnsi="Times New Roman"/>
+          <w:sz w:val="24"/>
+        </w:rPr>
+        <w:t>mostrá-las</w:t>
+      </w:r>
+      <w:r>
+        <w:rPr>
+          <w:rFonts w:ascii="Times New Roman" w:hAnsi="Times New Roman"/>
+          <w:sz w:val="24"/>
+        </w:rPr>
+        <w:t xml:space="preserve">, com os critérios fixados nesta subseção. As</w:t>
+      </w:r>
+      <w:r>
+        <w:rPr>
+          <w:rFonts w:ascii="Times New Roman" w:hAnsi="Times New Roman"/>
+          <w:sz w:val="24"/>
+        </w:rPr>
+        <w:t xml:space="preserve"> condições chegam ao Capítulo 7 como condições documentadas; </w:t>
+      </w:r>
+      <w:r>
+        <w:rPr>
+          <w:rFonts w:ascii="Times New Roman" w:hAnsi="Times New Roman"/>
+          <w:sz w:val="24"/>
+        </w:rPr>
+        <w:t>as formas de atuação, como pergunta</w:t>
+      </w:r>
+      <w:r>
+        <w:rPr>
+          <w:rFonts w:ascii="Times New Roman" w:hAnsi="Times New Roman"/>
+          <w:sz w:val="24"/>
+        </w:rPr>
+        <w:t>.</w:t>
       </w:r>
     </w:p>
     <w:p>
@@ -2050,70 +1956,7 @@
           <w:rFonts w:ascii="Times New Roman" w:hAnsi="Times New Roman"/>
           <w:sz w:val="24"/>
         </w:rPr>
-        <w:t>A</w:t>
-      </w:r>
-      <w:r>
-        <w:rPr>
-          <w:rFonts w:ascii="Times New Roman" w:hAnsi="Times New Roman"/>
-          <w:sz w:val="24"/>
-        </w:rPr>
-        <w:t xml:space="preserve"> formação exige atenção à parte. A PNED inclui entre as estratégias do eixo a formação inicial de professores em competências digitais e a presença das tecnologias na formação continuada (BRASIL, 2023, art. 3º, § 1º, IX e X). Essas estratégias aparecem como ações de promoção, e o próprio dispositivo não define responsáveis, prazos, carga horária nem fontes de custeio. Somente em 2025, mais de dois anos depois da lei, a Resolução CNE/CEB nº 2/2025 determinou a elaboração dos novos currículos, acompanhados de plano de formação docente, ao longo daquele ano (BRASIL, 2025, art. 36). Enquanto isso, a exigência curricular já estava posta. Se a formação não chega e a exigência continua, o próprio conhecimento se torna condição ausente. </w:t>
-      </w:r>
-      <w:r>
-        <w:rPr>
-          <w:rFonts w:ascii="Times New Roman" w:hAnsi="Times New Roman"/>
-          <w:sz w:val="24"/>
-        </w:rPr>
-        <w:t>O</w:t>
-      </w:r>
-      <w:r>
-        <w:rPr>
-          <w:rFonts w:ascii="Times New Roman" w:hAnsi="Times New Roman"/>
-          <w:sz w:val="24"/>
-        </w:rPr>
-        <w:t xml:space="preserve"> profissional aprende por conta própria, no tempo retirado da jornada, ou ensina o que já domina, e o eixo se reduz a esse repertório. Aprender </w:t>
-      </w:r>
-      <w:r>
-        <w:rPr>
-          <w:rFonts w:ascii="Times New Roman" w:hAnsi="Times New Roman"/>
-          <w:sz w:val="24"/>
-        </w:rPr>
-        <w:t>sozinho é uma forma de suprir a condição ausente</w:t>
-      </w:r>
-      <w:r>
-        <w:rPr>
-          <w:rFonts w:ascii="Times New Roman" w:hAnsi="Times New Roman"/>
-          <w:sz w:val="24"/>
-        </w:rPr>
-        <w:t xml:space="preserve">. Ensinar o que já domina </w:t>
-      </w:r>
-      <w:r>
-        <w:rPr>
-          <w:rFonts w:ascii="Times New Roman" w:hAnsi="Times New Roman"/>
-          <w:sz w:val="24"/>
-        </w:rPr>
-        <w:t>pode corresponder a uma omissão seletiva</w:t>
-      </w:r>
-      <w:r>
-        <w:rPr>
-          <w:rFonts w:ascii="Times New Roman" w:hAnsi="Times New Roman"/>
-          <w:sz w:val="24"/>
-        </w:rPr>
-        <w:t xml:space="preserve">, mas a restrição também pode resultar de escolha pedagógica sem relação com a ausência. Não avaliamos o saber </w:t>
-      </w:r>
-      <w:r>
-        <w:rPr>
-          <w:rFonts w:ascii="Times New Roman" w:hAnsi="Times New Roman"/>
-          <w:sz w:val="24"/>
-        </w:rPr>
-        <w:t>dos</w:t>
-      </w:r>
-      <w:r>
-        <w:rPr>
-          <w:rFonts w:ascii="Times New Roman" w:hAnsi="Times New Roman"/>
-          <w:sz w:val="24"/>
-        </w:rPr>
-        <w:t xml:space="preserve"> profissionais nem a qualidade das formações recebidas; examinamos a formação oferecida pela política e o momento de sua oferta.</w:t>
+        <w:t>As categorias de análise funcionam como lentes de leitura, abertas ao que o material trouxer. Seus critérios foram registrados antes da primeira entrevista e não serão alterados depois dela; qualquer mudança exigirá novo registro, datado e justificado. A análise fará o mapeamento da recontextualização, isto é, identificará nas narrativas e nos documentos as formas de atuação produzidas diante das orientações da PNED, sem pressupor a predominância de nenhuma. Algumas já têm nome na literatura. Na adesão, a orientação é assumida como própria; na acomodação, é cumprida com os meios disponíveis, sem que a escola a faça sua; na adaptação e na negociação, é ajustada às condições da turma ou discutida entre os profissionais. Na omissão seletiva, partes da orientação ficam fora do planejamento e da prática, e o relato indica por quê, seja por serem inexequíveis, seja por não fazerem sentido para a turma. Na tradução para fins locais, a orientação é refeita para servir à turma e à comunidade, como um trabalho de direitos digitais ligado à exposição da imagem das crianças numa localidade turística, e pode ganhar caráter de ressignificação. A resistência aparece quando a orientação é recusada ou contestada, de forma aberta ou não. Com Foucault, ela é lida como parte das relações de poder que a política mobiliza, já que essas relações “não são unívocas; definem inúmeros pontos de luta, focos de instabilidade comportando cada um seus riscos de conflito, de lutas e de inversão pelo menos transitória da relação de forças” (FOUCAULT, 1999, p. 29). A fabricação performativa (BALL, 2002) reúne registros, evidências ou relatórios produzidos para responder às cobranças, que não correspondem ao que aconteceu com as crianças ou que encobrem a falta dos meios. O uso de meios próprios para suprir uma condição ausente será registrado à parte, como tática material que pode acompanhar qualquer dessas formas. Outras que surgirem do material serão incorporadas à análise.</w:t>
       </w:r>
     </w:p>
     <w:p>
@@ -2127,49 +1970,70 @@
           <w:rFonts w:ascii="Times New Roman" w:hAnsi="Times New Roman"/>
           <w:sz w:val="24"/>
         </w:rPr>
-        <w:t xml:space="preserve">Pela regra fixada na seção 4.1, não deduziremos da trajetória da pesquisadora na rede as datas dessas ações formativas. A </w:t>
-      </w:r>
-      <w:r>
-        <w:rPr>
-          <w:rFonts w:ascii="Times New Roman" w:hAnsi="Times New Roman"/>
-          <w:sz w:val="24"/>
-        </w:rPr>
-        <w:t>suposição</w:t>
-      </w:r>
-      <w:r>
-        <w:rPr>
-          <w:rFonts w:ascii="Times New Roman" w:hAnsi="Times New Roman"/>
-          <w:sz w:val="24"/>
-        </w:rPr>
-        <w:t xml:space="preserve"> de que elas só agora começam a chegar à escola será conferida em três fontes: os registros de formação da Secretaria Municipal de Educação; as respostas ao Bloco 2 do questionário, sobre a oferta, o ano, a instituição ofertante, os conteúdos e a periodicidade das formações; e as perguntas do primeiro eixo da entrevista sobre o modo de aprender a usar ferramentas digitais no trabalho. A existência de formação não afasta, por si, a ausência. A busca por conta própria só deixa de indicar ausência quando os registros mostrarem uma formação oferecida antes de o conteúdo ser exigido, que tenha alcançado o participante na função e na etapa em que atua e tratado dos conteúdos que ele diz ter buscado sozinho. Se a formação cumprir essas condições e, mesmo assim, o participante relatar sua insuficiência para o trabalho com a turma, o relato será registrado como insuficiência relatada. Ele só </w:t>
-      </w:r>
-      <w:r>
-        <w:rPr>
-          <w:rFonts w:ascii="Times New Roman" w:hAnsi="Times New Roman"/>
-          <w:sz w:val="24"/>
-        </w:rPr>
-        <w:t>será lido como falta de formação quando os registros</w:t>
-      </w:r>
-      <w:r>
-        <w:rPr>
-          <w:rFonts w:ascii="Times New Roman" w:hAnsi="Times New Roman"/>
-          <w:sz w:val="24"/>
-        </w:rPr>
-        <w:t xml:space="preserve"> o tornarem plausível, com decisão justificada por escrito. Também aqui examinamos a correspondência entre o oferecido e o exigido, conforme os </w:t>
-      </w:r>
-      <w:r>
-        <w:rPr>
-          <w:rFonts w:ascii="Times New Roman" w:hAnsi="Times New Roman"/>
-          <w:sz w:val="24"/>
-        </w:rPr>
-        <w:t>critérios registrados antes do campo</w:t>
-      </w:r>
-      <w:r>
-        <w:rPr>
-          <w:rFonts w:ascii="Times New Roman" w:hAnsi="Times New Roman"/>
-          <w:sz w:val="24"/>
-        </w:rPr>
-        <w:t>.</w:t>
+        <w:t>A</w:t>
+      </w:r>
+      <w:r>
+        <w:rPr>
+          <w:rFonts w:ascii="Times New Roman" w:hAnsi="Times New Roman"/>
+          <w:sz w:val="24"/>
+        </w:rPr>
+        <w:t xml:space="preserve"> formação exige atenção à parte. A PNED inclui entre as estratégias do eixo a formação inicial de professores em competências digitais e a presença das tecnologias na formação continuada (BRASIL, 2023, art. 3º, § 1º, IX e X). Essas estratégias aparecem como ações de promoção, e o próprio dispositivo não define responsáveis, prazos, carga horária nem fontes de custeio. Somente em 2025, mais de dois anos depois da lei, a Resolução CNE/CEB nº 2/2025 determinou a elaboração dos novos currículos, acompanhados de plano de formação docente, ao longo daquele ano (BRASIL, 2025, art. 36). Enquanto isso, a exigência curricular já estava posta. Se a formação não chega e a exigência continua, o próprio conhecimento se torna condição ausente. </w:t>
+      </w:r>
+      <w:r>
+        <w:rPr>
+          <w:rFonts w:ascii="Times New Roman" w:hAnsi="Times New Roman"/>
+          <w:sz w:val="24"/>
+        </w:rPr>
+        <w:t>O</w:t>
+      </w:r>
+      <w:r>
+        <w:rPr>
+          <w:rFonts w:ascii="Times New Roman" w:hAnsi="Times New Roman"/>
+          <w:sz w:val="24"/>
+        </w:rPr>
+        <w:t xml:space="preserve"> profissional aprende por conta própria, no tempo retirado da jornada, ou ensina o que já domina, e o eixo se reduz a esse repertório. Aprender </w:t>
+      </w:r>
+      <w:r>
+        <w:rPr>
+          <w:rFonts w:ascii="Times New Roman" w:hAnsi="Times New Roman"/>
+          <w:sz w:val="24"/>
+        </w:rPr>
+        <w:t>sozinho é uma forma de suprir a condição ausente</w:t>
+      </w:r>
+      <w:r>
+        <w:rPr>
+          <w:rFonts w:ascii="Times New Roman" w:hAnsi="Times New Roman"/>
+          <w:sz w:val="24"/>
+        </w:rPr>
+        <w:t xml:space="preserve">. Ensinar o que já domina </w:t>
+      </w:r>
+      <w:r>
+        <w:rPr>
+          <w:rFonts w:ascii="Times New Roman" w:hAnsi="Times New Roman"/>
+          <w:sz w:val="24"/>
+        </w:rPr>
+        <w:t>pode corresponder a uma omissão seletiva</w:t>
+      </w:r>
+      <w:r>
+        <w:rPr>
+          <w:rFonts w:ascii="Times New Roman" w:hAnsi="Times New Roman"/>
+          <w:sz w:val="24"/>
+        </w:rPr>
+        <w:t xml:space="preserve">, mas a restrição também pode resultar de escolha pedagógica sem relação com a ausência. Não avaliamos o saber </w:t>
+      </w:r>
+      <w:r>
+        <w:rPr>
+          <w:rFonts w:ascii="Times New Roman" w:hAnsi="Times New Roman"/>
+          <w:sz w:val="24"/>
+        </w:rPr>
+        <w:t>dos</w:t>
+      </w:r>
+      <w:r>
+        <w:rPr>
+          <w:rFonts w:ascii="Times New Roman" w:hAnsi="Times New Roman"/>
+          <w:sz w:val="24"/>
+        </w:rPr>
+        <w:t xml:space="preserve"> profissionais nem a qualidade das formações recebidas; examinamos a formação oferecida pela política e o momento de sua oferta.</w:t>
       </w:r>
     </w:p>
     <w:p>
@@ -2183,70 +2047,49 @@
           <w:rFonts w:ascii="Times New Roman" w:hAnsi="Times New Roman"/>
           <w:sz w:val="24"/>
         </w:rPr>
-        <w:t>Uma forma de atuação será registrada como achado quando</w:t>
-      </w:r>
-      <w:r>
-        <w:rPr>
-          <w:rFonts w:ascii="Times New Roman" w:hAnsi="Times New Roman"/>
-          <w:sz w:val="24"/>
-        </w:rPr>
-        <w:t xml:space="preserve"> aparecer de forma recorrente</w:t>
-      </w:r>
-      <w:r>
-        <w:rPr>
-          <w:rFonts w:ascii="Times New Roman" w:hAnsi="Times New Roman"/>
-          <w:sz w:val="24"/>
-        </w:rPr>
-        <w:t xml:space="preserve"> e</w:t>
-      </w:r>
-      <w:r>
-        <w:rPr>
-          <w:rFonts w:ascii="Times New Roman" w:hAnsi="Times New Roman"/>
-          <w:sz w:val="24"/>
-        </w:rPr>
-        <w:t xml:space="preserve"> sem indução pela pergunta, </w:t>
-      </w:r>
-      <w:r>
-        <w:rPr>
-          <w:rFonts w:ascii="Times New Roman" w:hAnsi="Times New Roman"/>
-          <w:sz w:val="24"/>
-        </w:rPr>
-        <w:t>e a análise buscará as condições a que ela se liga: o território, as culturas profissionais, a dimensão material, as pressões externas ou fatores de outra ordem</w:t>
-      </w:r>
-      <w:r>
-        <w:rPr>
-          <w:rFonts w:ascii="Times New Roman" w:hAnsi="Times New Roman"/>
-          <w:sz w:val="24"/>
-        </w:rPr>
-        <w:t>. Um episódio isolado indica contingência e não basta</w:t>
-      </w:r>
-      <w:r>
-        <w:rPr>
-          <w:rFonts w:ascii="Times New Roman" w:hAnsi="Times New Roman"/>
-          <w:sz w:val="24"/>
-        </w:rPr>
-        <w:t xml:space="preserve">. Os relatos surgidos apenas depois das perguntas diretas </w:t>
-      </w:r>
-      <w:r>
-        <w:rPr>
-          <w:rFonts w:ascii="Times New Roman" w:hAnsi="Times New Roman"/>
-          <w:sz w:val="24"/>
-        </w:rPr>
-        <w:t>dos Eixos 4 e 5</w:t>
-      </w:r>
-      <w:r>
-        <w:rPr>
-          <w:rFonts w:ascii="Times New Roman" w:hAnsi="Times New Roman"/>
-          <w:sz w:val="24"/>
-        </w:rPr>
-        <w:t xml:space="preserve"> do roteiro serão marcados como tal e só contarão</w:t>
-      </w:r>
-      <w:r>
-        <w:rPr>
-          <w:rFonts w:ascii="Times New Roman" w:hAnsi="Times New Roman"/>
-          <w:sz w:val="24"/>
-        </w:rPr>
-        <w:t xml:space="preserve"> se descreverem situação concreta e recorrente. Como nas demais inferências da tese, a ausência de uma condição, quando relatada, será conferida com o registro iconográfico e com os documentos de aquisição e de conectividade, conforme a triangulação descrita na seção 4.4.</w:t>
+        <w:t xml:space="preserve">Pela regra fixada na seção 4.1, não deduziremos da trajetória da pesquisadora na rede as datas dessas ações formativas. A </w:t>
+      </w:r>
+      <w:r>
+        <w:rPr>
+          <w:rFonts w:ascii="Times New Roman" w:hAnsi="Times New Roman"/>
+          <w:sz w:val="24"/>
+        </w:rPr>
+        <w:t>suposição</w:t>
+      </w:r>
+      <w:r>
+        <w:rPr>
+          <w:rFonts w:ascii="Times New Roman" w:hAnsi="Times New Roman"/>
+          <w:sz w:val="24"/>
+        </w:rPr>
+        <w:t xml:space="preserve"> de que elas só agora começam a chegar à escola será conferida em três fontes: os registros de formação da Secretaria Municipal de Educação; as respostas ao Bloco 2 do questionário, sobre a oferta, o ano, a instituição ofertante, os conteúdos e a periodicidade das formações; e as perguntas do primeiro eixo da entrevista sobre o modo de aprender a usar ferramentas digitais no trabalho. A existência de formação não afasta, por si, a ausência. A busca por conta própria só deixa de indicar ausência quando os registros mostrarem uma formação oferecida antes de o conteúdo ser exigido, que tenha alcançado o participante na função e na etapa em que atua e tratado dos conteúdos que ele diz ter buscado sozinho. Se a formação cumprir essas condições e, mesmo assim, o participante relatar sua insuficiência para o trabalho com a turma, o relato será registrado como insuficiência relatada. Ele só </w:t>
+      </w:r>
+      <w:r>
+        <w:rPr>
+          <w:rFonts w:ascii="Times New Roman" w:hAnsi="Times New Roman"/>
+          <w:sz w:val="24"/>
+        </w:rPr>
+        <w:t>será lido como falta de formação quando os registros</w:t>
+      </w:r>
+      <w:r>
+        <w:rPr>
+          <w:rFonts w:ascii="Times New Roman" w:hAnsi="Times New Roman"/>
+          <w:sz w:val="24"/>
+        </w:rPr>
+        <w:t xml:space="preserve"> o tornarem plausível, com decisão justificada por escrito. Também aqui examinamos a correspondência entre o oferecido e o exigido, conforme os </w:t>
+      </w:r>
+      <w:r>
+        <w:rPr>
+          <w:rFonts w:ascii="Times New Roman" w:hAnsi="Times New Roman"/>
+          <w:sz w:val="24"/>
+        </w:rPr>
+        <w:t>critérios registrados antes do campo</w:t>
+      </w:r>
+      <w:r>
+        <w:rPr>
+          <w:rFonts w:ascii="Times New Roman" w:hAnsi="Times New Roman"/>
+          <w:sz w:val="24"/>
+        </w:rPr>
+        <w:t>.</w:t>
       </w:r>
     </w:p>
     <w:p>
@@ -2260,7 +2103,70 @@
           <w:rFonts w:ascii="Times New Roman" w:hAnsi="Times New Roman"/>
           <w:sz w:val="24"/>
         </w:rPr>
-        <w:t>Nenhum resultado está excluído de antemão. Se as narrativas descreverem sobretudo adesão ou acomodação, esse será o achado. Se os profissionais descreverem a orientação da PNED como ambígua e o próprio trabalho como esforço de interpretá-la, a recontextualização da ACP já explicará o fenômeno. Se as formas de atuação não se ligarem ao território nem às culturas profissionais, a tese de partida será delimitada, e o capítulo de análise dirá em que medida. O exame tem também base material. Segundo informações preliminares, a verificar nos registros de aquisição, a escola dispõe de um kit multimídia composto por televisão, projetor e notebook, destinado a toda a escola, e a entrevista pergunta como se decide seu uso quando mais de uma turma precisa dele. Revezamento, agendamento disputado ou fila indicam a repartição de um recurso existente, que será analisada na dimensão material, sem ser confundida com as demais formas de atuação.</w:t>
+        <w:t>Uma forma de atuação será registrada como achado quando</w:t>
+      </w:r>
+      <w:r>
+        <w:rPr>
+          <w:rFonts w:ascii="Times New Roman" w:hAnsi="Times New Roman"/>
+          <w:sz w:val="24"/>
+        </w:rPr>
+        <w:t xml:space="preserve"> aparecer de forma recorrente</w:t>
+      </w:r>
+      <w:r>
+        <w:rPr>
+          <w:rFonts w:ascii="Times New Roman" w:hAnsi="Times New Roman"/>
+          <w:sz w:val="24"/>
+        </w:rPr>
+        <w:t xml:space="preserve"> e</w:t>
+      </w:r>
+      <w:r>
+        <w:rPr>
+          <w:rFonts w:ascii="Times New Roman" w:hAnsi="Times New Roman"/>
+          <w:sz w:val="24"/>
+        </w:rPr>
+        <w:t xml:space="preserve"> sem indução pela pergunta, </w:t>
+      </w:r>
+      <w:r>
+        <w:rPr>
+          <w:rFonts w:ascii="Times New Roman" w:hAnsi="Times New Roman"/>
+          <w:sz w:val="24"/>
+        </w:rPr>
+        <w:t>e a análise buscará as condições a que ela se liga: o território, as culturas profissionais, a dimensão material, as pressões externas ou fatores de outra ordem</w:t>
+      </w:r>
+      <w:r>
+        <w:rPr>
+          <w:rFonts w:ascii="Times New Roman" w:hAnsi="Times New Roman"/>
+          <w:sz w:val="24"/>
+        </w:rPr>
+        <w:t>. Um episódio isolado indica contingência e não basta</w:t>
+      </w:r>
+      <w:r>
+        <w:rPr>
+          <w:rFonts w:ascii="Times New Roman" w:hAnsi="Times New Roman"/>
+          <w:sz w:val="24"/>
+        </w:rPr>
+        <w:t xml:space="preserve">. Os relatos surgidos apenas depois das perguntas diretas </w:t>
+      </w:r>
+      <w:r>
+        <w:rPr>
+          <w:rFonts w:ascii="Times New Roman" w:hAnsi="Times New Roman"/>
+          <w:sz w:val="24"/>
+        </w:rPr>
+        <w:t>dos Eixos 4 e 5</w:t>
+      </w:r>
+      <w:r>
+        <w:rPr>
+          <w:rFonts w:ascii="Times New Roman" w:hAnsi="Times New Roman"/>
+          <w:sz w:val="24"/>
+        </w:rPr>
+        <w:t xml:space="preserve"> do roteiro serão marcados como tal e só contarão</w:t>
+      </w:r>
+      <w:r>
+        <w:rPr>
+          <w:rFonts w:ascii="Times New Roman" w:hAnsi="Times New Roman"/>
+          <w:sz w:val="24"/>
+        </w:rPr>
+        <w:t xml:space="preserve"> se descreverem situação concreta e recorrente. Como nas demais inferências da tese, a ausência de uma condição, quando relatada, será conferida com o registro iconográfico e com os documentos de aquisição e de conectividade, conforme a triangulação descrita na seção 4.4.</w:t>
       </w:r>
     </w:p>
     <w:p>
@@ -2274,7 +2180,7 @@
           <w:rFonts w:ascii="Times New Roman" w:hAnsi="Times New Roman"/>
           <w:sz w:val="24"/>
         </w:rPr>
-        <w:t xml:space="preserve">Algumas situações pedem cuidado. Se os profissionais afirmarem não haver alternativa, o quadro será nomeado como transferência de custo do Estado para o trabalhador, situação mais próxima da sobrevivência que da resistência. Essa distinção será examinada nas perguntas do Eixo 5 sobre o modo como o profissional entende as próprias decisões. Se as formas de atuação variarem conforme a posição institucional, na regência, no apoio à recomposição de aula, no apoio pedagógico, na coordenação ou na direção, essa variação será descrita como achado. A direção tem dois participantes, a coordenação, uma, e a Secretaria, um técnico, o que permite descrever essas posições sem generalizar sobre elas.</w:t>
+        <w:t>Nenhum resultado está excluído de antemão. Se as narrativas descreverem sobretudo adesão ou acomodação, esse será o achado. Se os profissionais descreverem a orientação da PNED como ambígua e o próprio trabalho como esforço de interpretá-la, a recontextualização da ACP já explicará o fenômeno. Se as formas de atuação não se ligarem ao território nem às culturas profissionais, a tese de partida será delimitada, e o capítulo de análise dirá em que medida. O exame tem também base material. Segundo informações preliminares, a verificar nos registros de aquisição, a escola dispõe de um kit multimídia composto por televisão, projetor e notebook, destinado a toda a escola, e a entrevista pergunta como se decide seu uso quando mais de uma turma precisa dele. Revezamento, agendamento disputado ou fila indicam a repartição de um recurso existente, que será analisada na dimensão material, sem ser confundida com as demais formas de atuação.</w:t>
       </w:r>
     </w:p>
     <w:p>
@@ -2288,91 +2194,7 @@
           <w:rFonts w:ascii="Times New Roman" w:hAnsi="Times New Roman"/>
           <w:sz w:val="24"/>
         </w:rPr>
-        <w:t xml:space="preserve">As consequências dessa transferência entram na análise como riscos, e cabe ao campo mostrar se ocorrem. Quando a realização de um direito depende da capacidade de mobilização de cada profissional, o eixo tende a variar de uma turma para outra e a encolher até o limite dos meios e do repertório disponíveis, com efeito direto sobre as crianças. Duas crianças da mesma escola, em salas vizinhas, podem ter acesso a direitos diferentes conforme </w:t>
-      </w:r>
-      <w:r>
-        <w:rPr>
-          <w:rFonts w:ascii="Times New Roman" w:hAnsi="Times New Roman"/>
-          <w:sz w:val="24"/>
-        </w:rPr>
-        <w:t>quem é</w:t>
-      </w:r>
-      <w:r>
-        <w:rPr>
-          <w:rFonts w:ascii="Times New Roman" w:hAnsi="Times New Roman"/>
-          <w:sz w:val="24"/>
-        </w:rPr>
-        <w:t xml:space="preserve"> responsável pela turma. O custo recai sobre o tempo e os recursos pessoais de quem está na ponta. Soluções improvisadas, como aparelhos e aplicativos pessoais usados com as crianças, podem ainda contrariar a proteção de dados pretendida pela própria lei. </w:t>
-      </w:r>
-      <w:r>
-        <w:rPr>
-          <w:rFonts w:ascii="Times New Roman" w:hAnsi="Times New Roman"/>
-          <w:sz w:val="24"/>
-        </w:rPr>
-        <w:t>O esforço dos profissionais e os registros produzidos para prestar contas têm</w:t>
-      </w:r>
-      <w:r>
-        <w:rPr>
-          <w:rFonts w:ascii="Times New Roman" w:hAnsi="Times New Roman"/>
-          <w:sz w:val="24"/>
-        </w:rPr>
-        <w:t xml:space="preserve">, além disso, um efeito sobre a política, pois </w:t>
-      </w:r>
-      <w:r>
-        <w:rPr>
-          <w:rFonts w:ascii="Times New Roman" w:hAnsi="Times New Roman"/>
-          <w:sz w:val="24"/>
-        </w:rPr>
-        <w:t>fazem</w:t>
-      </w:r>
-      <w:r>
-        <w:rPr>
-          <w:rFonts w:ascii="Times New Roman" w:hAnsi="Times New Roman"/>
-          <w:sz w:val="24"/>
-        </w:rPr>
-        <w:t xml:space="preserve"> o eixo parecer em andamento e </w:t>
-      </w:r>
-      <w:r>
-        <w:rPr>
-          <w:rFonts w:ascii="Times New Roman" w:hAnsi="Times New Roman"/>
-          <w:sz w:val="24"/>
-        </w:rPr>
-        <w:t>escondem</w:t>
-      </w:r>
-      <w:r>
-        <w:rPr>
-          <w:rFonts w:ascii="Times New Roman" w:hAnsi="Times New Roman"/>
-          <w:sz w:val="24"/>
-        </w:rPr>
-        <w:t xml:space="preserve"> a falta dos meios devidos. É nesse </w:t>
-      </w:r>
-      <w:r>
-        <w:rPr>
-          <w:rFonts w:ascii="Times New Roman" w:hAnsi="Times New Roman"/>
-          <w:sz w:val="24"/>
-        </w:rPr>
-        <w:t>ponto que a performatividade ganha peso analítico</w:t>
-      </w:r>
-      <w:r>
-        <w:rPr>
-          <w:rFonts w:ascii="Times New Roman" w:hAnsi="Times New Roman"/>
-          <w:sz w:val="24"/>
-        </w:rPr>
-        <w:t>: quando o improviso funciona</w:t>
-      </w:r>
-      <w:r>
-        <w:rPr>
-          <w:rFonts w:ascii="Times New Roman" w:hAnsi="Times New Roman"/>
-          <w:sz w:val="24"/>
-        </w:rPr>
-        <w:t>, ou quando o papel mostra o que não aconteceu</w:t>
-      </w:r>
-      <w:r>
-        <w:rPr>
-          <w:rFonts w:ascii="Times New Roman" w:hAnsi="Times New Roman"/>
-          <w:sz w:val="24"/>
-        </w:rPr>
-        <w:t>, quem olha de fora não vê a falta. Esses riscos orientam a leitura das entrevistas, sobretudo dos eixos 3, 4 e 5 do roteiro, e não serão tratados como constatações antes da análise.</w:t>
+        <w:t xml:space="preserve">Algumas situações pedem cuidado. Se os profissionais afirmarem não haver alternativa, o quadro será nomeado como transferência de custo do Estado para o trabalhador, situação mais próxima da sobrevivência que da resistência. Essa distinção será examinada nas perguntas do Eixo 5 sobre o modo como o profissional entende as próprias decisões. Se as formas de atuação variarem conforme a posição institucional, na regência, no apoio à recomposição de aula, no apoio pedagógico, na coordenação ou na direção, essa variação será descrita como achado. A direção tem dois participantes, a coordenação, uma, e a Secretaria, um técnico, o que permite descrever essas posições sem generalizar sobre elas.</w:t>
       </w:r>
     </w:p>
     <w:p>
@@ -2386,168 +2208,91 @@
           <w:rFonts w:ascii="Times New Roman" w:hAnsi="Times New Roman"/>
           <w:sz w:val="24"/>
         </w:rPr>
-        <w:t xml:space="preserve">Os instrumentos (Apêndices D e E)</w:t>
-      </w:r>
-      <w:r>
-        <w:rPr>
-          <w:rFonts w:ascii="Times New Roman" w:hAnsi="Times New Roman"/>
-          <w:sz w:val="24"/>
-        </w:rPr>
-        <w:t xml:space="preserve"> foram construídos para que cada movimento</w:t>
-      </w:r>
-      <w:r>
-        <w:rPr>
-          <w:rFonts w:ascii="Times New Roman" w:hAnsi="Times New Roman"/>
-          <w:sz w:val="24"/>
-        </w:rPr>
-        <w:t xml:space="preserve"> tenha onde aparecer sem que a pergunta o produza. </w:t>
-      </w:r>
-      <w:r>
-        <w:rPr>
-          <w:rFonts w:ascii="Times New Roman" w:hAnsi="Times New Roman"/>
-          <w:sz w:val="24"/>
-        </w:rPr>
-        <w:t>O roteiro das entrevistas tem seis eixos: trajetória e culturas profissionais; interpretação da política; tradução, com a dimensão material e o território; performatividade, com registros, metas e cobranças; formas de atuação diante da política; e habitar o digital e direitos da criança. O Eixo 3 distingue</w:t>
-      </w:r>
-      <w:r>
-        <w:rPr>
-          <w:rFonts w:ascii="Times New Roman" w:hAnsi="Times New Roman"/>
-          <w:sz w:val="24"/>
-        </w:rPr>
-        <w:t xml:space="preserve"> o recurso inexistente do equipamento com defeito</w:t>
-      </w:r>
-      <w:r>
-        <w:rPr>
-          <w:rFonts w:ascii="Times New Roman" w:hAnsi="Times New Roman"/>
-          <w:sz w:val="24"/>
-        </w:rPr>
-        <w:t xml:space="preserve"> e</w:t>
-      </w:r>
-      <w:r>
-        <w:rPr>
-          <w:rFonts w:ascii="Times New Roman" w:hAnsi="Times New Roman"/>
-          <w:sz w:val="24"/>
-        </w:rPr>
-        <w:t xml:space="preserve"> pergunta como se decide o uso quando mais de uma turma precisa do mesmo bem, o que o profissional faz quando o recurso não existe, se recorre a algo seu</w:t>
-      </w:r>
-      <w:r>
-        <w:rPr>
-          <w:rFonts w:ascii="Times New Roman" w:hAnsi="Times New Roman"/>
-          <w:sz w:val="24"/>
-        </w:rPr>
-        <w:t xml:space="preserve"> e</w:t>
-      </w:r>
-      <w:r>
-        <w:rPr>
-          <w:rFonts w:ascii="Times New Roman" w:hAnsi="Times New Roman"/>
-          <w:sz w:val="24"/>
-        </w:rPr>
-        <w:t xml:space="preserve"> como entende essa decisão</w:t>
-      </w:r>
-      <w:r>
-        <w:rPr>
-          <w:rFonts w:ascii="Times New Roman" w:hAnsi="Times New Roman"/>
-          <w:sz w:val="24"/>
-        </w:rPr>
-        <w:t xml:space="preserve">. O Eixo 4 pergunta </w:t>
-      </w:r>
-      <w:r>
-        <w:rPr>
-          <w:rFonts w:ascii="Times New Roman" w:hAnsi="Times New Roman"/>
-          <w:sz w:val="24"/>
-        </w:rPr>
-        <w:t>pelos registros e evidências exigidos, por quem os pede e se correspondem ao que acontece com as crianças. O Eixo 6 pergunta</w:t>
-      </w:r>
-      <w:r>
-        <w:rPr>
-          <w:rFonts w:ascii="Times New Roman" w:hAnsi="Times New Roman"/>
-          <w:sz w:val="24"/>
-        </w:rPr>
-        <w:t xml:space="preserve"> pelos aplicativos e plataformas usados com as crianças, pelo aparelho empregado e pelo tratamento dado aos dados delas, de modo a abrir espaço para o risco à proteção de dados apontado nesta seção. </w:t>
-      </w:r>
-      <w:r>
-        <w:rPr>
-          <w:rFonts w:ascii="Times New Roman" w:hAnsi="Times New Roman"/>
-          <w:sz w:val="24"/>
-        </w:rPr>
-        <w:t>As partes do roteiro dirigidas à coordenação, à direção</w:t>
-      </w:r>
-      <w:r>
-        <w:rPr>
-          <w:rFonts w:ascii="Times New Roman" w:hAnsi="Times New Roman"/>
-          <w:sz w:val="24"/>
-        </w:rPr>
-        <w:t>, aos demais profissionais e ao técnico da Secretaria</w:t>
-      </w:r>
-      <w:r>
-        <w:rPr>
-          <w:rFonts w:ascii="Times New Roman" w:hAnsi="Times New Roman"/>
-          <w:sz w:val="24"/>
-        </w:rPr>
-        <w:t xml:space="preserve"> recebem perguntas equivalentes, indispensáveis </w:t>
-      </w:r>
-      <w:r>
-        <w:rPr>
-          <w:rFonts w:ascii="Times New Roman" w:hAnsi="Times New Roman"/>
-          <w:sz w:val="24"/>
-        </w:rPr>
-        <w:t>à comparação entre posições institucionais. As categorias analíticas não aparecem nas perguntas: termos como fabricação, omissão seletiva ou resistência não serão ditos aos participantes, para não induzir respostas nem soar como julgamento do trabalho. O questionário registra</w:t>
-      </w:r>
-      <w:r>
-        <w:rPr>
-          <w:rFonts w:ascii="Times New Roman" w:hAnsi="Times New Roman"/>
-          <w:sz w:val="24"/>
-        </w:rPr>
-        <w:t xml:space="preserve"> o ano da primeira formação em educação digital, os conteúdos tratados</w:t>
-      </w:r>
-      <w:r>
-        <w:rPr>
-          <w:rFonts w:ascii="Times New Roman" w:hAnsi="Times New Roman"/>
-          <w:sz w:val="24"/>
-        </w:rPr>
-        <w:t>,</w:t>
-      </w:r>
-      <w:r>
-        <w:rPr>
-          <w:rFonts w:ascii="Times New Roman" w:hAnsi="Times New Roman"/>
-          <w:sz w:val="24"/>
-        </w:rPr>
-        <w:t xml:space="preserve"> a frequência do trabalho feito fora da jornada</w:t>
-      </w:r>
-      <w:r>
-        <w:rPr>
-          <w:rFonts w:ascii="Times New Roman" w:hAnsi="Times New Roman"/>
-          <w:sz w:val="24"/>
-        </w:rPr>
-        <w:t xml:space="preserve"> e as exigências de registro que acompanham a educação digital na escola</w:t>
-      </w:r>
-      <w:r>
-        <w:rPr>
-          <w:rFonts w:ascii="Times New Roman" w:hAnsi="Times New Roman"/>
-          <w:sz w:val="24"/>
-        </w:rPr>
-        <w:t xml:space="preserve">. O uso de meios próprios fica reservado à entrevista, para o questionário, aplicado antes, não antecipar o tema. </w:t>
-      </w:r>
-      <w:r>
-        <w:rPr>
-          <w:rFonts w:ascii="Times New Roman" w:hAnsi="Times New Roman"/>
-          <w:sz w:val="24"/>
-        </w:rPr>
-        <w:t>Nos Eixos 3, 4 e 5</w:t>
-      </w:r>
-      <w:r>
-        <w:rPr>
-          <w:rFonts w:ascii="Times New Roman" w:hAnsi="Times New Roman"/>
-          <w:sz w:val="24"/>
-        </w:rPr>
-        <w:t>, as perguntas abertas precedem as diretas, e a entrevistadora anota se o relato</w:t>
-      </w:r>
-      <w:r>
-        <w:rPr>
-          <w:rFonts w:ascii="Times New Roman" w:hAnsi="Times New Roman"/>
-          <w:sz w:val="24"/>
-        </w:rPr>
-        <w:t xml:space="preserve"> apareceu antes ou depois delas. Como o protocolo da pesquisa já foi submetido ao Comitê de Ética em Pesquisa, essas alterações seguem por meio de emenda, e o questionário e as entrevistas só serão aplicados depois da aprovação.</w:t>
+        <w:t xml:space="preserve">As consequências dessa transferência entram na análise como riscos, e cabe ao campo mostrar se ocorrem. Quando a realização de um direito depende da capacidade de mobilização de cada profissional, o eixo tende a variar de uma turma para outra e a encolher até o limite dos meios e do repertório disponíveis, com efeito direto sobre as crianças. Duas crianças da mesma escola, em salas vizinhas, podem ter acesso a direitos diferentes conforme </w:t>
+      </w:r>
+      <w:r>
+        <w:rPr>
+          <w:rFonts w:ascii="Times New Roman" w:hAnsi="Times New Roman"/>
+          <w:sz w:val="24"/>
+        </w:rPr>
+        <w:t>quem é</w:t>
+      </w:r>
+      <w:r>
+        <w:rPr>
+          <w:rFonts w:ascii="Times New Roman" w:hAnsi="Times New Roman"/>
+          <w:sz w:val="24"/>
+        </w:rPr>
+        <w:t xml:space="preserve"> responsável pela turma. O custo recai sobre o tempo e os recursos pessoais de quem está na ponta. Soluções improvisadas, como aparelhos e aplicativos pessoais usados com as crianças, podem ainda contrariar a proteção de dados pretendida pela própria lei. </w:t>
+      </w:r>
+      <w:r>
+        <w:rPr>
+          <w:rFonts w:ascii="Times New Roman" w:hAnsi="Times New Roman"/>
+          <w:sz w:val="24"/>
+        </w:rPr>
+        <w:t>O esforço dos profissionais e os registros produzidos para prestar contas têm</w:t>
+      </w:r>
+      <w:r>
+        <w:rPr>
+          <w:rFonts w:ascii="Times New Roman" w:hAnsi="Times New Roman"/>
+          <w:sz w:val="24"/>
+        </w:rPr>
+        <w:t xml:space="preserve">, além disso, um efeito sobre a política, pois </w:t>
+      </w:r>
+      <w:r>
+        <w:rPr>
+          <w:rFonts w:ascii="Times New Roman" w:hAnsi="Times New Roman"/>
+          <w:sz w:val="24"/>
+        </w:rPr>
+        <w:t>fazem</w:t>
+      </w:r>
+      <w:r>
+        <w:rPr>
+          <w:rFonts w:ascii="Times New Roman" w:hAnsi="Times New Roman"/>
+          <w:sz w:val="24"/>
+        </w:rPr>
+        <w:t xml:space="preserve"> o eixo parecer em andamento e </w:t>
+      </w:r>
+      <w:r>
+        <w:rPr>
+          <w:rFonts w:ascii="Times New Roman" w:hAnsi="Times New Roman"/>
+          <w:sz w:val="24"/>
+        </w:rPr>
+        <w:t>escondem</w:t>
+      </w:r>
+      <w:r>
+        <w:rPr>
+          <w:rFonts w:ascii="Times New Roman" w:hAnsi="Times New Roman"/>
+          <w:sz w:val="24"/>
+        </w:rPr>
+        <w:t xml:space="preserve"> a falta dos meios devidos. É nesse </w:t>
+      </w:r>
+      <w:r>
+        <w:rPr>
+          <w:rFonts w:ascii="Times New Roman" w:hAnsi="Times New Roman"/>
+          <w:sz w:val="24"/>
+        </w:rPr>
+        <w:t>ponto que a performatividade ganha peso analítico</w:t>
+      </w:r>
+      <w:r>
+        <w:rPr>
+          <w:rFonts w:ascii="Times New Roman" w:hAnsi="Times New Roman"/>
+          <w:sz w:val="24"/>
+        </w:rPr>
+        <w:t>: quando o improviso funciona</w:t>
+      </w:r>
+      <w:r>
+        <w:rPr>
+          <w:rFonts w:ascii="Times New Roman" w:hAnsi="Times New Roman"/>
+          <w:sz w:val="24"/>
+        </w:rPr>
+        <w:t>, ou quando o papel mostra o que não aconteceu</w:t>
+      </w:r>
+      <w:r>
+        <w:rPr>
+          <w:rFonts w:ascii="Times New Roman" w:hAnsi="Times New Roman"/>
+          <w:sz w:val="24"/>
+        </w:rPr>
+        <w:t>, quem olha de fora não vê a falta. Esses riscos orientam a leitura das entrevistas, sobretudo dos eixos 3, 4 e 5 do roteiro, e não serão tratados como constatações antes da análise.</w:t>
       </w:r>
     </w:p>
     <w:p>
@@ -2561,69 +2306,168 @@
           <w:rFonts w:ascii="Times New Roman" w:hAnsi="Times New Roman"/>
           <w:sz w:val="24"/>
         </w:rPr>
-        <w:t xml:space="preserve">Esses critérios servem também para evitar dois erros: </w:t>
-      </w:r>
-      <w:r>
-        <w:rPr>
-          <w:rFonts w:ascii="Times New Roman" w:hAnsi="Times New Roman"/>
-          <w:sz w:val="24"/>
-        </w:rPr>
-        <w:t>romantizar o improviso</w:t>
-      </w:r>
-      <w:r>
-        <w:rPr>
-          <w:rFonts w:ascii="Times New Roman" w:hAnsi="Times New Roman"/>
-          <w:sz w:val="24"/>
-        </w:rPr>
-        <w:t xml:space="preserve"> como resistência ou transformá-lo em falha de quem o realiza. Ball (2011, p. 46) adverte contra os estudos em que os sujeitos “emergem, resistentes e românticos, heróis althusserianos lutando contra a opressão”, e Freire (2019, p. 64-65) oferece o contrapeso à segunda leitura ao lembrar, em passagem já citada na Introdução, que o professor “precisa de condições favoráveis, higiênicas, espaciais, estéticas, sem as quais se move menos eficazmente no espaço pedagógico”.</w:t>
-      </w:r>
-      <w:r>
-        <w:rPr>
-          <w:rFonts w:ascii="Times New Roman" w:hAnsi="Times New Roman"/>
-          <w:sz w:val="24"/>
-        </w:rPr>
-        <w:t xml:space="preserve"/>
-      </w:r>
-      <w:r>
-        <w:rPr>
-          <w:rFonts w:ascii="Times New Roman" w:hAnsi="Times New Roman"/>
-          <w:sz w:val="24"/>
-        </w:rPr>
-        <w:t xml:space="preserve"/>
-      </w:r>
-      <w:r>
-        <w:rPr>
-          <w:rFonts w:ascii="Times New Roman" w:hAnsi="Times New Roman"/>
-          <w:sz w:val="24"/>
-        </w:rPr>
-        <w:t xml:space="preserve"/>
-      </w:r>
-      <w:r>
-        <w:rPr>
-          <w:rFonts w:ascii="Times New Roman" w:hAnsi="Times New Roman"/>
-          <w:sz w:val="24"/>
-        </w:rPr>
-        <w:t xml:space="preserve"> Se essas formas aparecerem, a análise mostrará também o</w:t>
-      </w:r>
-      <w:r>
-        <w:rPr>
-          <w:rFonts w:ascii="Times New Roman" w:hAnsi="Times New Roman"/>
-          <w:sz w:val="24"/>
-        </w:rPr>
-        <w:t xml:space="preserve"> custo transferido aos profissionais pelo desenho da política e o significado desse custo para os direitos prometidos pela PNED às crianças.</w:t>
-      </w:r>
-    </w:p>
-    <w:p>
-      <w:pPr>
-        <w:spacing w:line="360" w:lineRule="auto" w:before="240" w:after="240"/>
-      </w:pPr>
-      <w:r>
-        <w:rPr>
-          <w:rFonts w:ascii="Times New Roman" w:hAnsi="Times New Roman"/>
-          <w:b/>
-          <w:sz w:val="24"/>
-        </w:rPr>
-        <w:t>4.4 AS VOZES QUE ESTA PESQUISA ESCUTA: CAMPO, PROFISSIONAIS DA EDUCAÇÃO, INSTRUMENTOS E PROCEDIMENTOS</w:t>
+        <w:t xml:space="preserve">Os instrumentos (Apêndices D e E)</w:t>
+      </w:r>
+      <w:r>
+        <w:rPr>
+          <w:rFonts w:ascii="Times New Roman" w:hAnsi="Times New Roman"/>
+          <w:sz w:val="24"/>
+        </w:rPr>
+        <w:t xml:space="preserve"> foram construídos para que cada movimento</w:t>
+      </w:r>
+      <w:r>
+        <w:rPr>
+          <w:rFonts w:ascii="Times New Roman" w:hAnsi="Times New Roman"/>
+          <w:sz w:val="24"/>
+        </w:rPr>
+        <w:t xml:space="preserve"> tenha onde aparecer sem que a pergunta o produza. </w:t>
+      </w:r>
+      <w:r>
+        <w:rPr>
+          <w:rFonts w:ascii="Times New Roman" w:hAnsi="Times New Roman"/>
+          <w:sz w:val="24"/>
+        </w:rPr>
+        <w:t>O roteiro das entrevistas tem seis eixos: trajetória e culturas profissionais; interpretação da política; tradução, com a dimensão material e o território; performatividade, com registros, metas e cobranças; formas de atuação diante da política; e habitar o digital e direitos da criança. O Eixo 3 distingue</w:t>
+      </w:r>
+      <w:r>
+        <w:rPr>
+          <w:rFonts w:ascii="Times New Roman" w:hAnsi="Times New Roman"/>
+          <w:sz w:val="24"/>
+        </w:rPr>
+        <w:t xml:space="preserve"> o recurso inexistente do equipamento com defeito</w:t>
+      </w:r>
+      <w:r>
+        <w:rPr>
+          <w:rFonts w:ascii="Times New Roman" w:hAnsi="Times New Roman"/>
+          <w:sz w:val="24"/>
+        </w:rPr>
+        <w:t xml:space="preserve"> e</w:t>
+      </w:r>
+      <w:r>
+        <w:rPr>
+          <w:rFonts w:ascii="Times New Roman" w:hAnsi="Times New Roman"/>
+          <w:sz w:val="24"/>
+        </w:rPr>
+        <w:t xml:space="preserve"> pergunta como se decide o uso quando mais de uma turma precisa do mesmo bem, o que o profissional faz quando o recurso não existe, se recorre a algo seu</w:t>
+      </w:r>
+      <w:r>
+        <w:rPr>
+          <w:rFonts w:ascii="Times New Roman" w:hAnsi="Times New Roman"/>
+          <w:sz w:val="24"/>
+        </w:rPr>
+        <w:t xml:space="preserve"> e</w:t>
+      </w:r>
+      <w:r>
+        <w:rPr>
+          <w:rFonts w:ascii="Times New Roman" w:hAnsi="Times New Roman"/>
+          <w:sz w:val="24"/>
+        </w:rPr>
+        <w:t xml:space="preserve"> como entende essa decisão</w:t>
+      </w:r>
+      <w:r>
+        <w:rPr>
+          <w:rFonts w:ascii="Times New Roman" w:hAnsi="Times New Roman"/>
+          <w:sz w:val="24"/>
+        </w:rPr>
+        <w:t xml:space="preserve">. O Eixo 4 pergunta </w:t>
+      </w:r>
+      <w:r>
+        <w:rPr>
+          <w:rFonts w:ascii="Times New Roman" w:hAnsi="Times New Roman"/>
+          <w:sz w:val="24"/>
+        </w:rPr>
+        <w:t>pelos registros e evidências exigidos, por quem os pede e se correspondem ao que acontece com as crianças. O Eixo 6 pergunta</w:t>
+      </w:r>
+      <w:r>
+        <w:rPr>
+          <w:rFonts w:ascii="Times New Roman" w:hAnsi="Times New Roman"/>
+          <w:sz w:val="24"/>
+        </w:rPr>
+        <w:t xml:space="preserve"> pelos aplicativos e plataformas usados com as crianças, pelo aparelho empregado e pelo tratamento dado aos dados delas, de modo a abrir espaço para o risco à proteção de dados apontado nesta seção. </w:t>
+      </w:r>
+      <w:r>
+        <w:rPr>
+          <w:rFonts w:ascii="Times New Roman" w:hAnsi="Times New Roman"/>
+          <w:sz w:val="24"/>
+        </w:rPr>
+        <w:t>As partes do roteiro dirigidas à coordenação, à direção</w:t>
+      </w:r>
+      <w:r>
+        <w:rPr>
+          <w:rFonts w:ascii="Times New Roman" w:hAnsi="Times New Roman"/>
+          <w:sz w:val="24"/>
+        </w:rPr>
+        <w:t>, aos demais profissionais e ao técnico da Secretaria</w:t>
+      </w:r>
+      <w:r>
+        <w:rPr>
+          <w:rFonts w:ascii="Times New Roman" w:hAnsi="Times New Roman"/>
+          <w:sz w:val="24"/>
+        </w:rPr>
+        <w:t xml:space="preserve"> recebem perguntas equivalentes, indispensáveis </w:t>
+      </w:r>
+      <w:r>
+        <w:rPr>
+          <w:rFonts w:ascii="Times New Roman" w:hAnsi="Times New Roman"/>
+          <w:sz w:val="24"/>
+        </w:rPr>
+        <w:t>à comparação entre posições institucionais. As categorias analíticas não aparecem nas perguntas: termos como fabricação, omissão seletiva ou resistência não serão ditos aos participantes, para não induzir respostas nem soar como julgamento do trabalho. O questionário registra</w:t>
+      </w:r>
+      <w:r>
+        <w:rPr>
+          <w:rFonts w:ascii="Times New Roman" w:hAnsi="Times New Roman"/>
+          <w:sz w:val="24"/>
+        </w:rPr>
+        <w:t xml:space="preserve"> o ano da primeira formação em educação digital, os conteúdos tratados</w:t>
+      </w:r>
+      <w:r>
+        <w:rPr>
+          <w:rFonts w:ascii="Times New Roman" w:hAnsi="Times New Roman"/>
+          <w:sz w:val="24"/>
+        </w:rPr>
+        <w:t>,</w:t>
+      </w:r>
+      <w:r>
+        <w:rPr>
+          <w:rFonts w:ascii="Times New Roman" w:hAnsi="Times New Roman"/>
+          <w:sz w:val="24"/>
+        </w:rPr>
+        <w:t xml:space="preserve"> a frequência do trabalho feito fora da jornada</w:t>
+      </w:r>
+      <w:r>
+        <w:rPr>
+          <w:rFonts w:ascii="Times New Roman" w:hAnsi="Times New Roman"/>
+          <w:sz w:val="24"/>
+        </w:rPr>
+        <w:t xml:space="preserve"> e as exigências de registro que acompanham a educação digital na escola</w:t>
+      </w:r>
+      <w:r>
+        <w:rPr>
+          <w:rFonts w:ascii="Times New Roman" w:hAnsi="Times New Roman"/>
+          <w:sz w:val="24"/>
+        </w:rPr>
+        <w:t xml:space="preserve">. O uso de meios próprios fica reservado à entrevista, para o questionário, aplicado antes, não antecipar o tema. </w:t>
+      </w:r>
+      <w:r>
+        <w:rPr>
+          <w:rFonts w:ascii="Times New Roman" w:hAnsi="Times New Roman"/>
+          <w:sz w:val="24"/>
+        </w:rPr>
+        <w:t>Nos Eixos 3, 4 e 5</w:t>
+      </w:r>
+      <w:r>
+        <w:rPr>
+          <w:rFonts w:ascii="Times New Roman" w:hAnsi="Times New Roman"/>
+          <w:sz w:val="24"/>
+        </w:rPr>
+        <w:t>, as perguntas abertas precedem as diretas, e a entrevistadora anota se o relato</w:t>
+      </w:r>
+      <w:r>
+        <w:rPr>
+          <w:rFonts w:ascii="Times New Roman" w:hAnsi="Times New Roman"/>
+          <w:sz w:val="24"/>
+        </w:rPr>
+        <w:t xml:space="preserve"> apareceu antes ou depois delas. Como o protocolo da pesquisa já foi submetido ao Comitê de Ética em Pesquisa, essas alterações seguem por meio de emenda, e o questionário e as entrevistas só serão aplicados depois da aprovação.</w:t>
       </w:r>
     </w:p>
     <w:p>
@@ -2637,7 +2481,69 @@
           <w:rFonts w:ascii="Times New Roman" w:hAnsi="Times New Roman"/>
           <w:sz w:val="24"/>
         </w:rPr>
-        <w:t xml:space="preserve">A pesquisa acontece na Escola Municipal Domitila Castelo da Silva, da rede municipal de Tibau do Sul/RN, no distrito de Pipa. A gestão da escola deu anuência formal por meio de termo institucional, com observância dos procedimentos éticos da pesquisa e das medidas de proteção da identidade dos participantes.</w:t>
+        <w:t xml:space="preserve">Esses critérios servem também para evitar dois erros: </w:t>
+      </w:r>
+      <w:r>
+        <w:rPr>
+          <w:rFonts w:ascii="Times New Roman" w:hAnsi="Times New Roman"/>
+          <w:sz w:val="24"/>
+        </w:rPr>
+        <w:t>romantizar o improviso</w:t>
+      </w:r>
+      <w:r>
+        <w:rPr>
+          <w:rFonts w:ascii="Times New Roman" w:hAnsi="Times New Roman"/>
+          <w:sz w:val="24"/>
+        </w:rPr>
+        <w:t xml:space="preserve"> como resistência ou transformá-lo em falha de quem o realiza. Ball (2011, p. 46) adverte contra os estudos em que os sujeitos “emergem, resistentes e românticos, heróis althusserianos lutando contra a opressão”, e Freire (2019, p. 64-65) oferece o contrapeso à segunda leitura ao lembrar, em passagem já citada na Introdução, que o professor “precisa de condições favoráveis, higiênicas, espaciais, estéticas, sem as quais se move menos eficazmente no espaço pedagógico”.</w:t>
+      </w:r>
+      <w:r>
+        <w:rPr>
+          <w:rFonts w:ascii="Times New Roman" w:hAnsi="Times New Roman"/>
+          <w:sz w:val="24"/>
+        </w:rPr>
+        <w:t xml:space="preserve"/>
+      </w:r>
+      <w:r>
+        <w:rPr>
+          <w:rFonts w:ascii="Times New Roman" w:hAnsi="Times New Roman"/>
+          <w:sz w:val="24"/>
+        </w:rPr>
+        <w:t xml:space="preserve"/>
+      </w:r>
+      <w:r>
+        <w:rPr>
+          <w:rFonts w:ascii="Times New Roman" w:hAnsi="Times New Roman"/>
+          <w:sz w:val="24"/>
+        </w:rPr>
+        <w:t xml:space="preserve"/>
+      </w:r>
+      <w:r>
+        <w:rPr>
+          <w:rFonts w:ascii="Times New Roman" w:hAnsi="Times New Roman"/>
+          <w:sz w:val="24"/>
+        </w:rPr>
+        <w:t xml:space="preserve"> Se essas formas aparecerem, a análise mostrará também o</w:t>
+      </w:r>
+      <w:r>
+        <w:rPr>
+          <w:rFonts w:ascii="Times New Roman" w:hAnsi="Times New Roman"/>
+          <w:sz w:val="24"/>
+        </w:rPr>
+        <w:t xml:space="preserve"> custo transferido aos profissionais pelo desenho da política e o significado desse custo para os direitos prometidos pela PNED às crianças.</w:t>
+      </w:r>
+    </w:p>
+    <w:p>
+      <w:pPr>
+        <w:spacing w:line="360" w:lineRule="auto" w:before="240" w:after="240"/>
+      </w:pPr>
+      <w:r>
+        <w:rPr>
+          <w:rFonts w:ascii="Times New Roman" w:hAnsi="Times New Roman"/>
+          <w:b/>
+          <w:sz w:val="24"/>
+        </w:rPr>
+        <w:t>4.4 AS VOZES QUE ESTA PESQUISA ESCUTA: CAMPO, PROFISSIONAIS DA EDUCAÇÃO, INSTRUMENTOS E PROCEDIMENTOS</w:t>
       </w:r>
     </w:p>
     <w:p>
@@ -2651,7 +2557,7 @@
           <w:rFonts w:ascii="Times New Roman" w:hAnsi="Times New Roman"/>
           <w:sz w:val="24"/>
         </w:rPr>
-        <w:t xml:space="preserve">Na escolha da escola, pesaram quatro fatores: a) a experiência anterior com programas públicos de tecnologia educacional; b) a condição atual, com computadores e internet funcionando em parte, situação intermediária na qual os profissionais trabalham entre o existente e o ausente, sem viver a carência absoluta nem a ampla disponibilidade; c) a abertura da equipe escolar à proposta, condição de viabilidade de qualquer estudo de caso; e d) as particularidades socioterritoriais de Pipa, que põem a política educacional em contato com dinâmicas comunitárias próprias.</w:t>
+        <w:t>A pesquisa acontece na rede municipal de Tibau do Sul/RN. Começa na Secretaria Municipal de Educação, que entrará como instituição coparticipante na emenda ao protocolo, ainda a ser submetida ao Comitê de Ética em Pesquisa [confirmar a anuência formal da Secretaria], e chega à Escola Municipal Domitila Castelo da Silva, em Pipa. A gestão da escola deu anuência formal por meio de termo institucional, com observância dos procedimentos éticos da pesquisa e das medidas de proteção da identidade dos participantes.</w:t>
       </w:r>
     </w:p>
     <w:p>
@@ -2665,7 +2571,7 @@
           <w:rFonts w:ascii="Times New Roman" w:hAnsi="Times New Roman"/>
           <w:sz w:val="24"/>
         </w:rPr>
-        <w:t>Pipa entra na investigação como elemento de análise. O distrito vende hospedagem, passeios e refeições pela internet a visitantes do mundo inteiro, e o turismo internacional intenso convive com desigualdades socioeconômicas marcantes na vida da população local. Longe da área comercial, a infraestrutura e a conectividade mudam, e o Capítulo 6 leva isso em conta ao caracterizar o contexto. Dessas condições dependem, em parte, as diferentes experiências digitais que as crianças trazem para a escola.</w:t>
+        <w:t>O município entra no desenho pela diversidade de suas localidades. Tibau do Sul tem 102,68 km² (IBGE, 2025) e tinha 16.929 habitantes no Censo de 2022 (IBGE, 2023). O IBGE reconhece no município apenas o distrito sede, mas o cotidiano se organiza em localidades com feições próprias, entre elas a sede, Pipa, Sibaúma, certificada como comunidade remanescente de quilombo em 2005 (FUNDAÇÃO CULTURAL PALMARES, 2005), Piau e povoados rurais, segundo levantamento preliminar a ser confirmado na relação oficial da Prefeitura. Segundo o técnico da Secretaria, existe um plano elaborado para a rede como um todo [indicar nome, data e instância de aprovação do documento], e é a partir dele e das orientações municipais que a pesquisa pergunta como a política foi traduzida para essas localidades.</w:t>
       </w:r>
     </w:p>
     <w:p>
@@ -2679,7 +2585,7 @@
           <w:rFonts w:ascii="Times New Roman" w:hAnsi="Times New Roman"/>
           <w:sz w:val="24"/>
         </w:rPr>
-        <w:t>Chamamos os participantes de profissionais da educação, expressão mais ampla do que docentes, porque o trabalho educativo inclui funções e responsabilidades para além da sala de aula. É também o termo da legislação educacional brasileira. A Lei nº 9.394/1996, de Diretrizes e Bases da Educação Nacional, dedica o Título VI aos “Profissionais da Educação” e, em seu art. 61, contempla diferentes profissionais vinculados ao exercício da educação escolar básica (BRASIL, 1996). A Lei nº 14.817/2024, com diretrizes para a valorização dos profissionais da educação escolar básica pública, explicita essa abrangência ao considerar profissionais da educação os responsáveis pela docência, por funções de suporte pedagógico à docência, pela direção e administração escolar, pelo planejamento, pela inspeção, supervisão e orientação educacionais, além de determinadas funções de suporte técnico e administrativo (BRASIL, 2024).</w:t>
+        <w:t xml:space="preserve">Na escolha da escola, pesaram quatro fatores: a) a experiência anterior com programas públicos de tecnologia educacional; b) a condição atual, com computadores e internet funcionando em parte, situação intermediária na qual os profissionais trabalham entre o existente e o ausente, sem viver a carência absoluta nem a ampla disponibilidade; c) a abertura da equipe escolar à proposta, condição de viabilidade de qualquer estudo de caso; e d) as particularidades socioterritoriais de Pipa, que põem a política educacional em contato com dinâmicas comunitárias próprias.</w:t>
       </w:r>
     </w:p>
     <w:p>
@@ -2693,7 +2599,7 @@
           <w:rFonts w:ascii="Times New Roman" w:hAnsi="Times New Roman"/>
           <w:sz w:val="24"/>
         </w:rPr>
-        <w:t>A literatura sobre o trabalho educativo segue a mesma direção. Queiroz e Paiva (2014, p. 253-254) observam: “Os profissionais ali exercem várias funções: gestão, docência em sala de aula com a formulação e execução do planejamento global (PPP), de projetos específicos e avaliação de todos os processos que implicam o ensino e a aprendizagem”. As autoras relacionam essa configuração às condições de trabalho, que compreendem, nos termos de Oliveira e Vieira, “as instalações físicas, os materiais e insumos disponíveis, os equipamentos e meios de realização das atividades e outros tipos de apoios necessários, dependendo da natureza da produção” (OLIVEIRA; VIEIRA, 2012, p. 156 apud QUEIROZ; PAIVA, 2014, p. 254). O trabalho educacional ultrapassa, portanto, a docência em sala, e suas condições incluem os equipamentos dos quais a educação digital depende.</w:t>
+        <w:t>Pipa entra na investigação como elemento de análise. A localidade vende hospedagem, passeios e refeições pela internet a visitantes do mundo inteiro, e o turismo internacional intenso convive com desigualdades socioeconômicas marcantes na vida da população local. Longe da área comercial, a infraestrutura e a conectividade mudam, e o Capítulo 6 leva isso em conta ao caracterizar o contexto. Dessas condições dependem, em parte, as diferentes experiências digitais que as crianças trazem para a escola.</w:t>
       </w:r>
     </w:p>
     <w:p>
@@ -2707,49 +2613,7 @@
           <w:rFonts w:ascii="Times New Roman" w:hAnsi="Times New Roman"/>
           <w:sz w:val="24"/>
         </w:rPr>
-        <w:t>Nesta tese, profissionais da educação é uma denominação ampla e heterogênea. Reúne pessoas em posições diferentes sem igualar suas atribuições, responsabilidades ou relações com a política. A docência é uma dessas posições; a coordenação pedagógica, a direção escolar</w:t>
-      </w:r>
-      <w:r>
-        <w:rPr>
-          <w:rFonts w:ascii="Times New Roman" w:hAnsi="Times New Roman"/>
-          <w:sz w:val="24"/>
-        </w:rPr>
-        <w:t>, o apoio pedagógico, o atendimento educacional especializado e as funções técnicas ligadas ao trabalho pedagógico são outras. Todos participam da construção da política na escola, e por isso todos são ouvidos</w:t>
-      </w:r>
-      <w:r>
-        <w:rPr>
-          <w:rFonts w:ascii="Times New Roman" w:hAnsi="Times New Roman"/>
-          <w:sz w:val="24"/>
-        </w:rPr>
-        <w:t xml:space="preserve">. Ball, Maguire e Braun (2016, p. 74-75) registram essa diferença ao observar que “os atores nas escolas são posicionados de forma diferente e assumem posições diversas em relação à política”, e manteremos essa distinção durante toda a análise.</w:t>
-      </w:r>
-      <w:r>
-        <w:rPr>
-          <w:rFonts w:ascii="Times New Roman" w:hAnsi="Times New Roman"/>
-          <w:sz w:val="24"/>
-        </w:rPr>
-        <w:t xml:space="preserve"/>
-      </w:r>
-      <w:r>
-        <w:rPr>
-          <w:rFonts w:ascii="Times New Roman" w:hAnsi="Times New Roman"/>
-          <w:sz w:val="24"/>
-        </w:rPr>
-        <w:t xml:space="preserve"/>
-      </w:r>
-      <w:r>
-        <w:rPr>
-          <w:rFonts w:ascii="Times New Roman" w:hAnsi="Times New Roman"/>
-          <w:sz w:val="24"/>
-        </w:rPr>
-        <w:t xml:space="preserve"/>
-      </w:r>
-      <w:r>
-        <w:rPr>
-          <w:rFonts w:ascii="Times New Roman" w:hAnsi="Times New Roman"/>
-          <w:sz w:val="24"/>
-        </w:rPr>
-        <w:t xml:space="preserve"/>
+        <w:t>Chamamos os participantes de profissionais da educação, expressão mais ampla do que docentes, porque o trabalho educativo inclui funções e responsabilidades para além da sala de aula. É também o termo da legislação educacional brasileira. A Lei nº 9.394/1996, de Diretrizes e Bases da Educação Nacional, dedica o Título VI aos “Profissionais da Educação” e, em seu art. 61, contempla diferentes profissionais vinculados ao exercício da educação escolar básica (BRASIL, 1996). A Lei nº 14.817/2024, com diretrizes para a valorização dos profissionais da educação escolar básica pública, explicita essa abrangência ao considerar profissionais da educação os responsáveis pela docência, por funções de suporte pedagógico à docência, pela direção e administração escolar, pelo planejamento, pela inspeção, supervisão e orientação educacionais, além de determinadas funções de suporte técnico e administrativo (BRASIL, 2024).</w:t>
       </w:r>
     </w:p>
     <w:p>
@@ -2763,7 +2627,7 @@
           <w:rFonts w:ascii="Times New Roman" w:hAnsi="Times New Roman"/>
           <w:sz w:val="24"/>
         </w:rPr>
-        <w:t>Tomamos os profissionais da educação, em suas diferentes funções, como fazedores de política, pois cada posição envolve modos distintos de interpretar, traduzir e mediar as políticas públicas. Ball, Maguire e Braun (2016) identificam, numa mesma escola, posições diferentes diante da política, como a de quem a narra, a de quem a traduz para os colegas, a de quem a critica e a de quem apenas a recebe, posições que não coincidem necessariamente com os cargos.</w:t>
+        <w:t>A literatura sobre o trabalho educativo segue a mesma direção. Queiroz e Paiva (2014, p. 253-254) observam: “Os profissionais ali exercem várias funções: gestão, docência em sala de aula com a formulação e execução do planejamento global (PPP), de projetos específicos e avaliação de todos os processos que implicam o ensino e a aprendizagem”. As autoras relacionam essa configuração às condições de trabalho, que compreendem, nos termos de Oliveira e Vieira, “as instalações físicas, os materiais e insumos disponíveis, os equipamentos e meios de realização das atividades e outros tipos de apoios necessários, dependendo da natureza da produção” (OLIVEIRA; VIEIRA, 2012, p. 156 apud QUEIROZ; PAIVA, 2014, p. 254). O trabalho educacional ultrapassa, portanto, a docência em sala, e suas condições incluem os equipamentos dos quais a educação digital depende.</w:t>
       </w:r>
     </w:p>
     <w:p>
@@ -2777,63 +2641,49 @@
           <w:rFonts w:ascii="Times New Roman" w:hAnsi="Times New Roman"/>
           <w:sz w:val="24"/>
         </w:rPr>
-        <w:t>Ouvindo quem trabalha na coordenação pedagógica</w:t>
-      </w:r>
-      <w:r>
-        <w:rPr>
-          <w:rFonts w:ascii="Times New Roman" w:hAnsi="Times New Roman"/>
-          <w:sz w:val="24"/>
-        </w:rPr>
-        <w:t xml:space="preserve"> e na direção escolar</w:t>
-      </w:r>
-      <w:r>
-        <w:rPr>
-          <w:rFonts w:ascii="Times New Roman" w:hAnsi="Times New Roman"/>
-          <w:sz w:val="24"/>
-        </w:rPr>
-        <w:t xml:space="preserve">, chegamos às exigências administrativas e às pressões institucionais </w:t>
-      </w:r>
-      <w:r>
-        <w:rPr>
-          <w:rFonts w:ascii="Times New Roman" w:hAnsi="Times New Roman"/>
-          <w:sz w:val="24"/>
-        </w:rPr>
-        <w:t>que alcançam a escola. Quem trabalha diretamente nas turmas do 1º ao 5º ano, como docente ou no apoio a elas,</w:t>
-      </w:r>
-      <w:r>
-        <w:rPr>
-          <w:rFonts w:ascii="Times New Roman" w:hAnsi="Times New Roman"/>
-          <w:sz w:val="24"/>
-        </w:rPr>
-        <w:t xml:space="preserve"> mostra como as orientações são interpretadas diante das condições do cotidiano escolar. </w:t>
-      </w:r>
-      <w:r>
-        <w:rPr>
-          <w:rFonts w:ascii="Times New Roman" w:hAnsi="Times New Roman"/>
-          <w:sz w:val="24"/>
-        </w:rPr>
-        <w:t xml:space="preserve">Um técnico da Secretaria Municipal de Educação, o coordenador de políticas públicas e programas educacionais do município, será ouvido como fonte complementar sobre o contexto externo, isto é, sobre como as orientações nacionais são recebidas e encaminhadas pela gestão municipal antes de chegar à escola; os documentos da Secretaria completam essa leitura, e a unidade do caso continua sendo a escola. A direção</w:t>
-      </w:r>
-      <w:r>
-        <w:rPr>
-          <w:rFonts w:ascii="Times New Roman" w:hAnsi="Times New Roman"/>
-          <w:sz w:val="24"/>
-        </w:rPr>
-        <w:t xml:space="preserve"> não será ouvida como detentora do saber, nem a professora como executora. Poremos essas posições em relação sem hierarquizá-las, respeitando o que é próprio de cada uma e o lugar que ocupam na </w:t>
-      </w:r>
-      <w:r>
-        <w:rPr>
-          <w:rFonts w:ascii="Times New Roman" w:hAnsi="Times New Roman"/>
-          <w:sz w:val="24"/>
-        </w:rPr>
-        <w:t>encenação</w:t>
-      </w:r>
-      <w:r>
-        <w:rPr>
-          <w:rFonts w:ascii="Times New Roman" w:hAnsi="Times New Roman"/>
-          <w:sz w:val="24"/>
-        </w:rPr>
-        <w:t xml:space="preserve"> da política.</w:t>
+        <w:t>Nesta tese, profissionais da educação é uma denominação ampla e heterogênea. Reúne pessoas em posições diferentes sem igualar suas atribuições, responsabilidades ou relações com a política. A docência é uma dessas posições; a coordenação pedagógica, a direção escolar</w:t>
+      </w:r>
+      <w:r>
+        <w:rPr>
+          <w:rFonts w:ascii="Times New Roman" w:hAnsi="Times New Roman"/>
+          <w:sz w:val="24"/>
+        </w:rPr>
+        <w:t>, o apoio pedagógico, o atendimento educacional especializado e as funções técnicas ligadas ao trabalho pedagógico são outras. Todos participam da construção da política na escola, e por isso todos são ouvidos</w:t>
+      </w:r>
+      <w:r>
+        <w:rPr>
+          <w:rFonts w:ascii="Times New Roman" w:hAnsi="Times New Roman"/>
+          <w:sz w:val="24"/>
+        </w:rPr>
+        <w:t xml:space="preserve">. Ball, Maguire e Braun (2016, p. 74-75) registram essa diferença ao observar que “os atores nas escolas são posicionados de forma diferente e assumem posições diversas em relação à política”, e manteremos essa distinção durante toda a análise.</w:t>
+      </w:r>
+      <w:r>
+        <w:rPr>
+          <w:rFonts w:ascii="Times New Roman" w:hAnsi="Times New Roman"/>
+          <w:sz w:val="24"/>
+        </w:rPr>
+        <w:t xml:space="preserve"/>
+      </w:r>
+      <w:r>
+        <w:rPr>
+          <w:rFonts w:ascii="Times New Roman" w:hAnsi="Times New Roman"/>
+          <w:sz w:val="24"/>
+        </w:rPr>
+        <w:t xml:space="preserve"/>
+      </w:r>
+      <w:r>
+        <w:rPr>
+          <w:rFonts w:ascii="Times New Roman" w:hAnsi="Times New Roman"/>
+          <w:sz w:val="24"/>
+        </w:rPr>
+        <w:t xml:space="preserve"/>
+      </w:r>
+      <w:r>
+        <w:rPr>
+          <w:rFonts w:ascii="Times New Roman" w:hAnsi="Times New Roman"/>
+          <w:sz w:val="24"/>
+        </w:rPr>
+        <w:t xml:space="preserve"/>
       </w:r>
     </w:p>
     <w:p>
@@ -2847,7 +2697,7 @@
           <w:rFonts w:ascii="Times New Roman" w:hAnsi="Times New Roman"/>
           <w:sz w:val="24"/>
         </w:rPr>
-        <w:t>As entrevistas são o principal momento de escuta dos profissionais sobre a PNED e sobre sua relação com a política no trabalho. Nelas, veremos como interpretam as diretrizes oficiais, que sentidos atribuem à educação digital e como percebem as condições em que a política acontece. Os documentos institucionais trarão informações sobre a organização formal da escola e da rede, e o registro iconográfico, já realizado, documenta os espaços e os equipamentos disponíveis.</w:t>
+        <w:t>Tomamos os profissionais da educação, em suas diferentes funções, como fazedores de política, pois cada posição envolve modos distintos de interpretar, traduzir e mediar as políticas públicas. Ball, Maguire e Braun (2016) identificam, numa mesma escola, posições diferentes diante da política, como a de quem a narra, a de quem a traduz para os colegas, a de quem a critica e a de quem apenas a recebe, posições que não coincidem necessariamente com os cargos.</w:t>
       </w:r>
     </w:p>
     <w:p>
@@ -2861,7 +2711,63 @@
           <w:rFonts w:ascii="Times New Roman" w:hAnsi="Times New Roman"/>
           <w:sz w:val="24"/>
         </w:rPr>
-        <w:t>Todo o percurso segue os protocolos éticos estabelecidos. Nas visitas de campo, faremos anotações em diário sobre aspectos do contexto e sobre a própria condução da pesquisa, coisas que o conteúdo das falas não registra.</w:t>
+        <w:t>Ouvindo quem trabalha na coordenação pedagógica</w:t>
+      </w:r>
+      <w:r>
+        <w:rPr>
+          <w:rFonts w:ascii="Times New Roman" w:hAnsi="Times New Roman"/>
+          <w:sz w:val="24"/>
+        </w:rPr>
+        <w:t xml:space="preserve"> e na direção escolar</w:t>
+      </w:r>
+      <w:r>
+        <w:rPr>
+          <w:rFonts w:ascii="Times New Roman" w:hAnsi="Times New Roman"/>
+          <w:sz w:val="24"/>
+        </w:rPr>
+        <w:t xml:space="preserve">, chegamos às exigências administrativas e às pressões institucionais </w:t>
+      </w:r>
+      <w:r>
+        <w:rPr>
+          <w:rFonts w:ascii="Times New Roman" w:hAnsi="Times New Roman"/>
+          <w:sz w:val="24"/>
+        </w:rPr>
+        <w:t>que alcançam a escola. Quem trabalha diretamente nas turmas do 1º ao 5º ano, como docente ou no apoio a elas,</w:t>
+      </w:r>
+      <w:r>
+        <w:rPr>
+          <w:rFonts w:ascii="Times New Roman" w:hAnsi="Times New Roman"/>
+          <w:sz w:val="24"/>
+        </w:rPr>
+        <w:t xml:space="preserve"> mostra como as orientações são interpretadas diante das condições do cotidiano escolar. </w:t>
+      </w:r>
+      <w:r>
+        <w:rPr>
+          <w:rFonts w:ascii="Times New Roman" w:hAnsi="Times New Roman"/>
+          <w:sz w:val="24"/>
+        </w:rPr>
+        <w:t>Um técnico da Secretaria Municipal de Educação, o coordenador de políticas públicas e programas educacionais do município, será o primeiro a ser ouvido e é a principal fonte oral sobre a dimensão externa do contexto, isto é, sobre como as orientações nacionais são recebidas e traduzidas pela gestão municipal antes de chegar à escola; os documentos da Secretaria completam essa leitura, e a Secretaria é uma das unidades incorporadas do caso. A direção</w:t>
+      </w:r>
+      <w:r>
+        <w:rPr>
+          <w:rFonts w:ascii="Times New Roman" w:hAnsi="Times New Roman"/>
+          <w:sz w:val="24"/>
+        </w:rPr>
+        <w:t xml:space="preserve"> não será ouvida como detentora do saber, nem a professora como executora. Poremos essas posições em relação sem hierarquizá-las, respeitando o que é próprio de cada uma e o lugar que ocupam na </w:t>
+      </w:r>
+      <w:r>
+        <w:rPr>
+          <w:rFonts w:ascii="Times New Roman" w:hAnsi="Times New Roman"/>
+          <w:sz w:val="24"/>
+        </w:rPr>
+        <w:t>encenação</w:t>
+      </w:r>
+      <w:r>
+        <w:rPr>
+          <w:rFonts w:ascii="Times New Roman" w:hAnsi="Times New Roman"/>
+          <w:sz w:val="24"/>
+        </w:rPr>
+        <w:t xml:space="preserve"> da política.</w:t>
       </w:r>
     </w:p>
     <w:p>
@@ -2875,7 +2781,7 @@
           <w:rFonts w:ascii="Times New Roman" w:hAnsi="Times New Roman"/>
           <w:sz w:val="24"/>
         </w:rPr>
-        <w:t>Terminadas as entrevistas, cada participante receberá uma síntese do próprio depoimento para apontar erros de fato, omissões ou compreensões equivocadas. A devolutiva serve para corrigir o registro das informações. A interpretação teórica continua com a pesquisadora e vem depois, quando as narrativas forem postas em relação com os documentos, os registros iconográficos e o referencial teórico.</w:t>
+        <w:t>As entrevistas são o principal momento de escuta dos profissionais sobre a PNED e sobre sua relação com a política no trabalho. Nelas, veremos como interpretam as diretrizes oficiais, que sentidos atribuem à educação digital e como percebem as condições em que a política acontece. Os documentos institucionais trarão informações sobre a organização formal da escola e da rede, e o registro iconográfico, já realizado, documenta os espaços e os equipamentos disponíveis.</w:t>
       </w:r>
     </w:p>
     <w:p>
@@ -2889,14 +2795,7 @@
           <w:rFonts w:ascii="Times New Roman" w:hAnsi="Times New Roman"/>
           <w:sz w:val="24"/>
         </w:rPr>
-        <w:t>4.4.1</w:t>
-      </w:r>
-      <w:r>
-        <w:rPr>
-          <w:rFonts w:ascii="Times New Roman" w:hAnsi="Times New Roman"/>
-          <w:sz w:val="24"/>
-        </w:rPr>
-        <w:t xml:space="preserve"> Os profissionais da educação: seleção, composição e posições</w:t>
+        <w:t>Todo o percurso segue os protocolos éticos estabelecidos. Nas visitas de campo, faremos anotações em diário sobre aspectos do contexto e sobre a própria condução da pesquisa, coisas que o conteúdo das falas não registra.</w:t>
       </w:r>
     </w:p>
     <w:p>
@@ -2910,7 +2809,7 @@
           <w:rFonts w:ascii="Times New Roman" w:hAnsi="Times New Roman"/>
           <w:sz w:val="24"/>
         </w:rPr>
-        <w:t xml:space="preserve">Participarão da pesquisa os profissionais da educação da Escola Municipal Domitila Castelo da Silva que atuam nos anos iniciais do Ensino Fundamental, do 1º ao 5º ano, e aceitarem o convite: as professoras e os professores regentes das quinze turmas, os dois docentes que atuam no apoio à recomposição de aula, os quatro profissionais do apoio pedagógico, a coordenadora pedagógica, a vice-diretora e o diretor, num total de 24 profissionais. Participa também um técnico da Secretaria Municipal de Educação, o coordenador de políticas públicas e programas educacionais do município, como fonte complementar, sem constituir um segundo caso. Quando uma função for exercida por uma só pessoa, ela será designada pelo nome da função, sem referência a quem a ocupa, para preservar o anonimato assegurado no Termo de Consentimento Livre e Esclarecido.</w:t>
+        <w:t>Terminadas as entrevistas, cada participante receberá uma síntese do próprio depoimento para apontar erros de fato, omissões ou compreensões equivocadas. A devolutiva serve para corrigir o registro das informações. A interpretação teórica continua com a pesquisadora e vem depois, quando as narrativas forem postas em relação com os documentos, os registros iconográficos e o referencial teórico.</w:t>
       </w:r>
     </w:p>
     <w:p>
@@ -2924,6 +2823,41 @@
           <w:rFonts w:ascii="Times New Roman" w:hAnsi="Times New Roman"/>
           <w:sz w:val="24"/>
         </w:rPr>
+        <w:t>4.4.1</w:t>
+      </w:r>
+      <w:r>
+        <w:rPr>
+          <w:rFonts w:ascii="Times New Roman" w:hAnsi="Times New Roman"/>
+          <w:sz w:val="24"/>
+        </w:rPr>
+        <w:t xml:space="preserve"> Os profissionais da educação: seleção, composição e posições</w:t>
+      </w:r>
+    </w:p>
+    <w:p>
+      <w:pPr>
+        <w:spacing w:line="360" w:lineRule="auto"/>
+        <w:ind w:firstLine="709"/>
+        <w:jc w:val="both"/>
+      </w:pPr>
+      <w:r>
+        <w:rPr>
+          <w:rFonts w:ascii="Times New Roman" w:hAnsi="Times New Roman"/>
+          <w:sz w:val="24"/>
+        </w:rPr>
+        <w:t>Participarão da pesquisa os profissionais da educação da Escola Municipal Domitila Castelo da Silva que atuam nos anos iniciais do Ensino Fundamental, do 1º ao 5º ano, e aceitarem o convite: as professoras e os professores regentes das quinze turmas, os dois docentes que atuam no apoio à recomposição de aula, os quatro profissionais do apoio pedagógico, a coordenadora pedagógica, a vice-diretora e o diretor, num total de 24 profissionais. Na Secretaria Municipal de Educação, participa um técnico, o coordenador de políticas públicas e programas educacionais do município, único participante da rede. Quando uma função for exercida por uma só pessoa, ela será designada pelo nome da função, sem referência a quem a ocupa, para preservar o anonimato assegurado no Termo de Consentimento Livre e Esclarecido.</w:t>
+      </w:r>
+    </w:p>
+    <w:p>
+      <w:pPr>
+        <w:spacing w:line="360" w:lineRule="auto"/>
+        <w:ind w:firstLine="709"/>
+        <w:jc w:val="both"/>
+      </w:pPr>
+      <w:r>
+        <w:rPr>
+          <w:rFonts w:ascii="Times New Roman" w:hAnsi="Times New Roman"/>
+          <w:sz w:val="24"/>
+        </w:rPr>
         <w:t>Os participantes foram definidos por amostragem intencional, procedimento coerente com a abordagem qualitativa do estudo de caso. Marconi e Lakatos (2007) definem esse modelo amostral:</w:t>
       </w:r>
     </w:p>
@@ -3078,14 +3012,7 @@
           <w:rFonts w:ascii="Times New Roman" w:hAnsi="Times New Roman"/>
           <w:sz w:val="24"/>
         </w:rPr>
-        <w:t>4.4.2</w:t>
-      </w:r>
-      <w:r>
-        <w:rPr>
-          <w:rFonts w:ascii="Times New Roman" w:hAnsi="Times New Roman"/>
-          <w:sz w:val="24"/>
-        </w:rPr>
-        <w:t xml:space="preserve"> Instrumentos e procedimentos de produção de dados</w:t>
+        <w:t>O técnico foi escolhido pela função que exerce. É ele quem acompanha os programas e as orientações que chegam às escolas, e foi ele quem informou a existência de um plano elaborado para a rede como um todo. Por decisão tomada com a orientadora, a Secretaria é ouvida apenas por ele, e sua entrevista, a primeira do campo, permite compreender como a política foi recebida e traduzida no município, que plano, formações e orientações foram produzidos e se esses materiais consideram as especificidades das localidades, antes de a análise chegar ao cotidiano da escola.</w:t>
       </w:r>
     </w:p>
     <w:p>
@@ -3099,7 +3026,14 @@
           <w:rFonts w:ascii="Times New Roman" w:hAnsi="Times New Roman"/>
           <w:sz w:val="24"/>
         </w:rPr>
-        <w:t>Os dados serão construídos em cinco movimentos, apresentados nas subseções seguintes e na seção 4.5. O primeiro é a análise documental, que começa com a entrada no campo, quando os documentos são solicitados à escola e à Secretaria, e acompanha todo o percurso. O segundo, o registro iconográfico, já foi realizado e sustenta o Capítulo 6. O terceiro é o questionário de perfil e percepções, que situa os participantes em suas trajetórias, com dados sobre função, formação e condições de trabalho declaradas. As respostas ajustarão os roteiros. Se alguém declarar nunca ter feito curso sobre tecnologias digitais, a entrevista explorará como essa pessoa aprende por conta própria e como percebe essa falta diante da PNED; se relatar limitações de infraestrutura, a conversa se deterá nos arranjos criados para contorná-las. O quarto movimento são as entrevistas semiestruturadas, que só começam depois da sistematização do questionário e nas quais aparecem as interpretações, os sentidos e as justificativas dos profissionais. O quinto reúne as fontes na análise temática reflexiva e se encerra com a devolutiva dos resultados à escola e à Secretaria.</w:t>
+        <w:t>4.4.2</w:t>
+      </w:r>
+      <w:r>
+        <w:rPr>
+          <w:rFonts w:ascii="Times New Roman" w:hAnsi="Times New Roman"/>
+          <w:sz w:val="24"/>
+        </w:rPr>
+        <w:t xml:space="preserve"> Instrumentos e procedimentos de produção de dados</w:t>
       </w:r>
     </w:p>
     <w:p>
@@ -3113,49 +3047,7 @@
           <w:rFonts w:ascii="Times New Roman" w:hAnsi="Times New Roman"/>
           <w:sz w:val="24"/>
         </w:rPr>
-        <w:t xml:space="preserve">Juntas, as quatro fontes permitem ler a </w:t>
-      </w:r>
-      <w:r>
-        <w:rPr>
-          <w:rFonts w:ascii="Times New Roman" w:hAnsi="Times New Roman"/>
-          <w:sz w:val="24"/>
-        </w:rPr>
-        <w:t>encenação</w:t>
-      </w:r>
-      <w:r>
-        <w:rPr>
-          <w:rFonts w:ascii="Times New Roman" w:hAnsi="Times New Roman"/>
-          <w:sz w:val="24"/>
-        </w:rPr>
-        <w:t xml:space="preserve"> da política em mais de um plano. Os conceitos da ACP orientam o exame da produção de sentidos e das tensões discursivas, e as </w:t>
-      </w:r>
-      <w:r>
-        <w:rPr>
-          <w:rFonts w:ascii="Times New Roman" w:hAnsi="Times New Roman"/>
-          <w:sz w:val="24"/>
-        </w:rPr>
-        <w:t>dimensões do contexto propostas pela teoria da atuação</w:t>
-      </w:r>
-      <w:r>
-        <w:rPr>
-          <w:rFonts w:ascii="Times New Roman" w:hAnsi="Times New Roman"/>
-          <w:sz w:val="24"/>
-        </w:rPr>
-        <w:t xml:space="preserve"> ajudam a entender as estratégias práticas diante das limitações materiais</w:t>
-      </w:r>
-      <w:r>
-        <w:rPr>
-          <w:rFonts w:ascii="Times New Roman" w:hAnsi="Times New Roman"/>
-          <w:sz w:val="24"/>
-        </w:rPr>
-        <w:t xml:space="preserve"> e das pressões externas</w:t>
-      </w:r>
-      <w:r>
-        <w:rPr>
-          <w:rFonts w:ascii="Times New Roman" w:hAnsi="Times New Roman"/>
-          <w:sz w:val="24"/>
-        </w:rPr>
-        <w:t>. Com a triangulação, pomos lado a lado os registros dos documentos, os relatos dos profissionais e a materialidade documentada do campo. Não esperamos que tudo coincida, nem buscamos uma versão única do fenômeno.</w:t>
+        <w:t>Os dados serão construídos em cinco movimentos, ordenados da rede municipal à escola e apresentados nas subseções seguintes e na seção 4.5. O primeiro é a análise documental, da rede à escola. Parte dos documentos já foi solicitada ao técnico da Secretaria e à direção da escola, e o que não estiver disponível em transparência ativa será pedido com base na Lei de Acesso à Informação (BRASIL, 2011). O segundo é a leitura do território municipal, com dados públicos sobre a população e as escolas de cada localidade, acompanhada do registro iconográfico da escola de Pipa, já realizado, que sustenta o Capítulo 6. O terceiro é o questionário de perfil e percepções, que situa os participantes da escola em suas trajetórias, com dados sobre função, formação e condições de trabalho declaradas. As respostas ajustarão os roteiros. Se alguém declarar nunca ter feito curso sobre tecnologias digitais, a entrevista explorará como essa pessoa aprende por conta própria e como percebe essa falta diante da PNED; se relatar limitações de infraestrutura, a conversa se deterá nos arranjos criados para contorná-las. O quarto movimento são as entrevistas semiestruturadas, a primeira com o técnico da Secretaria e as demais com os profissionais da escola, depois da sistematização do questionário, nas quais aparecem as interpretações, os sentidos e as justificativas. O quinto reúne as fontes na análise temática reflexiva e se encerra com a devolutiva dos resultados à escola e à Secretaria.</w:t>
       </w:r>
     </w:p>
     <w:p>
@@ -3169,7 +3061,49 @@
           <w:rFonts w:ascii="Times New Roman" w:hAnsi="Times New Roman"/>
           <w:sz w:val="24"/>
         </w:rPr>
-        <w:t>Cada fonte terá tratamento próprio. As entrevistas e as eventuais respostas abertas do questionário passarão pela análise temática reflexiva. Os documentos pedagógicos serão lidos, no Capítulo 7, com uma matriz documental orientada pelas dimensões teóricas e pelos objetivos da pesquisa. O registro iconográfico já passou pelo protocolo descritivo e interpretativo apresentado adiante, aplicado no Capítulo 6. Depois, cruzaremos os resultados, respeitando o alcance e os limites de prova de cada fonte.</w:t>
+        <w:t xml:space="preserve">Juntas, as quatro fontes permitem ler a </w:t>
+      </w:r>
+      <w:r>
+        <w:rPr>
+          <w:rFonts w:ascii="Times New Roman" w:hAnsi="Times New Roman"/>
+          <w:sz w:val="24"/>
+        </w:rPr>
+        <w:t>encenação</w:t>
+      </w:r>
+      <w:r>
+        <w:rPr>
+          <w:rFonts w:ascii="Times New Roman" w:hAnsi="Times New Roman"/>
+          <w:sz w:val="24"/>
+        </w:rPr>
+        <w:t xml:space="preserve"> da política em mais de um plano. Os conceitos da ACP orientam o exame da produção de sentidos e das tensões discursivas, e as </w:t>
+      </w:r>
+      <w:r>
+        <w:rPr>
+          <w:rFonts w:ascii="Times New Roman" w:hAnsi="Times New Roman"/>
+          <w:sz w:val="24"/>
+        </w:rPr>
+        <w:t>dimensões do contexto propostas pela teoria da atuação</w:t>
+      </w:r>
+      <w:r>
+        <w:rPr>
+          <w:rFonts w:ascii="Times New Roman" w:hAnsi="Times New Roman"/>
+          <w:sz w:val="24"/>
+        </w:rPr>
+        <w:t xml:space="preserve"> ajudam a entender as estratégias práticas diante das limitações materiais</w:t>
+      </w:r>
+      <w:r>
+        <w:rPr>
+          <w:rFonts w:ascii="Times New Roman" w:hAnsi="Times New Roman"/>
+          <w:sz w:val="24"/>
+        </w:rPr>
+        <w:t xml:space="preserve"> e das pressões externas</w:t>
+      </w:r>
+      <w:r>
+        <w:rPr>
+          <w:rFonts w:ascii="Times New Roman" w:hAnsi="Times New Roman"/>
+          <w:sz w:val="24"/>
+        </w:rPr>
+        <w:t>. Com a triangulação, pomos lado a lado os registros dos documentos, os relatos dos profissionais e a materialidade documentada do campo. Não esperamos que tudo coincida, nem buscamos uma versão única do fenômeno.</w:t>
       </w:r>
     </w:p>
     <w:p>
@@ -3183,7 +3117,7 @@
           <w:rFonts w:ascii="Times New Roman" w:hAnsi="Times New Roman"/>
           <w:sz w:val="24"/>
         </w:rPr>
-        <w:t>4.4.3 Primeiro movimento: análise documental</w:t>
+        <w:t>Cada fonte terá tratamento próprio. As entrevistas e as eventuais respostas abertas do questionário passarão pela análise temática reflexiva. Os documentos pedagógicos serão lidos, no Capítulo 7, com uma matriz documental orientada pelas dimensões teóricas e pelos objetivos da pesquisa. O registro iconográfico já passou pelo protocolo descritivo e interpretativo apresentado adiante, aplicado no Capítulo 6. Depois, cruzaremos os resultados, respeitando o alcance e os limites de prova de cada fonte.</w:t>
       </w:r>
     </w:p>
     <w:p>
@@ -3197,7 +3131,7 @@
           <w:rFonts w:ascii="Times New Roman" w:hAnsi="Times New Roman"/>
           <w:sz w:val="24"/>
         </w:rPr>
-        <w:t>A análise documental nos leva à política em sua dimensão formal e institucional, contraponto necessário aos dados produzidos pelos questionários e pelas entrevistas. Segundo Marconi e Lakatos (2007, p. 172), os documentos usados nessa modalidade de pesquisa são “fontes primárias, ou seja, dados que ainda não receberam nenhum tratamento analítico, podendo ser de natureza diversa e abrangendo registros escritos ou institucionais”.</w:t>
+        <w:t>4.4.3 Primeiro movimento: análise documental</w:t>
       </w:r>
     </w:p>
     <w:p>
@@ -3211,21 +3145,7 @@
           <w:rFonts w:ascii="Times New Roman" w:hAnsi="Times New Roman"/>
           <w:sz w:val="24"/>
         </w:rPr>
-        <w:t xml:space="preserve">O corpus documental tem dois conjuntos, com finalidades diferentes. O primeiro, pedagógico e institucional, reúne o Projeto Político-Pedagógico (PPP), planos de aula das turmas </w:t>
-      </w:r>
-      <w:r>
-        <w:rPr>
-          <w:rFonts w:ascii="Times New Roman" w:hAnsi="Times New Roman"/>
-          <w:sz w:val="24"/>
-        </w:rPr>
-        <w:t>do 1º ao 5º ano</w:t>
-      </w:r>
-      <w:r>
-        <w:rPr>
-          <w:rFonts w:ascii="Times New Roman" w:hAnsi="Times New Roman"/>
-          <w:sz w:val="24"/>
-        </w:rPr>
-        <w:t>, atas de reuniões pedagógicas e os cadernos físicos de controle de uso do laboratório de informática e do kit multimídia. O segundo, administrativo e de aquisição, reúne os registros de contratação de conectividade, os termos de doação e de tombamento dos equipamentos destinados à escola e os documentos de execução dos recursos da Política de Inovação Educação Conectada (PIEC), que repassa anualmente à escola verba para a conexão, a distribuição do sinal de internet para uso pedagógico e a aquisição de recursos tecnológicos, com o respectivo plano de aplicação e a prestação de contas. Somam-se a eles eventuais contratos de manutenção e suporte técnico dos equipamentos e as respostas da escola ao Censo Escolar, disponíveis nos microdados do Instituto Nacional de Estudos e Pesquisas Educacionais Anísio Teixeira (INEP), que mostram o que a instituição declara ter [indicar ano e variáveis consultadas]. O conjunto administrativo mostra as condições materiais do contexto. Sua análise ainda não foi feita, e as informações que o Capítulo 6 traz sobre aquisição, conectividade e uso dos equipamentos são preliminares, a verificar. O pedagógico será lido com a matriz descrita adiante e analisado no Capítulo 7, junto com os registros das ações de formação continuada em tecnologias digitais oferecidas à rede desde 2023, que ainda serão solicitados à Secretaria Municipal de Educação.</w:t>
+        <w:t>A análise documental nos leva à política em sua dimensão formal e institucional, contraponto necessário aos dados produzidos pelos questionários e pelas entrevistas. Segundo Marconi e Lakatos (2007, p. 172), os documentos usados nessa modalidade de pesquisa são “fontes primárias, ou seja, dados que ainda não receberam nenhum tratamento analítico, podendo ser de natureza diversa e abrangendo registros escritos ou institucionais”.</w:t>
       </w:r>
     </w:p>
     <w:p>
@@ -3239,7 +3159,21 @@
           <w:rFonts w:ascii="Times New Roman" w:hAnsi="Times New Roman"/>
           <w:sz w:val="24"/>
         </w:rPr>
-        <w:t>Cada documento responde a uma pergunta. No PPP, procuraremos a concepção da escola sobre as tecnologias digitais, lendo-o como tradução local da política. Os planos de aula permitem confrontar as narrativas orais com o planejamento formal do ensino. As atas registram orientações da equipe gestora, decisões coletivas e eventuais tensões na rotina escolar. Os cadernos do laboratório e do kit multimídia oferecem indícios materiais sobre a regularidade e o modo de uso desses recursos. Os registros de formação mostram quando as ações formativas chegaram à rede e a quem se destinaram. A prestação de contas da PIEC indica o valor recebido pela escola e sua aplicação. O Censo Escolar permite comparar o declarado pela escola com o registrado nos cadernos de uso.</w:t>
+        <w:t xml:space="preserve">O corpus documental tem três conjuntos, com finalidades diferentes, um da rede e dois da escola. Os dois da escola são os seguintes. O primeiro, pedagógico e institucional, reúne o Projeto Político-Pedagógico (PPP), planos de aula das turmas </w:t>
+      </w:r>
+      <w:r>
+        <w:rPr>
+          <w:rFonts w:ascii="Times New Roman" w:hAnsi="Times New Roman"/>
+          <w:sz w:val="24"/>
+        </w:rPr>
+        <w:t>do 1º ao 5º ano</w:t>
+      </w:r>
+      <w:r>
+        <w:rPr>
+          <w:rFonts w:ascii="Times New Roman" w:hAnsi="Times New Roman"/>
+          <w:sz w:val="24"/>
+        </w:rPr>
+        <w:t>, atas de reuniões pedagógicas e os cadernos físicos de controle de uso do laboratório de informática e do kit multimídia. O segundo, administrativo e de aquisição, reúne os registros de contratação de conectividade, os termos de doação e de tombamento dos equipamentos destinados à escola e os documentos de execução dos recursos da Política de Inovação Educação Conectada (PIEC), que repassa anualmente à escola verba para a conexão, a distribuição do sinal de internet para uso pedagógico e a aquisição de recursos tecnológicos, com o respectivo plano de aplicação e a prestação de contas. Somam-se a eles eventuais contratos de manutenção e suporte técnico dos equipamentos e as respostas da escola ao Censo Escolar, disponíveis nos microdados do Instituto Nacional de Estudos e Pesquisas Educacionais Anísio Teixeira (INEP), que mostram o que a instituição declara ter [indicar ano e variáveis consultadas]. O conjunto administrativo mostra as condições materiais do contexto. Sua análise ainda não foi feita, e as informações que o Capítulo 6 traz sobre aquisição, conectividade e uso dos equipamentos são preliminares, a verificar. O pedagógico será lido com a matriz descrita adiante e analisado no Capítulo 7, junto com os registros das ações de formação continuada em tecnologias digitais oferecidas à rede desde 2023, já solicitados ao técnico da Secretaria Municipal de Educação.</w:t>
       </w:r>
     </w:p>
     <w:p>
@@ -3253,7 +3187,7 @@
           <w:rFonts w:ascii="Times New Roman" w:hAnsi="Times New Roman"/>
           <w:sz w:val="24"/>
         </w:rPr>
-        <w:t>Nenhum desses documentos será lido como relato literal ou neutro da realidade. Num estudo de caso, o documento institucional exige leitura crítica, atenta às condições de sua produção e ao sentido assumido no contexto investigado.</w:t>
+        <w:t>O conjunto da rede reúne o plano elaborado pela Secretaria para a rede, o currículo municipal e sua adequação à educação digital prevista na Resolução CNE/CEB nº 2/2025, os registros de formação continuada, as orientações, ofícios e comunicados enviados às escolas sobre a PNED ou a educação digital, o Plano Municipal de Educação, instituído pela Lei nº 517, de 24 de junho de 2015, com vigência decenal (TIBAU DO SUL, 2015) [conferir no texto da lei], e, se existirem, os diagnósticos de conectividade e de competências digitais das escolas. Como a vigência do plano terminou em 2025, será verificado junto à Secretaria se ele foi prorrogado ou substituído. À Prefeitura serão pedidos o Plano Diretor, a Lei Orgânica e o mapa ou memorial descritivo oficial do município, para a relação das localidades e os limites entre área urbana e rural.</w:t>
       </w:r>
     </w:p>
     <w:p>
@@ -3267,42 +3201,7 @@
           <w:rFonts w:ascii="Times New Roman" w:hAnsi="Times New Roman"/>
           <w:sz w:val="24"/>
         </w:rPr>
-        <w:t xml:space="preserve">Documentos e falas terão tratamentos diferentes. Os relatos orais seguirão a análise temática reflexiva de Braun e Clarke (2006), apresentada na seção 4.5. Os textos institucionais passarão por análise documental orientada por uma matriz temática prévia, que organiza a leitura e não se confunde com os temas finais construídos a partir das narrativas. No exame do PPP e dos planos de aula, no Capítulo 7, essa matriz terá </w:t>
-      </w:r>
-      <w:r>
-        <w:rPr>
-          <w:rFonts w:ascii="Times New Roman" w:hAnsi="Times New Roman"/>
-          <w:sz w:val="24"/>
-        </w:rPr>
-        <w:t>seis</w:t>
-      </w:r>
-      <w:r>
-        <w:rPr>
-          <w:rFonts w:ascii="Times New Roman" w:hAnsi="Times New Roman"/>
-          <w:sz w:val="24"/>
-        </w:rPr>
-        <w:t xml:space="preserve"> dimensões: a) a menção direta à educação digital e à PNED, ou sua ausência; b) a concepção de tecnologia expressa nos textos, entre o uso técnico e a perspectiva formativa ampla; c) o grau de articulação entre os objetivos declarados pela escola e as diretrizes curriculares nacionais; d) os indícios de adaptação, acolhimento ou omissão das orientações oficiais no planejamento dos profissionais da educação; e</w:t>
-      </w:r>
-      <w:r>
-        <w:rPr>
-          <w:rFonts w:ascii="Times New Roman" w:hAnsi="Times New Roman"/>
-          <w:sz w:val="24"/>
-        </w:rPr>
-        <w:t>) a concepção de cidadania presente nos documentos, com atenção à medida em que a educação digital se associa ao pensamento crítico e à proteção da infância</w:t>
-      </w:r>
-      <w:r>
-        <w:rPr>
-          <w:rFonts w:ascii="Times New Roman" w:hAnsi="Times New Roman"/>
-          <w:sz w:val="24"/>
-        </w:rPr>
-        <w:t>; e f) os registros e as evidências produzidos para prestar contas da educação digital, lidos em relação ao que as narrativas e o registro iconográfico mostram</w:t>
-      </w:r>
-      <w:r>
-        <w:rPr>
-          <w:rFonts w:ascii="Times New Roman" w:hAnsi="Times New Roman"/>
-          <w:sz w:val="24"/>
-        </w:rPr>
-        <w:t>.</w:t>
+        <w:t>Cada documento responde a uma pergunta. No PPP, procuraremos a concepção da escola sobre as tecnologias digitais, lendo-o como tradução local da política. Os planos de aula permitem confrontar as narrativas orais com o planejamento formal do ensino. As atas registram orientações da equipe gestora, decisões coletivas e eventuais tensões na rotina escolar. Os cadernos do laboratório e do kit multimídia oferecem indícios materiais sobre a regularidade e o modo de uso desses recursos. Os registros de formação mostram quando as ações formativas chegaram à rede e a quem se destinaram. A prestação de contas da PIEC indica o valor recebido pela escola e sua aplicação. O Censo Escolar permite comparar o declarado pela escola com o registrado nos cadernos de uso.</w:t>
       </w:r>
     </w:p>
     <w:p>
@@ -3316,7 +3215,7 @@
           <w:rFonts w:ascii="Times New Roman" w:hAnsi="Times New Roman"/>
           <w:sz w:val="24"/>
         </w:rPr>
-        <w:t>As categorias teóricas funcionarão como conceitos sensibilizadores. Elas orientam a primeira aproximação ao corpus e deixam espaço para que os dados tragam deslocamentos, tensões, combinações e sentidos novos. Os temas finais serão construídos em etapas, da familiarização com o material à codificação, à revisão, à organização e à interpretação, em diálogo com o referencial teórico, com os objetivos da pesquisa e com o posicionamento da pesquisadora (BRAUN; CLARKE, 2006, 2019).</w:t>
+        <w:t>Nenhum desses documentos será lido como relato literal ou neutro da realidade. Num estudo de caso, o documento institucional exige leitura crítica, atenta às condições de sua produção e ao sentido assumido no contexto investigado.</w:t>
       </w:r>
     </w:p>
     <w:p>
@@ -3330,21 +3229,42 @@
           <w:rFonts w:ascii="Times New Roman" w:hAnsi="Times New Roman"/>
           <w:sz w:val="24"/>
         </w:rPr>
-        <w:t xml:space="preserve">A cidadania, </w:t>
-      </w:r>
-      <w:r>
-        <w:rPr>
-          <w:rFonts w:ascii="Times New Roman" w:hAnsi="Times New Roman"/>
-          <w:sz w:val="24"/>
-        </w:rPr>
-        <w:t>quinta</w:t>
-      </w:r>
-      <w:r>
-        <w:rPr>
-          <w:rFonts w:ascii="Times New Roman" w:hAnsi="Times New Roman"/>
-          <w:sz w:val="24"/>
-        </w:rPr>
-        <w:t xml:space="preserve"> dimensão da matriz, permite comparar as noções de cidadania digital que aparecem no planejamento da escola, nos textos oficiais da política e nas narrativas dos profissionais. Os registros da análise documental serão organizados no ATLAS.ti e ligados às entrevistas e ao registro iconográfico, conforme os procedimentos da seção 4.5.</w:t>
+        <w:t xml:space="preserve">Documentos e falas terão tratamentos diferentes. Os relatos orais seguirão a análise temática reflexiva de Braun e Clarke (2006), apresentada na seção 4.5. Os textos institucionais passarão por análise documental orientada por uma matriz temática prévia, que organiza a leitura e não se confunde com os temas finais construídos a partir das narrativas. No exame do PPP e dos planos de aula, no Capítulo 7, essa matriz terá </w:t>
+      </w:r>
+      <w:r>
+        <w:rPr>
+          <w:rFonts w:ascii="Times New Roman" w:hAnsi="Times New Roman"/>
+          <w:sz w:val="24"/>
+        </w:rPr>
+        <w:t>seis</w:t>
+      </w:r>
+      <w:r>
+        <w:rPr>
+          <w:rFonts w:ascii="Times New Roman" w:hAnsi="Times New Roman"/>
+          <w:sz w:val="24"/>
+        </w:rPr>
+        <w:t xml:space="preserve"> dimensões: a) a menção direta à educação digital e à PNED, ou sua ausência; b) a concepção de tecnologia expressa nos textos, entre o uso técnico e a perspectiva formativa ampla; c) o grau de articulação entre os objetivos declarados pela escola e as diretrizes curriculares nacionais; d) os indícios de adaptação, acolhimento ou omissão das orientações oficiais no planejamento dos profissionais da educação; e</w:t>
+      </w:r>
+      <w:r>
+        <w:rPr>
+          <w:rFonts w:ascii="Times New Roman" w:hAnsi="Times New Roman"/>
+          <w:sz w:val="24"/>
+        </w:rPr>
+        <w:t>) a concepção de cidadania presente nos documentos, com atenção à medida em que a educação digital se associa ao pensamento crítico e à proteção da infância</w:t>
+      </w:r>
+      <w:r>
+        <w:rPr>
+          <w:rFonts w:ascii="Times New Roman" w:hAnsi="Times New Roman"/>
+          <w:sz w:val="24"/>
+        </w:rPr>
+        <w:t>; e f) os registros e as evidências produzidos para prestar contas da educação digital, lidos em relação ao que as narrativas e o registro iconográfico mostram</w:t>
+      </w:r>
+      <w:r>
+        <w:rPr>
+          <w:rFonts w:ascii="Times New Roman" w:hAnsi="Times New Roman"/>
+          <w:sz w:val="24"/>
+        </w:rPr>
+        <w:t>.</w:t>
       </w:r>
     </w:p>
     <w:p>
@@ -3358,7 +3278,7 @@
           <w:rFonts w:ascii="Times New Roman" w:hAnsi="Times New Roman"/>
           <w:sz w:val="24"/>
         </w:rPr>
-        <w:t>4.4.4 Segundo movimento: registro iconográfico</w:t>
+        <w:t>Os documentos da rede serão lidos com uma matriz própria, de cinco dimensões: a) a menção à PNED e à educação digital, ou sua ausência; b) as ações previstas, em currículo, formação, equipamentos e conectividade, com seus responsáveis, prazos e recursos; c) a diferenciação entre as localidades do município, as escolas do campo e a escola da comunidade quilombola, ou a ausência dela; d) as orientações dirigidas às escolas e as exigências de registro e de prestação de contas que as acompanham; e e) o lugar atribuído aos profissionais da educação na tradução da política. Essa leitura sustenta, no Capítulo 6, a resposta ao objetivo específico (a), retomada no Capítulo 7 com a entrevista do técnico.</w:t>
       </w:r>
     </w:p>
     <w:p>
@@ -3372,7 +3292,7 @@
           <w:rFonts w:ascii="Times New Roman" w:hAnsi="Times New Roman"/>
           <w:sz w:val="24"/>
         </w:rPr>
-        <w:t>Não observaremos aulas. O motivo está no objeto: investigamos como os profissionais interpretam, traduzem e recontextualizam as orientações da PNED nas condições em que trabalham, e a avaliação da prática pedagógica ou do desempenho dos estudantes fica fora desse escopo. Por isso, as principais fontes são as narrativas, os documentos institucionais e os registros da materialidade da escola. Sem observação, não podemos afirmar diretamente como a política acontece durante a aula, e assumimos essa limitação. Ball, Maguire e Braun (2016, p. 49) enfrentaram limite semelhante em seu estudo e o registraram assim: “Como a prática de sala de aula não era foco do estudo, a informação sobre o uso da tecnologia no ensino e na aprendizagem e como um aspecto da pedagogia limitado, nós temos de confiar nos relatos dos professores nessas questões”. Para chegar à dimensão material do contexto sem entrar nas aulas, recorremos ao registro iconográfico.</w:t>
+        <w:t>As categorias teóricas funcionarão como conceitos sensibilizadores. Elas orientam a primeira aproximação ao corpus e deixam espaço para que os dados tragam deslocamentos, tensões, combinações e sentidos novos. Os temas finais serão construídos em etapas, da familiarização com o material à codificação, à revisão, à organização e à interpretação, em diálogo com o referencial teórico, com os objetivos da pesquisa e com o posicionamento da pesquisadora (BRAUN; CLARKE, 2006, 2019).</w:t>
       </w:r>
     </w:p>
     <w:p>
@@ -3386,7 +3306,21 @@
           <w:rFonts w:ascii="Times New Roman" w:hAnsi="Times New Roman"/>
           <w:sz w:val="24"/>
         </w:rPr>
-        <w:t>A escolha se apoia em Milton Santos, para quem a paisagem conserva as formas de outros tempos: “Cada forma sobre a paisagem é criada como resposta a certas necessidades ou funções do presente. O tempo vai passando, mas a forma continua a existir. Conseqüentemente, o passado técnico da forma é uma realidade a ser levada em consideração quando se tenta analisar o espaço” (SANTOS, 2012, p. 73). Por essa concepção, cada registro visual informa sobre uma etapa material da produção do território de Pipa e da própria escola. O registro iconográfico documenta o que chamamos de rugosidade tecnológica, isto é, equipamentos e estruturas de iniciativas anteriores à PNED ainda presentes na escola quando a política lhe atribui uma nova função. A imagem é evidência da configuração material visível no momento do registro, sem valor de prova sobre as práticas e as intenções dos profissionais. Como os documentos, as imagens são produções situadas, marcadas por intenções de representação, e pedem interpretação crítica.</w:t>
+        <w:t xml:space="preserve">A cidadania, </w:t>
+      </w:r>
+      <w:r>
+        <w:rPr>
+          <w:rFonts w:ascii="Times New Roman" w:hAnsi="Times New Roman"/>
+          <w:sz w:val="24"/>
+        </w:rPr>
+        <w:t>quinta</w:t>
+      </w:r>
+      <w:r>
+        <w:rPr>
+          <w:rFonts w:ascii="Times New Roman" w:hAnsi="Times New Roman"/>
+          <w:sz w:val="24"/>
+        </w:rPr>
+        <w:t xml:space="preserve"> dimensão da matriz, permite comparar as noções de cidadania digital que aparecem no planejamento da escola, nos textos oficiais da política e nas narrativas dos profissionais. Os registros da análise documental serão organizados no ATLAS.ti e ligados às entrevistas e ao registro iconográfico, conforme os procedimentos da seção 4.5.</w:t>
       </w:r>
     </w:p>
     <w:p>
@@ -3400,21 +3334,7 @@
           <w:rFonts w:ascii="Times New Roman" w:hAnsi="Times New Roman"/>
           <w:sz w:val="24"/>
         </w:rPr>
-        <w:t xml:space="preserve">O registro iconográfico alcança informações dificilmente obtidas com a mesma precisão nos relatos orais: datas inscritas nas próprias imagens, objetos presentes ou ausentes num espaço, o estado dos equipamentos no momento do registro. Seus resultados estão no Capítulo 6; as hipóteses levantadas ali dependem das narrativas para serem esclarecidas. Para a conexão, o registro será complementado por testes de velocidade nas salas </w:t>
-      </w:r>
-      <w:r>
-        <w:rPr>
-          <w:rFonts w:ascii="Times New Roman" w:hAnsi="Times New Roman"/>
-          <w:sz w:val="24"/>
-        </w:rPr>
-        <w:t>dos anos iniciais</w:t>
-      </w:r>
-      <w:r>
-        <w:rPr>
-          <w:rFonts w:ascii="Times New Roman" w:hAnsi="Times New Roman"/>
-          <w:sz w:val="24"/>
-        </w:rPr>
-        <w:t xml:space="preserve"> e no laboratório, em dias e horários de aula e sem participação de pessoas [indicar ferramenta, datas e protocolo]. Com eles, poderemos dizer se o sinal chega às salas e em quais condições, informação ausente das fotografias.</w:t>
+        <w:t>4.4.4 Segundo movimento: leitura do território municipal e registro iconográfico</w:t>
       </w:r>
     </w:p>
     <w:p>
@@ -3428,35 +3348,7 @@
           <w:rFonts w:ascii="Times New Roman" w:hAnsi="Times New Roman"/>
           <w:sz w:val="24"/>
         </w:rPr>
-        <w:t xml:space="preserve">O corpus iconográfico, catalogado no Apêndice F (Caderno Iconográfico da Pesquisa), reúne as trinta e </w:t>
-      </w:r>
-      <w:r>
-        <w:rPr>
-          <w:rFonts w:ascii="Times New Roman" w:hAnsi="Times New Roman"/>
-          <w:sz w:val="24"/>
-        </w:rPr>
-        <w:t>oito</w:t>
-      </w:r>
-      <w:r>
-        <w:rPr>
-          <w:rFonts w:ascii="Times New Roman" w:hAnsi="Times New Roman"/>
-          <w:sz w:val="24"/>
-        </w:rPr>
-        <w:t xml:space="preserve"> figuras analisadas no Capítulo 6, entre fotografias</w:t>
-      </w:r>
-      <w:r>
-        <w:rPr>
-          <w:rFonts w:ascii="Times New Roman" w:hAnsi="Times New Roman"/>
-          <w:sz w:val="24"/>
-        </w:rPr>
-        <w:t xml:space="preserve"> e mapas de localização</w:t>
-      </w:r>
-      <w:r>
-        <w:rPr>
-          <w:rFonts w:ascii="Times New Roman" w:hAnsi="Times New Roman"/>
-          <w:sz w:val="24"/>
-        </w:rPr>
-        <w:t xml:space="preserve">, e duas peças cartográficas complementares, identificadas como F.1 e F.2, de função auxiliar.</w:t>
+        <w:t>O segundo movimento começa pelo município. A leitura do território municipal usa dados do IBGE, como a população, sua distribuição entre área urbana e rural e a população quilombola, e do Censo Escolar, escola por escola, com localização, etapas, matrículas, conectividade e equipamentos declarados [indicar ano e variáveis consultadas], para mostrar como a rede se distribui entre as localidades e em que condições cada uma recebe a política. Esses dados descrevem a rede; as demais escolas não são campo empírico, e nenhum profissional delas será ouvido. Na escola de Pipa, o movimento se completa com o registro iconográfico, apresentado a seguir.</w:t>
       </w:r>
     </w:p>
     <w:p>
@@ -3470,7 +3362,7 @@
           <w:rFonts w:ascii="Times New Roman" w:hAnsi="Times New Roman"/>
           <w:sz w:val="24"/>
         </w:rPr>
-        <w:t>Esses materiais têm funções diferentes. As fotografias de campo registram como estão hoje a escola e seu entorno. Os registros históricos do acervo do Museu Digital de Pipa situam o território no tempo, e as peças de divulgação turística são lidas como representações discursivas sobre Pipa. Separar essas funções evita tratar como equivalentes imagens produzidas em contextos e com finalidades diferentes.</w:t>
+        <w:t>Não observaremos aulas. O motivo está no objeto: investigamos como os profissionais interpretam, traduzem e recontextualizam as orientações da PNED nas condições em que trabalham, e a avaliação da prática pedagógica ou do desempenho dos estudantes fica fora desse escopo. Por isso, as principais fontes são as narrativas, os documentos institucionais e os registros da materialidade da escola. Sem observação, não podemos afirmar diretamente como a política acontece durante a aula, e assumimos essa limitação. Ball, Maguire e Braun (2016, p. 49) enfrentaram limite semelhante em seu estudo e o registraram assim: “Como a prática de sala de aula não era foco do estudo, a informação sobre o uso da tecnologia no ensino e na aprendizagem e como um aspecto da pedagogia limitado, nós temos de confiar nos relatos dos professores nessas questões”. Para chegar à dimensão material do contexto sem entrar nas aulas, recorremos ao registro iconográfico.</w:t>
       </w:r>
     </w:p>
     <w:p>
@@ -3484,7 +3376,7 @@
           <w:rFonts w:ascii="Times New Roman" w:hAnsi="Times New Roman"/>
           <w:sz w:val="24"/>
         </w:rPr>
-        <w:t xml:space="preserve">No índice do Apêndice F, cada item tem código, título, seção da tese em que é discutido e eixo temático de catalogação. A procedência e a data aparecem na linha de fonte da figura, e o texto que a introduz diz, antes da análise, o que ela pretende documentar. O acervo se divide em seis eixos, que acompanham a estrutura do Capítulo 6: o território histórico anterior ao turismo de massa; o território contemporâneo e suas dinâmicas de conexão; os ambientes físicos da Escola Municipal Domitila Castelo da Silva; as condições materiais da educação digital na unidade escolar; os diagramas analíticos de elaboração própria; e a cartografia de localização.</w:t>
+        <w:t>A escolha se apoia em Milton Santos, para quem a paisagem conserva as formas de outros tempos: “Cada forma sobre a paisagem é criada como resposta a certas necessidades ou funções do presente. O tempo vai passando, mas a forma continua a existir. Conseqüentemente, o passado técnico da forma é uma realidade a ser levada em consideração quando se tenta analisar o espaço” (SANTOS, 2012, p. 73). Por essa concepção, cada registro visual informa sobre uma etapa material da produção do território de Pipa e da própria escola. O registro iconográfico documenta o que chamamos de rugosidade tecnológica, isto é, equipamentos e estruturas de iniciativas anteriores à PNED ainda presentes na escola quando a política lhe atribui uma nova função. A imagem é evidência da configuração material visível no momento do registro, sem valor de prova sobre as práticas e as intenções dos profissionais. Como os documentos, as imagens são produções situadas, marcadas por intenções de representação, e pedem interpretação crítica.</w:t>
       </w:r>
     </w:p>
     <w:p>
@@ -3498,21 +3390,21 @@
           <w:rFonts w:ascii="Times New Roman" w:hAnsi="Times New Roman"/>
           <w:sz w:val="24"/>
         </w:rPr>
-        <w:t>Por razões éticas, preservamos a identidade das crianças e dos profissionais. As imagens privilegiam planos de detalhe dos recursos materiais, das instalações físicas e das produções murais, e nenhuma mostra rosto de criança. Os demais cuidados éticos com as fotografias estão na subseção 4.5.</w:t>
-      </w:r>
-      <w:r>
-        <w:rPr>
-          <w:rFonts w:ascii="Times New Roman" w:hAnsi="Times New Roman"/>
-          <w:sz w:val="24"/>
-        </w:rPr>
-        <w:t>2</w:t>
-      </w:r>
-      <w:r>
-        <w:rPr>
-          <w:rFonts w:ascii="Times New Roman" w:hAnsi="Times New Roman"/>
-          <w:sz w:val="24"/>
-        </w:rPr>
-        <w:t>.</w:t>
+        <w:t xml:space="preserve">O registro iconográfico alcança informações dificilmente obtidas com a mesma precisão nos relatos orais: datas inscritas nas próprias imagens, objetos presentes ou ausentes num espaço, o estado dos equipamentos no momento do registro. Seus resultados estão no Capítulo 6; as hipóteses levantadas ali dependem das narrativas para serem esclarecidas. Para a conexão, o registro será complementado por testes de velocidade nas salas </w:t>
+      </w:r>
+      <w:r>
+        <w:rPr>
+          <w:rFonts w:ascii="Times New Roman" w:hAnsi="Times New Roman"/>
+          <w:sz w:val="24"/>
+        </w:rPr>
+        <w:t>dos anos iniciais</w:t>
+      </w:r>
+      <w:r>
+        <w:rPr>
+          <w:rFonts w:ascii="Times New Roman" w:hAnsi="Times New Roman"/>
+          <w:sz w:val="24"/>
+        </w:rPr>
+        <w:t xml:space="preserve"> e no laboratório, em dias e horários de aula e sem participação de pessoas [indicar ferramenta, datas e protocolo]. Com eles, poderemos dizer se o sinal chega às salas e em quais condições, informação ausente das fotografias.</w:t>
       </w:r>
     </w:p>
     <w:p>
@@ -3526,7 +3418,35 @@
           <w:rFonts w:ascii="Times New Roman" w:hAnsi="Times New Roman"/>
           <w:sz w:val="24"/>
         </w:rPr>
-        <w:t>A leitura das fotografias tem duas etapas. Na descritiva, anotamos os objetos presentes, as características arquitetônicas e os sinais visíveis de conservação ou desgaste das instalações, sem juízo prévio. Na interpretativa, relacionamos o descrito às categorias teóricas da pesquisa (infraestrutura, mediação institucional, condições materiais) e aos objetivos da tese. Com as etapas separadas, o leitor pode conferir o que a imagem mostra antes de avaliar o que concluímos dela.</w:t>
+        <w:t xml:space="preserve">O corpus iconográfico, catalogado no Apêndice F (Caderno Iconográfico da Pesquisa), reúne as trinta e </w:t>
+      </w:r>
+      <w:r>
+        <w:rPr>
+          <w:rFonts w:ascii="Times New Roman" w:hAnsi="Times New Roman"/>
+          <w:sz w:val="24"/>
+        </w:rPr>
+        <w:t>oito</w:t>
+      </w:r>
+      <w:r>
+        <w:rPr>
+          <w:rFonts w:ascii="Times New Roman" w:hAnsi="Times New Roman"/>
+          <w:sz w:val="24"/>
+        </w:rPr>
+        <w:t xml:space="preserve"> figuras analisadas no Capítulo 6, entre fotografias</w:t>
+      </w:r>
+      <w:r>
+        <w:rPr>
+          <w:rFonts w:ascii="Times New Roman" w:hAnsi="Times New Roman"/>
+          <w:sz w:val="24"/>
+        </w:rPr>
+        <w:t xml:space="preserve"> e mapas de localização</w:t>
+      </w:r>
+      <w:r>
+        <w:rPr>
+          <w:rFonts w:ascii="Times New Roman" w:hAnsi="Times New Roman"/>
+          <w:sz w:val="24"/>
+        </w:rPr>
+        <w:t xml:space="preserve">, e duas peças cartográficas complementares, identificadas como F.1 e F.2, de função auxiliar.</w:t>
       </w:r>
     </w:p>
     <w:p>
@@ -3540,7 +3460,7 @@
           <w:rFonts w:ascii="Times New Roman" w:hAnsi="Times New Roman"/>
           <w:sz w:val="24"/>
         </w:rPr>
-        <w:t>O instrumento tem alcance limitado. As fotografias documentam a organização dos espaços, os recursos existentes e as limitações estruturais visíveis na escola. Práticas pedagógicas, motivações dos profissionais e qualidade das interações educativas escapam ao que elas podem provar. Uma sala sem equipamento atesta uma limitação material; o modo como os profissionais lidam com ela no dia a dia, somente as narrativas poderão mostrar.</w:t>
+        <w:t>Esses materiais têm funções diferentes. As fotografias de campo registram como estão hoje a escola e seu entorno. Os registros históricos do acervo do Museu Digital de Pipa situam o território no tempo, e as peças de divulgação turística são lidas como representações discursivas sobre Pipa. Separar essas funções evita tratar como equivalentes imagens produzidas em contextos e com finalidades diferentes.</w:t>
       </w:r>
     </w:p>
     <w:p>
@@ -3554,7 +3474,7 @@
           <w:rFonts w:ascii="Times New Roman" w:hAnsi="Times New Roman"/>
           <w:sz w:val="24"/>
         </w:rPr>
-        <w:t>4.4.5 Terceiro movimento: questionário de perfil e percepções</w:t>
+        <w:t xml:space="preserve">No índice do Apêndice F, cada item tem código, título, seção da tese em que é discutido e eixo temático de catalogação. A procedência e a data aparecem na linha de fonte da figura, e o texto que a introduz diz, antes da análise, o que ela pretende documentar. O acervo se divide em seis eixos, que acompanham a estrutura do Capítulo 6: o território histórico anterior ao turismo de massa; o território contemporâneo e suas dinâmicas de conexão; os ambientes físicos da Escola Municipal Domitila Castelo da Silva; as condições materiais da educação digital na unidade escolar; os diagramas analíticos de elaboração própria; e a cartografia de localização.</w:t>
       </w:r>
     </w:p>
     <w:p>
@@ -3568,6 +3488,76 @@
           <w:rFonts w:ascii="Times New Roman" w:hAnsi="Times New Roman"/>
           <w:sz w:val="24"/>
         </w:rPr>
+        <w:t>Por razões éticas, preservamos a identidade das crianças e dos profissionais. As imagens privilegiam planos de detalhe dos recursos materiais, das instalações físicas e das produções murais, e nenhuma mostra rosto de criança. Os demais cuidados éticos com as fotografias estão na subseção 4.5.</w:t>
+      </w:r>
+      <w:r>
+        <w:rPr>
+          <w:rFonts w:ascii="Times New Roman" w:hAnsi="Times New Roman"/>
+          <w:sz w:val="24"/>
+        </w:rPr>
+        <w:t>2</w:t>
+      </w:r>
+      <w:r>
+        <w:rPr>
+          <w:rFonts w:ascii="Times New Roman" w:hAnsi="Times New Roman"/>
+          <w:sz w:val="24"/>
+        </w:rPr>
+        <w:t>.</w:t>
+      </w:r>
+    </w:p>
+    <w:p>
+      <w:pPr>
+        <w:spacing w:line="360" w:lineRule="auto"/>
+        <w:ind w:firstLine="709"/>
+        <w:jc w:val="both"/>
+      </w:pPr>
+      <w:r>
+        <w:rPr>
+          <w:rFonts w:ascii="Times New Roman" w:hAnsi="Times New Roman"/>
+          <w:sz w:val="24"/>
+        </w:rPr>
+        <w:t>A leitura das fotografias tem duas etapas. Na descritiva, anotamos os objetos presentes, as características arquitetônicas e os sinais visíveis de conservação ou desgaste das instalações, sem juízo prévio. Na interpretativa, relacionamos o descrito às categorias teóricas da pesquisa (infraestrutura, mediação institucional, condições materiais) e aos objetivos da tese. Com as etapas separadas, o leitor pode conferir o que a imagem mostra antes de avaliar o que concluímos dela.</w:t>
+      </w:r>
+    </w:p>
+    <w:p>
+      <w:pPr>
+        <w:spacing w:line="360" w:lineRule="auto"/>
+        <w:ind w:firstLine="709"/>
+        <w:jc w:val="both"/>
+      </w:pPr>
+      <w:r>
+        <w:rPr>
+          <w:rFonts w:ascii="Times New Roman" w:hAnsi="Times New Roman"/>
+          <w:sz w:val="24"/>
+        </w:rPr>
+        <w:t>O instrumento tem alcance limitado. As fotografias documentam a organização dos espaços, os recursos existentes e as limitações estruturais visíveis na escola. Práticas pedagógicas, motivações dos profissionais e qualidade das interações educativas escapam ao que elas podem provar. Uma sala sem equipamento atesta uma limitação material; o modo como os profissionais lidam com ela no dia a dia, somente as narrativas poderão mostrar.</w:t>
+      </w:r>
+    </w:p>
+    <w:p>
+      <w:pPr>
+        <w:spacing w:line="360" w:lineRule="auto"/>
+        <w:ind w:firstLine="709"/>
+        <w:jc w:val="both"/>
+      </w:pPr>
+      <w:r>
+        <w:rPr>
+          <w:rFonts w:ascii="Times New Roman" w:hAnsi="Times New Roman"/>
+          <w:sz w:val="24"/>
+        </w:rPr>
+        <w:t>4.4.5 Terceiro movimento: questionário de perfil e percepções</w:t>
+      </w:r>
+    </w:p>
+    <w:p>
+      <w:pPr>
+        <w:spacing w:line="360" w:lineRule="auto"/>
+        <w:ind w:firstLine="709"/>
+        <w:jc w:val="both"/>
+      </w:pPr>
+      <w:r>
+        <w:rPr>
+          <w:rFonts w:ascii="Times New Roman" w:hAnsi="Times New Roman"/>
+          <w:sz w:val="24"/>
+        </w:rPr>
         <w:t>O questionário de perfil mapeará as condições sociodemográficas e profissionais dos participantes antes das entrevistas. Mais do que um cadastro, ele situa as pessoas nas condições materiais e funcionais em que vivem a política. Numa pesquisa sobre a perspectiva dos profissionais da educação, conhecer a trajetória acadêmica, o tempo de carreira e a estabilidade profissional de cada participante é indispensável para contextualizar suas falas. Marconi e Lakatos (2007) definem assim o instrumento:</w:t>
       </w:r>
     </w:p>
@@ -3785,7 +3775,7 @@
           <w:rFonts w:ascii="Times New Roman" w:hAnsi="Times New Roman"/>
           <w:sz w:val="24"/>
         </w:rPr>
-        <w:t>Com o técnico da Secretaria Municipal de Educação, o roteiro aborda a compreensão municipal da PNED, as orientações repassadas às escolas, as ações realizadas, os processos de formação, as formas de acompanhamento, as condições oferecidas às unidades escolares e as dificuldades e possibilidades percebidas. Essa escuta ajuda a compreender como a política é recebida e traduzida no âmbito municipal antes de chegar à escola. Em todos os casos, as perguntas abertas precedem as diretas, e as noções de resistência, performatividade e fabricação não serão apresentadas aos participantes, para que eles descrevam suas experiências nos próprios termos.</w:t>
+        <w:t>A primeira entrevista será com o técnico da Secretaria Municipal de Educação. O roteiro (Apêndice E, Parte 4) aborda a compreensão municipal da PNED, o plano elaborado para a rede, o currículo municipal, as orientações repassadas às escolas, as ações realizadas, os processos de formação, as formas de acompanhamento, as condições oferecidas às unidades escolares, o modo como a Secretaria considera as especificidades das localidades, das escolas do campo e da escola quilombola, e as dificuldades e possibilidades percebidas. Essa escuta abre a investigação e permite compreender como a política é recebida e traduzida no âmbito municipal antes de chegar à escola. Em todos os casos, as perguntas abertas precedem as diretas, e as noções de resistência, performatividade e fabricação não serão apresentadas aos participantes, para que eles descrevam suas experiências nos próprios termos.</w:t>
       </w:r>
     </w:p>
     <w:p>
@@ -4189,7 +4179,7 @@
           <w:rFonts w:ascii="Times New Roman" w:hAnsi="Times New Roman"/>
           <w:sz w:val="24"/>
         </w:rPr>
-        <w:t>Tomamos cuidados específicos contra a identificação inferencial, que acontece quando a descrição de uma função ou a menção a um episódio singular da rotina acaba revelando quem fez uma crítica dentro da própria instituição. A inclusão da direção escolar pede atenção redobrada, porque o cargo é único. Quatro salvaguardas reduzem esse risco, embora não o eliminem.</w:t>
+        <w:t>Tomamos cuidados específicos contra a identificação inferencial, que acontece quando a descrição de uma função ou a menção a um episódio singular da rotina acaba revelando quem fez uma crítica dentro da própria instituição. A inclusão da direção escolar pede atenção redobrada, porque o cargo é único, e o mesmo vale para o técnico da Secretaria, único participante da rede, cuja função o torna identificável. O TCLE informará esse limite do anonimato, e as citações de sua entrevista tratarão da política municipal, sem atribuir a ele avaliações sobre colegas ou escolas. Quatro salvaguardas reduzem esse risco, embora não o eliminem.</w:t>
       </w:r>
     </w:p>
     <w:p>
@@ -4455,21 +4445,7 @@
           <w:rFonts w:ascii="Times New Roman" w:hAnsi="Times New Roman"/>
           <w:sz w:val="24"/>
         </w:rPr>
-        <w:t xml:space="preserve">O campo tem quatro etapas, distribuídas em dez semanas. As duas primeiras são de entrada formal. Vamos apresentar a pesquisa à equipe gestora e à Secretaria Municipal de Educação, explicar os objetivos do estudo e recolher as assinaturas dos Termos de Consentimento Livre e Esclarecido. Nessa etapa, os critérios </w:t>
-      </w:r>
-      <w:r>
-        <w:rPr>
-          <w:rFonts w:ascii="Times New Roman" w:hAnsi="Times New Roman"/>
-          <w:sz w:val="24"/>
-        </w:rPr>
-        <w:t>de leitura das formas de atuação, descritos na seção 4.3,</w:t>
-      </w:r>
-      <w:r>
-        <w:rPr>
-          <w:rFonts w:ascii="Times New Roman" w:hAnsi="Times New Roman"/>
-          <w:sz w:val="24"/>
-        </w:rPr>
-        <w:t xml:space="preserve"> são datados e assinados, antes da primeira entrevista, e a pesquisadora pede à Secretaria e à escola os documentos administrativos, de aquisição e pedagógicos e os registros de formação. Ao mesmo tempo, ela vai se familiarizando com a rotina da escola.</w:t>
+        <w:t>O campo tem quatro etapas, distribuídas em dez semanas. As duas primeiras são de entrada formal. Vamos apresentar a pesquisa à Secretaria Municipal de Educação e à equipe gestora da escola, explicar os objetivos do estudo e recolher as assinaturas dos Termos de Consentimento Livre e Esclarecido. Nessa etapa, os critérios de leitura das formas de atuação, descritos na seção 4.3, são datados e assinados, antes da primeira entrevista, e a pesquisadora confirma o recebimento dos documentos já solicitados ao técnico da Secretaria e à direção da escola e pede os que faltarem. Ao mesmo tempo, ela vai se familiarizando com a rotina da escola.</w:t>
       </w:r>
     </w:p>
     <w:p>
@@ -4511,63 +4487,7 @@
           <w:rFonts w:ascii="Times New Roman" w:hAnsi="Times New Roman"/>
           <w:sz w:val="24"/>
         </w:rPr>
-        <w:t xml:space="preserve">Vêm então quatro semanas, núcleo da produção dos dados orais e documentais. Na primeira quinzena, entrevistaremos a coordenadora pedagógica, a vice-diretora, o diretor e o técnico da Secretaria Municipal de Educação,</w:t>
-      </w:r>
-      <w:r>
-        <w:rPr>
-          <w:rFonts w:ascii="Times New Roman" w:hAnsi="Times New Roman"/>
-          <w:sz w:val="24"/>
-        </w:rPr>
-        <w:t xml:space="preserve"/>
-      </w:r>
-      <w:r>
-        <w:rPr>
-          <w:rFonts w:ascii="Times New Roman" w:hAnsi="Times New Roman"/>
-          <w:sz w:val="24"/>
-        </w:rPr>
-        <w:t xml:space="preserve"> para mapear o quadro institucional que orienta o acompanhamento da política </w:t>
-      </w:r>
-      <w:r>
-        <w:rPr>
-          <w:rFonts w:ascii="Times New Roman" w:hAnsi="Times New Roman"/>
-          <w:sz w:val="24"/>
-        </w:rPr>
-        <w:t>na escola</w:t>
-      </w:r>
-      <w:r>
-        <w:rPr>
-          <w:rFonts w:ascii="Times New Roman" w:hAnsi="Times New Roman"/>
-          <w:sz w:val="24"/>
-        </w:rPr>
-        <w:t xml:space="preserve">. Na segunda, faremos as entrevistas individuais com os </w:t>
-      </w:r>
-      <w:r>
-        <w:rPr>
-          <w:rFonts w:ascii="Times New Roman" w:hAnsi="Times New Roman"/>
-          <w:sz w:val="24"/>
-        </w:rPr>
-        <w:t>docentes das turmas do 1º ao 5º ano e com os demais profissionais</w:t>
-      </w:r>
-      <w:r>
-        <w:rPr>
-          <w:rFonts w:ascii="Times New Roman" w:hAnsi="Times New Roman"/>
-          <w:sz w:val="24"/>
-        </w:rPr>
-        <w:t>, em ambiente reservado e com gravação em áudio consentida</w:t>
-      </w:r>
-      <w:r>
-        <w:rPr>
-          <w:rFonts w:ascii="Times New Roman" w:hAnsi="Times New Roman"/>
-          <w:sz w:val="24"/>
-        </w:rPr>
-        <w:t>. Se o número de participantes exigir, essa etapa será estendida</w:t>
-      </w:r>
-      <w:r>
-        <w:rPr>
-          <w:rFonts w:ascii="Times New Roman" w:hAnsi="Times New Roman"/>
-          <w:sz w:val="24"/>
-        </w:rPr>
-        <w:t>. Em paralelo, faremos a análise documental e, se for preciso, completaremos o caderno iconográfico e faremos os testes de velocidade da conexão nas salas.</w:t>
+        <w:t>Vêm então quatro semanas, núcleo da produção dos dados orais e documentais. Na primeira quinzena, entrevistaremos, nesta ordem, o técnico da Secretaria Municipal de Educação, a coordenadora pedagógica, a vice-diretora e o diretor, para mapear, da rede à escola, o quadro institucional que orienta o acompanhamento da política. Na segunda, faremos as entrevistas individuais com os docentes das turmas do 1º ao 5º ano e com os demais profissionais, em ambiente reservado e com gravação em áudio consentida. Se o número de participantes exigir, essa etapa será estendida. Em paralelo, faremos a análise documental, da rede e da escola, e, se for preciso, completaremos o caderno iconográfico e faremos os testes de velocidade da conexão nas salas.</w:t>
       </w:r>
     </w:p>
     <w:p>
@@ -4665,7 +4585,7 @@
           <w:rFonts w:ascii="Times New Roman" w:hAnsi="Times New Roman"/>
           <w:sz w:val="24"/>
         </w:rPr>
-        <w:t xml:space="preserve">A posicionalidade da pesquisadora, discutida na seção 4.1, é o limite mais difícil de administrar. Pesquisar a própria rede não é confortável. Os anos de residência em Pipa, quase duas décadas de convivência com o território e dezoito anos na rede municipal, inclusive na escola pesquisada, criam uma relação de pertencimento com o campo que nenhum procedimento técnico neutraliza por completo. Os riscos são dois: naturalizar rotinas que parecem óbvias a quem convive com a rede e receber respostas convenientes de profissionais que conhecem a trajetória da pesquisadora. Triangulação, checagem das sínteses, diário de campo, discussão com pares, diálogo com a orientadora e a Declaração de Reflexividade do Apêndice G ajudam a controlar esses riscos. Ainda assim, podem restar pontos cegos sobre a lógica administrativa ou sobre conflitos internos.</w:t>
+        <w:t>O desenho em funil tem um limite próprio. A rede municipal é lida pelos documentos, pelos dados públicos e pela entrevista com um único técnico, e as demais escolas não são ouvidas. O que a tese disser sobre a tradução municipal da PNED para as localidades virá desses registros, sem a perspectiva das outras escolas sobre as orientações que receberam.</w:t>
       </w:r>
     </w:p>
     <w:p>
@@ -4679,7 +4599,7 @@
           <w:rFonts w:ascii="Times New Roman" w:hAnsi="Times New Roman"/>
           <w:sz w:val="24"/>
         </w:rPr>
-        <w:t>A temporalidade da política traz outro limite. A PNED foi promulgada em 2023, e os dados retratam o começo de sua chegada ao cotidiano escolar, momento de dúvidas, adaptações graduais e incertezas típicas do encontro entre uma lei nova e uma rede com rotinas estabelecidas. O conhecimento produzido fica restrito a essa fase inicial de recepção e apropriação. O mesmo vale para a formação: se as ações formativas estiverem começando agora, os dados registrarão um momento em que a exigência curricular chegou antes da formação correspondente, hipótese a ser conferida nos registros da Secretaria e no questionário.</w:t>
+        <w:t xml:space="preserve">A posicionalidade da pesquisadora, discutida na seção 4.1, é o limite mais difícil de administrar. Pesquisar a própria rede não é confortável. Os anos de residência em Pipa, quase duas décadas de convivência com o território e dezoito anos na rede municipal, inclusive na escola pesquisada, criam uma relação de pertencimento com o campo que nenhum procedimento técnico neutraliza por completo. Os riscos são dois: naturalizar rotinas que parecem óbvias a quem convive com a rede e receber respostas convenientes de profissionais que conhecem a trajetória da pesquisadora. Triangulação, checagem das sínteses, diário de campo, discussão com pares, diálogo com a orientadora e a Declaração de Reflexividade do Apêndice G ajudam a controlar esses riscos. Ainda assim, podem restar pontos cegos sobre a lógica administrativa ou sobre conflitos internos.</w:t>
       </w:r>
     </w:p>
     <w:p>
@@ -4693,7 +4613,7 @@
           <w:rFonts w:ascii="Times New Roman" w:hAnsi="Times New Roman"/>
           <w:sz w:val="24"/>
         </w:rPr>
-        <w:t>Há também o acesso mediado às culturas infantis. Por opção da pesquisa, as crianças não participam diretamente da produção de dados, e suas experiências com tecnologias chegarão até nós pelos relatos dos adultos. Por isso, não afirmaremos efeitos sobre as aprendizagens das crianças; os riscos a elas relacionados serão examinados a partir dos relatos dos profissionais e dos registros documentais. Esse recorte acompanha o objeto da tese, a atuação e a perspectiva dos profissionais da educação diante da política pública. Pelo mesmo motivo, não haverá observação participante nas salas de aula, uma vez que a avaliação das práticas didáticas não integra os objetivos da pesquisa. Entrevistas, documentos pedagógicos e registro iconográfico compensam, em parte, a ausência dessa técnica.</w:t>
+        <w:t>A temporalidade da política traz outro limite. A PNED foi promulgada em 2023, e os dados retratam o começo de sua chegada ao cotidiano escolar, momento de dúvidas, adaptações graduais e incertezas típicas do encontro entre uma lei nova e uma rede com rotinas estabelecidas. O conhecimento produzido fica restrito a essa fase inicial de recepção e apropriação. O mesmo vale para a formação: se as ações formativas estiverem começando agora, os dados registrarão um momento em que a exigência curricular chegou antes da formação correspondente, hipótese a ser conferida nos registros da Secretaria e no questionário.</w:t>
       </w:r>
     </w:p>
     <w:p>
@@ -4707,20 +4627,7 @@
           <w:rFonts w:ascii="Times New Roman" w:hAnsi="Times New Roman"/>
           <w:sz w:val="24"/>
         </w:rPr>
-        <w:t>Sem observação, pode haver diferença entre o que se conta nas entrevistas, o que está nos planos de aula e o que acontece nas atividades pedagógicas. Essa diferença será tratada como dado. Se um plano de aula previr o uso de tecnologias e os registros materiais indicarem outras condições, ou se a entrevista revelar adaptações não formalizadas no planejamento, examinaremos essas situações como possíveis tensões entre o prescrito, as condições materiais e o trabalho dos profissionais. A triangulação serve para mapear os pontos de atrito entre as diretrizes formais, as falas e a materialidade. Auditar a “verdade” da sala de aula está fora do alcance e das pretensões desta pesquisa. As fotografias, por sua vez, têm os limites descritos na seção 4.4.</w:t>
-      </w:r>
-    </w:p>
-    <w:p>
-      <w:pPr>
-        <w:spacing w:line="360" w:lineRule="auto" w:before="240" w:after="240"/>
-      </w:pPr>
-      <w:r>
-        <w:rPr>
-          <w:rFonts w:ascii="Times New Roman" w:hAnsi="Times New Roman"/>
-          <w:b/>
-          <w:sz w:val="24"/>
-        </w:rPr>
-        <w:t>4.6 SÍNTESE DO CAPÍTULO</w:t>
+        <w:t>Há também o acesso mediado às culturas infantis. Por opção da pesquisa, as crianças não participam diretamente da produção de dados, e suas experiências com tecnologias chegarão até nós pelos relatos dos adultos. Por isso, não afirmaremos efeitos sobre as aprendizagens das crianças; os riscos a elas relacionados serão examinados a partir dos relatos dos profissionais e dos registros documentais. Esse recorte acompanha o objeto da tese, a atuação e a perspectiva dos profissionais da educação diante da política pública. Pelo mesmo motivo, não haverá observação participante nas salas de aula, uma vez que a avaliação das práticas didáticas não integra os objetivos da pesquisa. Entrevistas, documentos pedagógicos e registro iconográfico compensam, em parte, a ausência dessa técnica.</w:t>
       </w:r>
     </w:p>
     <w:p>
@@ -4734,7 +4641,34 @@
           <w:rFonts w:ascii="Times New Roman" w:hAnsi="Times New Roman"/>
           <w:sz w:val="24"/>
         </w:rPr>
-        <w:t xml:space="preserve">Com esse desenho, cada capítulo de análise contribui para responder à questão norteadora. O Capítulo 5 examina o que a política promete e com que meios. O Capítulo 6 caracteriza as condições de recepção na escola e no território. O Capítulo 7 ouvirá quem trabalha na distância entre uma coisa e outra e mostrará, pelos critérios da seção 4.3, que formas de atuação a PNED encontra na escola e em que condições elas aparecem. Qualquer que seja o resultado, ele trará uma resposta à questão da tese, e as implicações dessas formas de atuação para a provisão, a proteção e a participação das crianças no ambiente digital serão discutidas a partir dele. Nas turmas do 1º ao 5º ano, crianças de seis a dez anos se alfabetizam ou consolidam a leitura e a escrita enquanto aprendem a conviver com o digital, e o direito que a lei lhes deu já está valendo.</w:t>
+        <w:t>Sem observação, pode haver diferença entre o que se conta nas entrevistas, o que está nos planos de aula e o que acontece nas atividades pedagógicas. Essa diferença será tratada como dado. Se um plano de aula previr o uso de tecnologias e os registros materiais indicarem outras condições, ou se a entrevista revelar adaptações não formalizadas no planejamento, examinaremos essas situações como possíveis tensões entre o prescrito, as condições materiais e o trabalho dos profissionais. A triangulação serve para mapear os pontos de atrito entre as diretrizes formais, as falas e a materialidade. Auditar a “verdade” da sala de aula está fora do alcance e das pretensões desta pesquisa. As fotografias, por sua vez, têm os limites descritos na seção 4.4.</w:t>
+      </w:r>
+    </w:p>
+    <w:p>
+      <w:pPr>
+        <w:spacing w:line="360" w:lineRule="auto" w:before="240" w:after="240"/>
+      </w:pPr>
+      <w:r>
+        <w:rPr>
+          <w:rFonts w:ascii="Times New Roman" w:hAnsi="Times New Roman"/>
+          <w:b/>
+          <w:sz w:val="24"/>
+        </w:rPr>
+        <w:t>4.6 SÍNTESE DO CAPÍTULO</w:t>
+      </w:r>
+    </w:p>
+    <w:p>
+      <w:pPr>
+        <w:spacing w:line="360" w:lineRule="auto"/>
+        <w:ind w:firstLine="709"/>
+        <w:jc w:val="both"/>
+      </w:pPr>
+      <w:r>
+        <w:rPr>
+          <w:rFonts w:ascii="Times New Roman" w:hAnsi="Times New Roman"/>
+          <w:sz w:val="24"/>
+        </w:rPr>
+        <w:t>Com esse desenho, cada capítulo de análise contribui para responder à questão norteadora. O Capítulo 5 examina o que a política promete e com que meios. O Capítulo 6 caracteriza as condições de recepção no território municipal, na rede e na escola. O Capítulo 7 ouvirá quem trabalha na distância entre uma coisa e outra e mostrará, pelos critérios da seção 4.3, que formas de atuação a PNED encontra na escola e em que condições elas aparecem. Qualquer que seja o resultado, ele trará uma resposta à questão da tese, e as implicações dessas formas de atuação para a provisão, a proteção e a participação das crianças no ambiente digital serão discutidas a partir dele. Nas turmas do 1º ao 5º ano, crianças de seis a dez anos se alfabetizam ou consolidam a leitura e a escrita enquanto aprendem a conviver com o digital, e o direito que a lei lhes deu já está valendo.</w:t>
       </w:r>
     </w:p>
     <w:p>
@@ -5016,7 +4950,7 @@
           <w:rFonts w:ascii="Times New Roman" w:hAnsi="Times New Roman"/>
           <w:sz w:val="24"/>
         </w:rPr>
-        <w:t xml:space="preserve">BRASIL. Conselho Nacional de Saúde. Resolução nº 466, de 12 de dezembro de 2012. </w:t>
+        <w:t xml:space="preserve">BRASIL. Lei nº 12.527, de 18 de novembro de 2011. Regula o acesso a informações previsto no inciso XXXIII do art. 5º, no inciso II do § 3º do art. 37 e no § 2º do art. 216 da Constituição Federal. </w:t>
       </w:r>
       <w:r>
         <w:rPr>
@@ -5024,14 +4958,14 @@
           <w:rFonts w:ascii="Times New Roman" w:hAnsi="Times New Roman"/>
           <w:sz w:val="24"/>
         </w:rPr>
-        <w:t xml:space="preserve">Diário Oficial da União</w:t>
-      </w:r>
-      <w:r>
-        <w:rPr>
-          <w:rFonts w:ascii="Times New Roman" w:hAnsi="Times New Roman"/>
-          <w:sz w:val="24"/>
-        </w:rPr>
-        <w:t xml:space="preserve">: Brasília, DF, 13 jun. 2013.</w:t>
+        <w:t>Diário Oficial da União</w:t>
+      </w:r>
+      <w:r>
+        <w:rPr>
+          <w:rFonts w:ascii="Times New Roman" w:hAnsi="Times New Roman"/>
+          <w:sz w:val="24"/>
+        </w:rPr>
+        <w:t>: Brasília, DF, 2011.</w:t>
       </w:r>
     </w:p>
     <w:p>
@@ -5044,7 +4978,7 @@
           <w:rFonts w:ascii="Times New Roman" w:hAnsi="Times New Roman"/>
           <w:sz w:val="24"/>
         </w:rPr>
-        <w:t xml:space="preserve">BRASIL. Conselho Nacional de Saúde. Resolução nº 510, de 7 de abril de 2016. </w:t>
+        <w:t xml:space="preserve">BRASIL. Lei nº 9.394, de 20 de dezembro de 1996. Estabelece as diretrizes e bases da educação nacional. Brasília, DF: </w:t>
       </w:r>
       <w:r>
         <w:rPr>
@@ -5059,7 +4993,7 @@
           <w:rFonts w:ascii="Times New Roman" w:hAnsi="Times New Roman"/>
           <w:sz w:val="24"/>
         </w:rPr>
-        <w:t xml:space="preserve">: Brasília, DF, 24 maio 2016.</w:t>
+        <w:t xml:space="preserve">, 1996.</w:t>
       </w:r>
     </w:p>
     <w:p>
@@ -5072,7 +5006,7 @@
           <w:rFonts w:ascii="Times New Roman" w:hAnsi="Times New Roman"/>
           <w:sz w:val="24"/>
         </w:rPr>
-        <w:t xml:space="preserve">BRASIL. Lei nº 14.180, de 1º de julho de 2021. Institui a Política de Inovação Educação Conectada. </w:t>
+        <w:t xml:space="preserve">BRASIL. Conselho Nacional de Saúde. Resolução nº 466, de 12 de dezembro de 2012. </w:t>
       </w:r>
       <w:r>
         <w:rPr>
@@ -5087,7 +5021,7 @@
           <w:rFonts w:ascii="Times New Roman" w:hAnsi="Times New Roman"/>
           <w:sz w:val="24"/>
         </w:rPr>
-        <w:t xml:space="preserve">: Brasília, DF, 2 jul. 2021.</w:t>
+        <w:t xml:space="preserve">: Brasília, DF, 13 jun. 2013.</w:t>
       </w:r>
     </w:p>
     <w:p>
@@ -5100,7 +5034,7 @@
           <w:rFonts w:ascii="Times New Roman" w:hAnsi="Times New Roman"/>
           <w:sz w:val="24"/>
         </w:rPr>
-        <w:t xml:space="preserve">BRASIL. Lei nº 14.533, de 11 de janeiro de 2023. Institui a Política Nacional de Educação Digital. </w:t>
+        <w:t xml:space="preserve">BRASIL. Conselho Nacional de Educação. Câmara de Educação Básica. Resolução nº 8, de 20 de novembro de 2012. Define Diretrizes Curriculares Nacionais para a Educação Escolar Quilombola na Educação Básica. </w:t>
       </w:r>
       <w:r>
         <w:rPr>
@@ -5108,14 +5042,14 @@
           <w:rFonts w:ascii="Times New Roman" w:hAnsi="Times New Roman"/>
           <w:sz w:val="24"/>
         </w:rPr>
-        <w:t xml:space="preserve">Diário Oficial da União</w:t>
-      </w:r>
-      <w:r>
-        <w:rPr>
-          <w:rFonts w:ascii="Times New Roman" w:hAnsi="Times New Roman"/>
-          <w:sz w:val="24"/>
-        </w:rPr>
-        <w:t xml:space="preserve">: Brasília, DF, 12 jan. 2023.</w:t>
+        <w:t>Diário Oficial da União</w:t>
+      </w:r>
+      <w:r>
+        <w:rPr>
+          <w:rFonts w:ascii="Times New Roman" w:hAnsi="Times New Roman"/>
+          <w:sz w:val="24"/>
+        </w:rPr>
+        <w:t>: Brasília, DF, 2012.</w:t>
       </w:r>
     </w:p>
     <w:p>
@@ -5128,7 +5062,7 @@
           <w:rFonts w:ascii="Times New Roman" w:hAnsi="Times New Roman"/>
           <w:sz w:val="24"/>
         </w:rPr>
-        <w:t xml:space="preserve">BRASIL. Lei nº 14.817, de 16 de janeiro de 2024. Estabelece diretrizes para a valorização dos profissionais da educação escolar básica pública. Brasília, DF: </w:t>
+        <w:t xml:space="preserve">BRASIL. Conselho Nacional de Saúde. Resolução nº 466, de 12 de dezembro de 2012. </w:t>
       </w:r>
       <w:r>
         <w:rPr>
@@ -5143,7 +5077,7 @@
           <w:rFonts w:ascii="Times New Roman" w:hAnsi="Times New Roman"/>
           <w:sz w:val="24"/>
         </w:rPr>
-        <w:t xml:space="preserve">, 2024.</w:t>
+        <w:t xml:space="preserve">: Brasília, DF, 13 jun. 2013.</w:t>
       </w:r>
     </w:p>
     <w:p>
@@ -5156,7 +5090,7 @@
           <w:rFonts w:ascii="Times New Roman" w:hAnsi="Times New Roman"/>
           <w:sz w:val="24"/>
         </w:rPr>
-        <w:t xml:space="preserve">BRASIL. Conselho Nacional de Educação. Câmara de Educação Básica. Resolução CNE/CEB nº 2, de 21 de março de 2025. Institui as Diretrizes Operacionais Nacionais sobre o uso de dispositivos digitais em espaços escolares e integração curricular de educação digital e midiática. Brasília, DF: </w:t>
+        <w:t xml:space="preserve">BRASIL. Conselho Nacional de Saúde. Resolução nº 510, de 7 de abril de 2016. </w:t>
       </w:r>
       <w:r>
         <w:rPr>
@@ -5171,7 +5105,7 @@
           <w:rFonts w:ascii="Times New Roman" w:hAnsi="Times New Roman"/>
           <w:sz w:val="24"/>
         </w:rPr>
-        <w:t xml:space="preserve">, 2025.</w:t>
+        <w:t xml:space="preserve">: Brasília, DF, 24 maio 2016.</w:t>
       </w:r>
     </w:p>
     <w:p>
@@ -5184,7 +5118,7 @@
           <w:rFonts w:ascii="Times New Roman" w:hAnsi="Times New Roman"/>
           <w:sz w:val="24"/>
         </w:rPr>
-        <w:t xml:space="preserve">BRASIL. Ministério da Educação. </w:t>
+        <w:t xml:space="preserve">BRASIL. Lei nº 14.180, de 1º de julho de 2021. Institui a Política de Inovação Educação Conectada. </w:t>
       </w:r>
       <w:r>
         <w:rPr>
@@ -5192,14 +5126,14 @@
           <w:rFonts w:ascii="Times New Roman" w:hAnsi="Times New Roman"/>
           <w:sz w:val="24"/>
         </w:rPr>
-        <w:t xml:space="preserve">Base Nacional Comum Curricular</w:t>
-      </w:r>
-      <w:r>
-        <w:rPr>
-          <w:rFonts w:ascii="Times New Roman" w:hAnsi="Times New Roman"/>
-          <w:sz w:val="24"/>
-        </w:rPr>
-        <w:t xml:space="preserve">. Brasília, DF: MEC, 2018.</w:t>
+        <w:t xml:space="preserve">Diário Oficial da União</w:t>
+      </w:r>
+      <w:r>
+        <w:rPr>
+          <w:rFonts w:ascii="Times New Roman" w:hAnsi="Times New Roman"/>
+          <w:sz w:val="24"/>
+        </w:rPr>
+        <w:t xml:space="preserve">: Brasília, DF, 2 jul. 2021.</w:t>
       </w:r>
     </w:p>
     <w:p>
@@ -5212,7 +5146,7 @@
           <w:rFonts w:ascii="Times New Roman" w:hAnsi="Times New Roman"/>
           <w:sz w:val="24"/>
         </w:rPr>
-        <w:t xml:space="preserve">BRASIL. Ministério da Educação. </w:t>
+        <w:t xml:space="preserve">BRASIL. Lei nº 14.533, de 11 de janeiro de 2023. Institui a Política Nacional de Educação Digital. </w:t>
       </w:r>
       <w:r>
         <w:rPr>
@@ -5220,14 +5154,14 @@
           <w:rFonts w:ascii="Times New Roman" w:hAnsi="Times New Roman"/>
           <w:sz w:val="24"/>
         </w:rPr>
-        <w:t xml:space="preserve">Complementação à Base Nacional Comum Curricular para Computação na Educação Básica</w:t>
-      </w:r>
-      <w:r>
-        <w:rPr>
-          <w:rFonts w:ascii="Times New Roman" w:hAnsi="Times New Roman"/>
-          <w:sz w:val="24"/>
-        </w:rPr>
-        <w:t xml:space="preserve">. Brasília, DF: MEC, 2022.</w:t>
+        <w:t xml:space="preserve">Diário Oficial da União</w:t>
+      </w:r>
+      <w:r>
+        <w:rPr>
+          <w:rFonts w:ascii="Times New Roman" w:hAnsi="Times New Roman"/>
+          <w:sz w:val="24"/>
+        </w:rPr>
+        <w:t xml:space="preserve">: Brasília, DF, 12 jan. 2023.</w:t>
       </w:r>
     </w:p>
     <w:p>
@@ -5240,7 +5174,7 @@
           <w:rFonts w:ascii="Times New Roman" w:hAnsi="Times New Roman"/>
           <w:sz w:val="24"/>
         </w:rPr>
-        <w:t xml:space="preserve">BRAUN, Virginia; CLARKE, Victoria. Reflecting on reflexive thematic analysis. </w:t>
+        <w:t xml:space="preserve">BRASIL. Lei nº 14.817, de 16 de janeiro de 2024. Estabelece diretrizes para a valorização dos profissionais da educação escolar básica pública. Brasília, DF: </w:t>
       </w:r>
       <w:r>
         <w:rPr>
@@ -5248,14 +5182,14 @@
           <w:rFonts w:ascii="Times New Roman" w:hAnsi="Times New Roman"/>
           <w:sz w:val="24"/>
         </w:rPr>
-        <w:t xml:space="preserve">Qualitative Research in Sport, Exercise and Health</w:t>
-      </w:r>
-      <w:r>
-        <w:rPr>
-          <w:rFonts w:ascii="Times New Roman" w:hAnsi="Times New Roman"/>
-          <w:sz w:val="24"/>
-        </w:rPr>
-        <w:t xml:space="preserve">, v. 11, n. 4, p. 589-597, 2019. DOI: https://doi.org/10.1080/2159676X.2019.1628806.</w:t>
+        <w:t xml:space="preserve">Diário Oficial da União</w:t>
+      </w:r>
+      <w:r>
+        <w:rPr>
+          <w:rFonts w:ascii="Times New Roman" w:hAnsi="Times New Roman"/>
+          <w:sz w:val="24"/>
+        </w:rPr>
+        <w:t xml:space="preserve">, 2024.</w:t>
       </w:r>
     </w:p>
     <w:p>
@@ -5268,7 +5202,7 @@
           <w:rFonts w:ascii="Times New Roman" w:hAnsi="Times New Roman"/>
           <w:sz w:val="24"/>
         </w:rPr>
-        <w:t xml:space="preserve">BRAUN, Virginia; CLARKE, Victoria. Using thematic analysis in psychology. </w:t>
+        <w:t xml:space="preserve">BRASIL. Conselho Nacional de Educação. Câmara de Educação Básica. Resolução CNE/CEB nº 2, de 21 de março de 2025. Institui as Diretrizes Operacionais Nacionais sobre o uso de dispositivos digitais em espaços escolares e integração curricular de educação digital e midiática. Brasília, DF: </w:t>
       </w:r>
       <w:r>
         <w:rPr>
@@ -5276,14 +5210,14 @@
           <w:rFonts w:ascii="Times New Roman" w:hAnsi="Times New Roman"/>
           <w:sz w:val="24"/>
         </w:rPr>
-        <w:t xml:space="preserve">Qualitative Research in Psychology</w:t>
-      </w:r>
-      <w:r>
-        <w:rPr>
-          <w:rFonts w:ascii="Times New Roman" w:hAnsi="Times New Roman"/>
-          <w:sz w:val="24"/>
-        </w:rPr>
-        <w:t xml:space="preserve">, v. 3, n. 2, p. 77-101, 2006. DOI: https://doi.org/10.1191/1478088706qp063oa.</w:t>
+        <w:t xml:space="preserve">Diário Oficial da União</w:t>
+      </w:r>
+      <w:r>
+        <w:rPr>
+          <w:rFonts w:ascii="Times New Roman" w:hAnsi="Times New Roman"/>
+          <w:sz w:val="24"/>
+        </w:rPr>
+        <w:t xml:space="preserve">, 2025.</w:t>
       </w:r>
     </w:p>
     <w:p>
@@ -5296,6 +5230,118 @@
           <w:rFonts w:ascii="Times New Roman" w:hAnsi="Times New Roman"/>
           <w:sz w:val="24"/>
         </w:rPr>
+        <w:t xml:space="preserve">BRASIL. Ministério da Educação. </w:t>
+      </w:r>
+      <w:r>
+        <w:rPr>
+          <w:b/>
+          <w:rFonts w:ascii="Times New Roman" w:hAnsi="Times New Roman"/>
+          <w:sz w:val="24"/>
+        </w:rPr>
+        <w:t xml:space="preserve">Base Nacional Comum Curricular</w:t>
+      </w:r>
+      <w:r>
+        <w:rPr>
+          <w:rFonts w:ascii="Times New Roman" w:hAnsi="Times New Roman"/>
+          <w:sz w:val="24"/>
+        </w:rPr>
+        <w:t xml:space="preserve">. Brasília, DF: MEC, 2018.</w:t>
+      </w:r>
+    </w:p>
+    <w:p>
+      <w:pPr>
+        <w:spacing w:line="240" w:lineRule="auto" w:after="240"/>
+        <w:jc w:val="left"/>
+      </w:pPr>
+      <w:r>
+        <w:rPr>
+          <w:rFonts w:ascii="Times New Roman" w:hAnsi="Times New Roman"/>
+          <w:sz w:val="24"/>
+        </w:rPr>
+        <w:t xml:space="preserve">BRASIL. Ministério da Educação. </w:t>
+      </w:r>
+      <w:r>
+        <w:rPr>
+          <w:b/>
+          <w:rFonts w:ascii="Times New Roman" w:hAnsi="Times New Roman"/>
+          <w:sz w:val="24"/>
+        </w:rPr>
+        <w:t xml:space="preserve">Complementação à Base Nacional Comum Curricular para Computação na Educação Básica</w:t>
+      </w:r>
+      <w:r>
+        <w:rPr>
+          <w:rFonts w:ascii="Times New Roman" w:hAnsi="Times New Roman"/>
+          <w:sz w:val="24"/>
+        </w:rPr>
+        <w:t xml:space="preserve">. Brasília, DF: MEC, 2022.</w:t>
+      </w:r>
+    </w:p>
+    <w:p>
+      <w:pPr>
+        <w:spacing w:line="240" w:lineRule="auto" w:after="240"/>
+        <w:jc w:val="left"/>
+      </w:pPr>
+      <w:r>
+        <w:rPr>
+          <w:rFonts w:ascii="Times New Roman" w:hAnsi="Times New Roman"/>
+          <w:sz w:val="24"/>
+        </w:rPr>
+        <w:t xml:space="preserve">BRAUN, Virginia; CLARKE, Victoria. Reflecting on reflexive thematic analysis. </w:t>
+      </w:r>
+      <w:r>
+        <w:rPr>
+          <w:b/>
+          <w:rFonts w:ascii="Times New Roman" w:hAnsi="Times New Roman"/>
+          <w:sz w:val="24"/>
+        </w:rPr>
+        <w:t xml:space="preserve">Qualitative Research in Sport, Exercise and Health</w:t>
+      </w:r>
+      <w:r>
+        <w:rPr>
+          <w:rFonts w:ascii="Times New Roman" w:hAnsi="Times New Roman"/>
+          <w:sz w:val="24"/>
+        </w:rPr>
+        <w:t xml:space="preserve">, v. 11, n. 4, p. 589-597, 2019. DOI: https://doi.org/10.1080/2159676X.2019.1628806.</w:t>
+      </w:r>
+    </w:p>
+    <w:p>
+      <w:pPr>
+        <w:spacing w:line="240" w:lineRule="auto" w:after="240"/>
+        <w:jc w:val="left"/>
+      </w:pPr>
+      <w:r>
+        <w:rPr>
+          <w:rFonts w:ascii="Times New Roman" w:hAnsi="Times New Roman"/>
+          <w:sz w:val="24"/>
+        </w:rPr>
+        <w:t xml:space="preserve">BRAUN, Virginia; CLARKE, Victoria. Using thematic analysis in psychology. </w:t>
+      </w:r>
+      <w:r>
+        <w:rPr>
+          <w:b/>
+          <w:rFonts w:ascii="Times New Roman" w:hAnsi="Times New Roman"/>
+          <w:sz w:val="24"/>
+        </w:rPr>
+        <w:t xml:space="preserve">Qualitative Research in Psychology</w:t>
+      </w:r>
+      <w:r>
+        <w:rPr>
+          <w:rFonts w:ascii="Times New Roman" w:hAnsi="Times New Roman"/>
+          <w:sz w:val="24"/>
+        </w:rPr>
+        <w:t xml:space="preserve">, v. 3, n. 2, p. 77-101, 2006. DOI: https://doi.org/10.1191/1478088706qp063oa.</w:t>
+      </w:r>
+    </w:p>
+    <w:p>
+      <w:pPr>
+        <w:spacing w:line="240" w:lineRule="auto" w:after="240"/>
+        <w:jc w:val="left"/>
+      </w:pPr>
+      <w:r>
+        <w:rPr>
+          <w:rFonts w:ascii="Times New Roman" w:hAnsi="Times New Roman"/>
+          <w:sz w:val="24"/>
+        </w:rPr>
         <w:t xml:space="preserve">FOUCAULT, Michel. </w:t>
       </w:r>
       <w:r>
@@ -5312,6 +5358,62 @@
           <w:sz w:val="24"/>
         </w:rPr>
         <w:t xml:space="preserve">: nascimento da prisão. Tradução de Raquel Ramalhete. 20. ed. Petrópolis: Vozes, 1999.</w:t>
+      </w:r>
+    </w:p>
+    <w:p>
+      <w:pPr>
+        <w:spacing w:line="240" w:lineRule="auto" w:after="240"/>
+        <w:jc w:val="left"/>
+      </w:pPr>
+      <w:r>
+        <w:rPr>
+          <w:rFonts w:ascii="Times New Roman" w:hAnsi="Times New Roman"/>
+          <w:sz w:val="24"/>
+        </w:rPr>
+        <w:t xml:space="preserve">FREIRE, Paulo. </w:t>
+      </w:r>
+      <w:r>
+        <w:rPr>
+          <w:b/>
+          <w:rFonts w:ascii="Times New Roman" w:hAnsi="Times New Roman"/>
+          <w:sz w:val="24"/>
+        </w:rPr>
+        <w:t xml:space="preserve">Pedagogia da autonomia</w:t>
+      </w:r>
+      <w:r>
+        <w:rPr>
+          <w:rFonts w:ascii="Times New Roman" w:hAnsi="Times New Roman"/>
+          <w:sz w:val="24"/>
+        </w:rPr>
+        <w:t xml:space="preserve">: saberes necessários à prática educativa. 60. ed. Rio de Janeiro: Paz e Terra, 2019.</w:t>
+      </w:r>
+    </w:p>
+    <w:p>
+      <w:pPr>
+        <w:spacing w:line="240" w:lineRule="auto" w:after="240"/>
+        <w:jc w:val="left"/>
+      </w:pPr>
+      <w:r>
+        <w:rPr>
+          <w:rFonts w:ascii="Times New Roman" w:hAnsi="Times New Roman"/>
+          <w:sz w:val="24"/>
+        </w:rPr>
+        <w:t xml:space="preserve">FUNDAÇÃO CULTURAL PALMARES. Portaria nº 26, de 6 de junho de 2005. </w:t>
+      </w:r>
+      <w:r>
+        <w:rPr>
+          <w:b/>
+          <w:rFonts w:ascii="Times New Roman" w:hAnsi="Times New Roman"/>
+          <w:sz w:val="24"/>
+        </w:rPr>
+        <w:t>Diário Oficial da União</w:t>
+      </w:r>
+      <w:r>
+        <w:rPr>
+          <w:rFonts w:ascii="Times New Roman" w:hAnsi="Times New Roman"/>
+          <w:sz w:val="24"/>
+        </w:rPr>
+        <w:t>: seção 1, Brasília, DF, 8 jun. 2005. [conferir seção, página e ementa no DOU]</w:t>
       </w:r>
     </w:p>
     <w:p>
@@ -5381,7 +5483,7 @@
           <w:rFonts w:ascii="Times New Roman" w:hAnsi="Times New Roman"/>
           <w:sz w:val="24"/>
         </w:rPr>
-        <w:t xml:space="preserve">MAINARDES, Jefferson. Abordagem do ciclo de políticas: uma contribuição para a análise de políticas educacionais. </w:t>
+        <w:t xml:space="preserve">IBGE. </w:t>
       </w:r>
       <w:r>
         <w:rPr>
@@ -5389,98 +5491,14 @@
           <w:rFonts w:ascii="Times New Roman" w:hAnsi="Times New Roman"/>
           <w:sz w:val="24"/>
         </w:rPr>
-        <w:t xml:space="preserve">Educação &amp; Sociedade</w:t>
-      </w:r>
-      <w:r>
-        <w:rPr>
-          <w:rFonts w:ascii="Times New Roman" w:hAnsi="Times New Roman"/>
-          <w:sz w:val="24"/>
-        </w:rPr>
-        <w:t xml:space="preserve">, Campinas, v. 27, n. 94, p. 47-69, jan./abr. 2006. DOI: https://doi.org/10.1590/S0101-73302006000100003.</w:t>
-      </w:r>
-    </w:p>
-    <w:p>
-      <w:pPr>
-        <w:spacing w:line="240" w:lineRule="auto" w:after="240"/>
-        <w:jc w:val="left"/>
-      </w:pPr>
-      <w:r>
-        <w:rPr>
-          <w:rFonts w:ascii="Times New Roman" w:hAnsi="Times New Roman"/>
-          <w:sz w:val="24"/>
-        </w:rPr>
-        <w:t xml:space="preserve">MARCONI, Marina de Andrade; LAKATOS, Eva Maria. </w:t>
-      </w:r>
-      <w:r>
-        <w:rPr>
-          <w:b/>
-          <w:rFonts w:ascii="Times New Roman" w:hAnsi="Times New Roman"/>
-          <w:sz w:val="24"/>
-        </w:rPr>
-        <w:t xml:space="preserve">Metodologia científica</w:t>
-      </w:r>
-      <w:r>
-        <w:rPr>
-          <w:rFonts w:ascii="Times New Roman" w:hAnsi="Times New Roman"/>
-          <w:sz w:val="24"/>
-        </w:rPr>
-        <w:t xml:space="preserve">. 5. ed. São Paulo: Atlas, 2007.</w:t>
-      </w:r>
-    </w:p>
-    <w:p>
-      <w:pPr>
-        <w:spacing w:line="240" w:lineRule="auto" w:after="240"/>
-        <w:jc w:val="left"/>
-      </w:pPr>
-      <w:r>
-        <w:rPr>
-          <w:rFonts w:ascii="Times New Roman" w:hAnsi="Times New Roman"/>
-          <w:sz w:val="24"/>
-        </w:rPr>
-        <w:t xml:space="preserve">MINAYO, Maria Cecília de Souza (org.). </w:t>
-      </w:r>
-      <w:r>
-        <w:rPr>
-          <w:b/>
-          <w:rFonts w:ascii="Times New Roman" w:hAnsi="Times New Roman"/>
-          <w:sz w:val="24"/>
-        </w:rPr>
-        <w:t xml:space="preserve">Pesquisa social</w:t>
-      </w:r>
-      <w:r>
-        <w:rPr>
-          <w:rFonts w:ascii="Times New Roman" w:hAnsi="Times New Roman"/>
-          <w:sz w:val="24"/>
-        </w:rPr>
-        <w:t xml:space="preserve">: teoria, método e criatividade. 28. ed. Petrópolis, RJ: Vozes, 2009.</w:t>
-      </w:r>
-    </w:p>
-    <w:p>
-      <w:pPr>
-        <w:spacing w:line="240" w:lineRule="auto" w:after="240"/>
-        <w:jc w:val="left"/>
-      </w:pPr>
-      <w:r>
-        <w:rPr>
-          <w:rFonts w:ascii="Times New Roman" w:hAnsi="Times New Roman"/>
-          <w:sz w:val="24"/>
-        </w:rPr>
-        <w:t xml:space="preserve">OLIVEIRA, Dalila Andrade; VIEIRA, Lívia Fraga. </w:t>
-      </w:r>
-      <w:r>
-        <w:rPr>
-          <w:b/>
-          <w:rFonts w:ascii="Times New Roman" w:hAnsi="Times New Roman"/>
-          <w:sz w:val="24"/>
-        </w:rPr>
-        <w:t xml:space="preserve">Trabalho na educação em sete estados brasileiros</w:t>
-      </w:r>
-      <w:r>
-        <w:rPr>
-          <w:rFonts w:ascii="Times New Roman" w:hAnsi="Times New Roman"/>
-          <w:sz w:val="24"/>
-        </w:rPr>
-        <w:t xml:space="preserve">. Belo Horizonte: Fino Traço, 2012.</w:t>
+        <w:t>Censo Demográfico 2022</w:t>
+      </w:r>
+      <w:r>
+        <w:rPr>
+          <w:rFonts w:ascii="Times New Roman" w:hAnsi="Times New Roman"/>
+          <w:sz w:val="24"/>
+        </w:rPr>
+        <w:t>: população e domicílios: primeiros resultados. Rio de Janeiro: IBGE, 2023.</w:t>
       </w:r>
     </w:p>
     <w:p>
@@ -5494,7 +5512,7 @@
           <w:rFonts w:ascii="Times New Roman" w:hAnsi="Times New Roman"/>
           <w:sz w:val="24"/>
         </w:rPr>
-        <w:t xml:space="preserve">ONU. Comitê dos Direitos da Criança. </w:t>
+        <w:t xml:space="preserve">HARGREAVES, Andy. </w:t>
       </w:r>
       <w:r>
         <w:rPr>
@@ -5502,14 +5520,14 @@
           <w:rFonts w:ascii="Times New Roman" w:hAnsi="Times New Roman"/>
           <w:sz w:val="24"/>
         </w:rPr>
-        <w:t xml:space="preserve">Comentário Geral nº 25 (2021) sobre os direitos das crianças em relação ao ambiente digital</w:t>
-      </w:r>
-      <w:r>
-        <w:rPr>
-          <w:rFonts w:ascii="Times New Roman" w:hAnsi="Times New Roman"/>
-          <w:sz w:val="24"/>
-        </w:rPr>
-        <w:t xml:space="preserve">. CRC/C/GC/25. Genebra: ONU, 2021.</w:t>
+        <w:t xml:space="preserve">Profesorado, cultura y postmodernidad</w:t>
+      </w:r>
+      <w:r>
+        <w:rPr>
+          <w:rFonts w:ascii="Times New Roman" w:hAnsi="Times New Roman"/>
+          <w:sz w:val="24"/>
+        </w:rPr>
+        <w:t xml:space="preserve">: cambian los tiempos, cambia el profesorado. 5. ed. Madrid: Morata, 2005.</w:t>
       </w:r>
     </w:p>
     <w:p>
@@ -5522,6 +5540,204 @@
           <w:rFonts w:ascii="Times New Roman" w:hAnsi="Times New Roman"/>
           <w:sz w:val="24"/>
         </w:rPr>
+        <w:t xml:space="preserve">IBGE. </w:t>
+      </w:r>
+      <w:r>
+        <w:rPr>
+          <w:b/>
+          <w:rFonts w:ascii="Times New Roman" w:hAnsi="Times New Roman"/>
+          <w:sz w:val="24"/>
+        </w:rPr>
+        <w:t>Cidades@: Tibau do Sul</w:t>
+      </w:r>
+      <w:r>
+        <w:rPr>
+          <w:rFonts w:ascii="Times New Roman" w:hAnsi="Times New Roman"/>
+          <w:sz w:val="24"/>
+        </w:rPr>
+        <w:t>. Rio de Janeiro: IBGE, 2025. Disponível em: https://cidades.ibge.gov.br/brasil/rn/tibau-do-sul. Acesso em: [indicar a data de acesso].</w:t>
+      </w:r>
+    </w:p>
+    <w:p>
+      <w:pPr>
+        <w:spacing w:line="360" w:lineRule="auto"/>
+        <w:ind w:firstLine="709"/>
+        <w:jc w:val="left"/>
+      </w:pPr>
+      <w:r>
+        <w:rPr>
+          <w:rFonts w:ascii="Times New Roman" w:hAnsi="Times New Roman"/>
+          <w:sz w:val="24"/>
+        </w:rPr>
+        <w:t xml:space="preserve">HARGREAVES, Andy. </w:t>
+      </w:r>
+      <w:r>
+        <w:rPr>
+          <w:b/>
+          <w:rFonts w:ascii="Times New Roman" w:hAnsi="Times New Roman"/>
+          <w:sz w:val="24"/>
+        </w:rPr>
+        <w:t xml:space="preserve">Profesorado, cultura y postmodernidad</w:t>
+      </w:r>
+      <w:r>
+        <w:rPr>
+          <w:rFonts w:ascii="Times New Roman" w:hAnsi="Times New Roman"/>
+          <w:sz w:val="24"/>
+        </w:rPr>
+        <w:t xml:space="preserve">: cambian los tiempos, cambia el profesorado. 5. ed. Madrid: Morata, 2005.</w:t>
+      </w:r>
+    </w:p>
+    <w:p>
+      <w:pPr>
+        <w:spacing w:line="240" w:lineRule="auto" w:after="240"/>
+        <w:jc w:val="left"/>
+      </w:pPr>
+      <w:r>
+        <w:rPr>
+          <w:rFonts w:ascii="Times New Roman" w:hAnsi="Times New Roman"/>
+          <w:sz w:val="24"/>
+        </w:rPr>
+        <w:t xml:space="preserve">MAINARDES, Jefferson. Abordagem do ciclo de políticas: uma contribuição para a análise de políticas educacionais. </w:t>
+      </w:r>
+      <w:r>
+        <w:rPr>
+          <w:b/>
+          <w:rFonts w:ascii="Times New Roman" w:hAnsi="Times New Roman"/>
+          <w:sz w:val="24"/>
+        </w:rPr>
+        <w:t xml:space="preserve">Educação &amp; Sociedade</w:t>
+      </w:r>
+      <w:r>
+        <w:rPr>
+          <w:rFonts w:ascii="Times New Roman" w:hAnsi="Times New Roman"/>
+          <w:sz w:val="24"/>
+        </w:rPr>
+        <w:t xml:space="preserve">, Campinas, v. 27, n. 94, p. 47-69, jan./abr. 2006. DOI: https://doi.org/10.1590/S0101-73302006000100003.</w:t>
+      </w:r>
+    </w:p>
+    <w:p>
+      <w:pPr>
+        <w:spacing w:line="240" w:lineRule="auto" w:after="240"/>
+        <w:jc w:val="left"/>
+      </w:pPr>
+      <w:r>
+        <w:rPr>
+          <w:rFonts w:ascii="Times New Roman" w:hAnsi="Times New Roman"/>
+          <w:sz w:val="24"/>
+        </w:rPr>
+        <w:t xml:space="preserve">MARCONI, Marina de Andrade; LAKATOS, Eva Maria. </w:t>
+      </w:r>
+      <w:r>
+        <w:rPr>
+          <w:b/>
+          <w:rFonts w:ascii="Times New Roman" w:hAnsi="Times New Roman"/>
+          <w:sz w:val="24"/>
+        </w:rPr>
+        <w:t xml:space="preserve">Metodologia científica</w:t>
+      </w:r>
+      <w:r>
+        <w:rPr>
+          <w:rFonts w:ascii="Times New Roman" w:hAnsi="Times New Roman"/>
+          <w:sz w:val="24"/>
+        </w:rPr>
+        <w:t xml:space="preserve">. 5. ed. São Paulo: Atlas, 2007.</w:t>
+      </w:r>
+    </w:p>
+    <w:p>
+      <w:pPr>
+        <w:spacing w:line="240" w:lineRule="auto" w:after="240"/>
+        <w:jc w:val="left"/>
+      </w:pPr>
+      <w:r>
+        <w:rPr>
+          <w:rFonts w:ascii="Times New Roman" w:hAnsi="Times New Roman"/>
+          <w:sz w:val="24"/>
+        </w:rPr>
+        <w:t xml:space="preserve">MINAYO, Maria Cecília de Souza (org.). </w:t>
+      </w:r>
+      <w:r>
+        <w:rPr>
+          <w:b/>
+          <w:rFonts w:ascii="Times New Roman" w:hAnsi="Times New Roman"/>
+          <w:sz w:val="24"/>
+        </w:rPr>
+        <w:t xml:space="preserve">Pesquisa social</w:t>
+      </w:r>
+      <w:r>
+        <w:rPr>
+          <w:rFonts w:ascii="Times New Roman" w:hAnsi="Times New Roman"/>
+          <w:sz w:val="24"/>
+        </w:rPr>
+        <w:t xml:space="preserve">: teoria, método e criatividade. 28. ed. Petrópolis, RJ: Vozes, 2009.</w:t>
+      </w:r>
+    </w:p>
+    <w:p>
+      <w:pPr>
+        <w:spacing w:line="240" w:lineRule="auto" w:after="240"/>
+        <w:jc w:val="left"/>
+      </w:pPr>
+      <w:r>
+        <w:rPr>
+          <w:rFonts w:ascii="Times New Roman" w:hAnsi="Times New Roman"/>
+          <w:sz w:val="24"/>
+        </w:rPr>
+        <w:t xml:space="preserve">OLIVEIRA, Dalila Andrade; VIEIRA, Lívia Fraga. </w:t>
+      </w:r>
+      <w:r>
+        <w:rPr>
+          <w:b/>
+          <w:rFonts w:ascii="Times New Roman" w:hAnsi="Times New Roman"/>
+          <w:sz w:val="24"/>
+        </w:rPr>
+        <w:t xml:space="preserve">Trabalho na educação em sete estados brasileiros</w:t>
+      </w:r>
+      <w:r>
+        <w:rPr>
+          <w:rFonts w:ascii="Times New Roman" w:hAnsi="Times New Roman"/>
+          <w:sz w:val="24"/>
+        </w:rPr>
+        <w:t xml:space="preserve">. Belo Horizonte: Fino Traço, 2012.</w:t>
+      </w:r>
+    </w:p>
+    <w:p>
+      <w:pPr>
+        <w:spacing w:line="360" w:lineRule="auto"/>
+        <w:ind w:firstLine="709"/>
+        <w:jc w:val="left"/>
+      </w:pPr>
+      <w:r>
+        <w:rPr>
+          <w:rFonts w:ascii="Times New Roman" w:hAnsi="Times New Roman"/>
+          <w:sz w:val="24"/>
+        </w:rPr>
+        <w:t xml:space="preserve">ONU. Comitê dos Direitos da Criança. </w:t>
+      </w:r>
+      <w:r>
+        <w:rPr>
+          <w:b/>
+          <w:rFonts w:ascii="Times New Roman" w:hAnsi="Times New Roman"/>
+          <w:sz w:val="24"/>
+        </w:rPr>
+        <w:t xml:space="preserve">Comentário Geral nº 25 (2021) sobre os direitos das crianças em relação ao ambiente digital</w:t>
+      </w:r>
+      <w:r>
+        <w:rPr>
+          <w:rFonts w:ascii="Times New Roman" w:hAnsi="Times New Roman"/>
+          <w:sz w:val="24"/>
+        </w:rPr>
+        <w:t xml:space="preserve">. CRC/C/GC/25. Genebra: ONU, 2021.</w:t>
+      </w:r>
+    </w:p>
+    <w:p>
+      <w:pPr>
+        <w:spacing w:line="240" w:lineRule="auto" w:after="240"/>
+        <w:jc w:val="left"/>
+      </w:pPr>
+      <w:r>
+        <w:rPr>
+          <w:rFonts w:ascii="Times New Roman" w:hAnsi="Times New Roman"/>
+          <w:sz w:val="24"/>
+        </w:rPr>
         <w:t xml:space="preserve">QUEIROZ, Maria Aparecida de; PAIVA, Maria Cristina Leandro de. A valorização do trabalho docente e a formação profissional. In: FRANÇA, Magna; MOMO, Mariângela (org.). </w:t>
       </w:r>
       <w:r>
@@ -5538,6 +5754,62 @@
           <w:sz w:val="24"/>
         </w:rPr>
         <w:t xml:space="preserve">: a construção do PNE. Campinas: Mercado de Letras, 2014. p. 249-286.</w:t>
+      </w:r>
+    </w:p>
+    <w:p>
+      <w:pPr>
+        <w:spacing w:line="240" w:lineRule="auto" w:after="240"/>
+        <w:jc w:val="left"/>
+      </w:pPr>
+      <w:r>
+        <w:rPr>
+          <w:rFonts w:ascii="Times New Roman" w:hAnsi="Times New Roman"/>
+          <w:sz w:val="24"/>
+        </w:rPr>
+        <w:t xml:space="preserve">SANTOS, Milton. </w:t>
+      </w:r>
+      <w:r>
+        <w:rPr>
+          <w:b/>
+          <w:rFonts w:ascii="Times New Roman" w:hAnsi="Times New Roman"/>
+          <w:sz w:val="24"/>
+        </w:rPr>
+        <w:t xml:space="preserve">Espaço e método</w:t>
+      </w:r>
+      <w:r>
+        <w:rPr>
+          <w:rFonts w:ascii="Times New Roman" w:hAnsi="Times New Roman"/>
+          <w:sz w:val="24"/>
+        </w:rPr>
+        <w:t xml:space="preserve">. 5. ed., 1. reimpr. São Paulo: Editora da Universidade de São Paulo, 2012.</w:t>
+      </w:r>
+    </w:p>
+    <w:p>
+      <w:pPr>
+        <w:spacing w:line="240" w:lineRule="auto" w:after="240"/>
+        <w:jc w:val="left"/>
+      </w:pPr>
+      <w:r>
+        <w:rPr>
+          <w:rFonts w:ascii="Times New Roman" w:hAnsi="Times New Roman"/>
+          <w:sz w:val="24"/>
+        </w:rPr>
+        <w:t xml:space="preserve">TIBAU DO SUL. </w:t>
+      </w:r>
+      <w:r>
+        <w:rPr>
+          <w:b/>
+          <w:rFonts w:ascii="Times New Roman" w:hAnsi="Times New Roman"/>
+          <w:sz w:val="24"/>
+        </w:rPr>
+        <w:t>Lei nº 517, de 24 de junho de 2015</w:t>
+      </w:r>
+      <w:r>
+        <w:rPr>
+          <w:rFonts w:ascii="Times New Roman" w:hAnsi="Times New Roman"/>
+          <w:sz w:val="24"/>
+        </w:rPr>
+        <w:t>. Aprova o Plano Municipal de Educação. Tibau do Sul: Câmara Municipal, 2015. [conferir ementa e órgão de publicação]</w:t>
       </w:r>
     </w:p>
     <w:p>
@@ -5650,7 +5922,7 @@
           <w:rFonts w:ascii="Times New Roman" w:hAnsi="Times New Roman"/>
           <w:sz w:val="24"/>
         </w:rPr>
-        <w:t>Pesquisa: A encenação da Política Nacional de Educação Digital (PNED) em Pipa/RN: culturas profissionais, território e resistências no contexto da prática.</w:t>
+        <w:t>Pesquisa: A encenação da Política Nacional de Educação Digital em Tibau do Sul/RN: da Secretaria Municipal de Educação à escola de Pipa, entre culturas profissionais, território e resistências.</w:t>
       </w:r>
     </w:p>
     <w:p>
@@ -6456,7 +6728,7 @@
           <w:rFonts w:ascii="Times New Roman" w:hAnsi="Times New Roman"/>
           <w:sz w:val="24"/>
         </w:rPr>
-        <w:t>( ) Moro em outro distrito ou município e me desloco para trabalhar</w:t>
+        <w:t>( ) Moro em outra localidade de Tibau do Sul ou em outro município e me desloco para trabalhar</w:t>
       </w:r>
     </w:p>
     <w:p>
@@ -7444,7 +7716,7 @@
           <w:rFonts w:ascii="Times New Roman" w:hAnsi="Times New Roman"/>
           <w:sz w:val="24"/>
         </w:rPr>
-        <w:t>25. Na sua percepção, as características de Pipa (turismo, desigualdades entre áreas do distrito, oscilação de sinal, rotina das famílias) influenciam o acesso das crianças ao digital?</w:t>
+        <w:t>25. Na sua percepção, as características de Pipa (turismo, desigualdades entre áreas da localidade, oscilação de sinal, rotina das famílias) influenciam o acesso das crianças ao digital?</w:t>
       </w:r>
     </w:p>
     <w:p>
@@ -8461,7 +8733,7 @@
           <w:rFonts w:ascii="Times New Roman" w:hAnsi="Times New Roman"/>
           <w:sz w:val="24"/>
         </w:rPr>
-        <w:t>Pesquisa: A encenação da Política Nacional de Educação Digital (PNED) em Pipa/RN: culturas profissionais, território e resistências no contexto da prática.</w:t>
+        <w:t>Pesquisa: A encenação da Política Nacional de Educação Digital em Tibau do Sul/RN: da Secretaria Municipal de Educação à escola de Pipa, entre culturas profissionais, território e resistências.</w:t>
       </w:r>
     </w:p>
     <w:p>
@@ -8825,7 +9097,7 @@
           <w:rFonts w:ascii="Times New Roman" w:hAnsi="Times New Roman"/>
           <w:sz w:val="24"/>
         </w:rPr>
-        <w:t>18. Morar ou conviver com as famílias no distrito pesa, de alguma forma, no que você decide fazer ou deixar de fazer em relação ao digital?</w:t>
+        <w:t>18. Morar ou conviver com as famílias em Pipa pesa, de alguma forma, no que você decide fazer ou deixar de fazer em relação ao digital?</w:t>
       </w:r>
     </w:p>
     <w:p>
@@ -9423,7 +9695,7 @@
           <w:rFonts w:ascii="Times New Roman" w:hAnsi="Times New Roman"/>
           <w:sz w:val="24"/>
         </w:rPr>
-        <w:t>Fonte complementar sobre o contexto externo. O técnico participa apenas da entrevista. As perguntas tratam de como as orientações nacionais são recebidas e encaminhadas pela gestão municipal antes de chegar à escola.</w:t>
+        <w:t>Primeira entrevista do campo. O técnico participa apenas da entrevista. As perguntas tratam de como as orientações nacionais são recebidas e traduzidas pela gestão municipal antes de chegar às escolas e de como essa tradução considera as diferentes localidades do município.</w:t>
       </w:r>
     </w:p>
     <w:p>
@@ -9462,7 +9734,7 @@
           <w:rFonts w:ascii="Times New Roman" w:hAnsi="Times New Roman"/>
           <w:sz w:val="24"/>
         </w:rPr>
-        <w:t>3. Que orientações, documentos ou formações a Secretaria ofereceu às escolas sobre educação digital? Desde quando?</w:t>
+        <w:t>3. Você mencionou um plano elaborado para a rede como um todo. Como ele foi construído, por quem, quando, e o que ele prevê sobre educação digital?</w:t>
       </w:r>
     </w:p>
     <w:p>
@@ -9475,7 +9747,7 @@
           <w:rFonts w:ascii="Times New Roman" w:hAnsi="Times New Roman"/>
           <w:sz w:val="24"/>
         </w:rPr>
-        <w:t>4. Como a Secretaria acompanha o trabalho das escolas nessa área? Que registros ou informações pede a elas?</w:t>
+        <w:t>4. Como a educação digital entrou, ou está entrando, no currículo da rede? Como esse trabalho foi organizado?</w:t>
       </w:r>
     </w:p>
     <w:p>
@@ -9488,7 +9760,7 @@
           <w:rFonts w:ascii="Times New Roman" w:hAnsi="Times New Roman"/>
           <w:sz w:val="24"/>
         </w:rPr>
-        <w:t>5. Que condições, em equipamentos, conexão, suporte técnico e formação, a rede consegue oferecer às escolas, e o que fica a cargo de cada escola?</w:t>
+        <w:t>5. Que orientações, documentos ou formações a Secretaria ofereceu às escolas sobre educação digital? Desde quando, e para quem?</w:t>
       </w:r>
     </w:p>
     <w:p>
@@ -9501,7 +9773,59 @@
           <w:rFonts w:ascii="Times New Roman" w:hAnsi="Times New Roman"/>
           <w:sz w:val="24"/>
         </w:rPr>
-        <w:t>6. Quais são, na sua avaliação, os principais desafios do município para garantir às crianças os direitos que a lei associa à educação digital?</w:t>
+        <w:t>6. As escolas do município estão em lugares muito diferentes, da sede a Pipa, dos povoados rurais a Sibaúma. Essas diferenças aparecem no plano, nas orientações ou nas formações? De que modo?</w:t>
+      </w:r>
+    </w:p>
+    <w:p>
+      <w:pPr>
+        <w:spacing w:line="240" w:lineRule="auto" w:after="40"/>
+        <w:jc w:val="left"/>
+      </w:pPr>
+      <w:r>
+        <w:rPr>
+          <w:rFonts w:ascii="Times New Roman" w:hAnsi="Times New Roman"/>
+          <w:sz w:val="24"/>
+        </w:rPr>
+        <w:t>7. Há orientações próprias para as escolas do campo ou para a escola da comunidade quilombola? Como elas se relacionam com a educação digital?</w:t>
+      </w:r>
+    </w:p>
+    <w:p>
+      <w:pPr>
+        <w:spacing w:line="240" w:lineRule="auto" w:after="40"/>
+        <w:jc w:val="left"/>
+      </w:pPr>
+      <w:r>
+        <w:rPr>
+          <w:rFonts w:ascii="Times New Roman" w:hAnsi="Times New Roman"/>
+          <w:sz w:val="24"/>
+        </w:rPr>
+        <w:t>8. Como a Secretaria acompanha o trabalho das escolas nessa área? Que registros ou informações pede a elas?</w:t>
+      </w:r>
+    </w:p>
+    <w:p>
+      <w:pPr>
+        <w:spacing w:line="240" w:lineRule="auto" w:after="40"/>
+        <w:jc w:val="left"/>
+      </w:pPr>
+      <w:r>
+        <w:rPr>
+          <w:rFonts w:ascii="Times New Roman" w:hAnsi="Times New Roman"/>
+          <w:sz w:val="24"/>
+        </w:rPr>
+        <w:t>9. Que condições, em equipamentos, conexão, suporte técnico e formação, a rede consegue oferecer às escolas, e o que fica a cargo de cada escola?</w:t>
+      </w:r>
+    </w:p>
+    <w:p>
+      <w:pPr>
+        <w:spacing w:line="240" w:lineRule="auto" w:after="40"/>
+        <w:jc w:val="left"/>
+      </w:pPr>
+      <w:r>
+        <w:rPr>
+          <w:rFonts w:ascii="Times New Roman" w:hAnsi="Times New Roman"/>
+          <w:sz w:val="24"/>
+        </w:rPr>
+        <w:t>10. Quais são, na sua avaliação, os principais desafios do município para garantir às crianças os direitos que a lei associa à educação digital?</w:t>
       </w:r>
     </w:p>
     <w:p>

</xml_diff>